<commit_message>
Make the plan document's Contents clickable
Static Contents entries are now internal bookmark links (built with
gfm-style heading identifiers so the same anchors work on GitHub).
No Word TOC field and no external links, so no warning prompt on open;
all 18 anchors verified against document bookmarks.
</commit_message>
<xml_diff>
--- a/docs/ICJIA-Hub-20-rewrite-copperhead.docx
+++ b/docs/ICJIA-Hub-20-rewrite-copperhead.docx
@@ -94,6 +94,16 @@
           <w:bCs/>
         </w:rPr>
         <w:t xml:space="preserve">Contents</w:t>
+      </w:r>
+      <w:r>
+        <w:t xml:space="preserve"> </w:t>
+      </w:r>
+      <w:r>
+        <w:rPr>
+          <w:i/>
+          <w:iCs/>
+        </w:rPr>
+        <w:t xml:space="preserve">(click an entry to jump to that section)</w:t>
       </w:r>
     </w:p>
     <w:p>
@@ -104,9 +114,14 @@
           <w:numId w:val="1001"/>
         </w:numPr>
       </w:pPr>
-      <w:r>
-        <w:t xml:space="preserve">Part I — For Decision-Makers</w:t>
-      </w:r>
+      <w:hyperlink w:anchor="part-i--for-decision-makers">
+        <w:r>
+          <w:rPr>
+            <w:rStyle w:val="Hyperlink"/>
+          </w:rPr>
+          <w:t xml:space="preserve">Part I — For Decision-Makers</w:t>
+        </w:r>
+      </w:hyperlink>
     </w:p>
     <w:p>
       <w:pPr>
@@ -116,18 +131,14 @@
           <w:numId w:val="1002"/>
         </w:numPr>
       </w:pPr>
-    </w:p>
-    <w:p>
-      <w:pPr>
-        <w:pStyle w:val="Compact"/>
-        <w:numPr>
-          <w:ilvl w:val="2"/>
-          <w:numId w:val="1003"/>
-        </w:numPr>
-      </w:pPr>
-      <w:r>
-        <w:t xml:space="preserve">TL;DR (the 60-second version)</w:t>
-      </w:r>
+      <w:hyperlink w:anchor="X3c5dfd78eac7c83f69ae6c6a6cef851b255cc88">
+        <w:r>
+          <w:rPr>
+            <w:rStyle w:val="Hyperlink"/>
+          </w:rPr>
+          <w:t xml:space="preserve">1. TL;DR (the 60-second version)</w:t>
+        </w:r>
+      </w:hyperlink>
     </w:p>
     <w:p>
       <w:pPr>
@@ -137,24 +148,26 @@
           <w:numId w:val="1002"/>
         </w:numPr>
       </w:pPr>
-    </w:p>
-    <w:p>
-      <w:pPr>
-        <w:pStyle w:val="Compact"/>
-        <w:numPr>
-          <w:ilvl w:val="2"/>
-          <w:numId w:val="1004"/>
-        </w:numPr>
-      </w:pPr>
-      <w:r>
-        <w:t xml:space="preserve">Why a codename? (</w:t>
-      </w:r>
-      <w:r>
-        <w:t xml:space="preserve">“Copperhead”</w:t>
-      </w:r>
-      <w:r>
-        <w:t xml:space="preserve">)</w:t>
-      </w:r>
+      <w:hyperlink w:anchor="X0c83e4ff255cf0792bb35617f4fe689b5935894">
+        <w:r>
+          <w:rPr>
+            <w:rStyle w:val="Hyperlink"/>
+          </w:rPr>
+          <w:t xml:space="preserve">2. Why a codename? (</w:t>
+        </w:r>
+        <w:r>
+          <w:rPr>
+            <w:rStyle w:val="Hyperlink"/>
+          </w:rPr>
+          <w:t xml:space="preserve">“Copperhead”</w:t>
+        </w:r>
+        <w:r>
+          <w:rPr>
+            <w:rStyle w:val="Hyperlink"/>
+          </w:rPr>
+          <w:t xml:space="preserve">)</w:t>
+        </w:r>
+      </w:hyperlink>
     </w:p>
     <w:p>
       <w:pPr>
@@ -164,18 +177,14 @@
           <w:numId w:val="1002"/>
         </w:numPr>
       </w:pPr>
-    </w:p>
-    <w:p>
-      <w:pPr>
-        <w:pStyle w:val="Compact"/>
-        <w:numPr>
-          <w:ilvl w:val="2"/>
-          <w:numId w:val="1005"/>
-        </w:numPr>
-      </w:pPr>
-      <w:r>
-        <w:t xml:space="preserve">The Research Hub today (Hub 1.0)</w:t>
-      </w:r>
+      <w:hyperlink w:anchor="X1ce37e2e01f5f9d87df450cb16da045b4700c76">
+        <w:r>
+          <w:rPr>
+            <w:rStyle w:val="Hyperlink"/>
+          </w:rPr>
+          <w:t xml:space="preserve">3. The Research Hub today (Hub 1.0)</w:t>
+        </w:r>
+      </w:hyperlink>
     </w:p>
     <w:p>
       <w:pPr>
@@ -185,18 +194,14 @@
           <w:numId w:val="1002"/>
         </w:numPr>
       </w:pPr>
-    </w:p>
-    <w:p>
-      <w:pPr>
-        <w:pStyle w:val="Compact"/>
-        <w:numPr>
-          <w:ilvl w:val="2"/>
-          <w:numId w:val="1006"/>
-        </w:numPr>
-      </w:pPr>
-      <w:r>
-        <w:t xml:space="preserve">What is already done (and de-risks this project)</w:t>
-      </w:r>
+      <w:hyperlink w:anchor="Xfb4eabddbe3f1d08b21a183f16495ef0ce2a521">
+        <w:r>
+          <w:rPr>
+            <w:rStyle w:val="Hyperlink"/>
+          </w:rPr>
+          <w:t xml:space="preserve">4. What is already done (and de-risks this project)</w:t>
+        </w:r>
+      </w:hyperlink>
     </w:p>
     <w:p>
       <w:pPr>
@@ -206,18 +211,14 @@
           <w:numId w:val="1002"/>
         </w:numPr>
       </w:pPr>
-    </w:p>
-    <w:p>
-      <w:pPr>
-        <w:pStyle w:val="Compact"/>
-        <w:numPr>
-          <w:ilvl w:val="2"/>
-          <w:numId w:val="1007"/>
-        </w:numPr>
-      </w:pPr>
-      <w:r>
-        <w:t xml:space="preserve">The unfinished rewrite: what it is, what it includes, what it doesn’t</w:t>
-      </w:r>
+      <w:hyperlink w:anchor="Xfbd16643e4b85070e07d15573167010e730de97">
+        <w:r>
+          <w:rPr>
+            <w:rStyle w:val="Hyperlink"/>
+          </w:rPr>
+          <w:t xml:space="preserve">5. The unfinished rewrite: what it is, what it includes, what it doesn’t</w:t>
+        </w:r>
+      </w:hyperlink>
     </w:p>
     <w:p>
       <w:pPr>
@@ -227,18 +228,14 @@
           <w:numId w:val="1002"/>
         </w:numPr>
       </w:pPr>
-    </w:p>
-    <w:p>
-      <w:pPr>
-        <w:pStyle w:val="Compact"/>
-        <w:numPr>
-          <w:ilvl w:val="2"/>
-          <w:numId w:val="1008"/>
-        </w:numPr>
-      </w:pPr>
-      <w:r>
-        <w:t xml:space="preserve">What we keep (the ~2%, plus lessons)</w:t>
-      </w:r>
+      <w:hyperlink w:anchor="Xb0f41b7d0b4b936e232757f1eba73f5d1f6bc77">
+        <w:r>
+          <w:rPr>
+            <w:rStyle w:val="Hyperlink"/>
+          </w:rPr>
+          <w:t xml:space="preserve">6. What we keep (the ~2%, plus lessons)</w:t>
+        </w:r>
+      </w:hyperlink>
     </w:p>
     <w:p>
       <w:pPr>
@@ -248,18 +245,14 @@
           <w:numId w:val="1002"/>
         </w:numPr>
       </w:pPr>
-    </w:p>
-    <w:p>
-      <w:pPr>
-        <w:pStyle w:val="Compact"/>
-        <w:numPr>
-          <w:ilvl w:val="2"/>
-          <w:numId w:val="1009"/>
-        </w:numPr>
-      </w:pPr>
-      <w:r>
-        <w:t xml:space="preserve">The plan at a glance (managers’ view)</w:t>
-      </w:r>
+      <w:hyperlink w:anchor="X4387035572670e7844f3e099942cf73a48bc328">
+        <w:r>
+          <w:rPr>
+            <w:rStyle w:val="Hyperlink"/>
+          </w:rPr>
+          <w:t xml:space="preserve">7. The plan at a glance (managers’ view)</w:t>
+        </w:r>
+      </w:hyperlink>
     </w:p>
     <w:p>
       <w:pPr>
@@ -269,84 +262,82 @@
           <w:numId w:val="1001"/>
         </w:numPr>
       </w:pPr>
-      <w:r>
-        <w:t xml:space="preserve">Part II — For Developers</w:t>
-      </w:r>
+      <w:hyperlink w:anchor="part-ii--for-developers">
+        <w:r>
+          <w:rPr>
+            <w:rStyle w:val="Hyperlink"/>
+          </w:rPr>
+          <w:t xml:space="preserve">Part II — For Developers</w:t>
+        </w:r>
+      </w:hyperlink>
     </w:p>
     <w:p>
       <w:pPr>
         <w:pStyle w:val="Compact"/>
         <w:numPr>
           <w:ilvl w:val="1"/>
-          <w:numId w:val="1010"/>
+          <w:numId w:val="1003"/>
         </w:numPr>
       </w:pPr>
-    </w:p>
-    <w:p>
-      <w:pPr>
-        <w:pStyle w:val="Compact"/>
-        <w:numPr>
-          <w:ilvl w:val="2"/>
-          <w:numId w:val="1011"/>
-        </w:numPr>
-      </w:pPr>
-      <w:r>
-        <w:t xml:space="preserve">Target architecture</w:t>
-      </w:r>
+      <w:hyperlink w:anchor="X4b376c53ac9bb35d3714f3533f5dac60661a280">
+        <w:r>
+          <w:rPr>
+            <w:rStyle w:val="Hyperlink"/>
+          </w:rPr>
+          <w:t xml:space="preserve">8. Target architecture</w:t>
+        </w:r>
+      </w:hyperlink>
     </w:p>
     <w:p>
       <w:pPr>
         <w:pStyle w:val="Compact"/>
         <w:numPr>
           <w:ilvl w:val="1"/>
-          <w:numId w:val="1010"/>
+          <w:numId w:val="1003"/>
         </w:numPr>
       </w:pPr>
-    </w:p>
-    <w:p>
-      <w:pPr>
-        <w:pStyle w:val="Compact"/>
-        <w:numPr>
-          <w:ilvl w:val="2"/>
-          <w:numId w:val="1012"/>
-        </w:numPr>
-      </w:pPr>
-      <w:r>
-        <w:t xml:space="preserve">Roadmap</w:t>
-      </w:r>
+      <w:hyperlink w:anchor="X065bc66d7a523af6e74bfea16eff29096c841b1">
+        <w:r>
+          <w:rPr>
+            <w:rStyle w:val="Hyperlink"/>
+          </w:rPr>
+          <w:t xml:space="preserve">9. Roadmap</w:t>
+        </w:r>
+      </w:hyperlink>
     </w:p>
     <w:p>
       <w:pPr>
         <w:pStyle w:val="Compact"/>
         <w:numPr>
           <w:ilvl w:val="1"/>
-          <w:numId w:val="1010"/>
+          <w:numId w:val="1003"/>
         </w:numPr>
       </w:pPr>
-    </w:p>
-    <w:p>
-      <w:pPr>
-        <w:pStyle w:val="Compact"/>
-        <w:numPr>
-          <w:ilvl w:val="2"/>
-          <w:numId w:val="1013"/>
-        </w:numPr>
-      </w:pPr>
-      <w:r>
-        <w:t xml:space="preserve">Risks and mitigations</w:t>
-      </w:r>
+      <w:hyperlink w:anchor="Xd23567b368629d7d6e369ba0946f4da9ea6a469">
+        <w:r>
+          <w:rPr>
+            <w:rStyle w:val="Hyperlink"/>
+          </w:rPr>
+          <w:t xml:space="preserve">10. Risks and mitigations</w:t>
+        </w:r>
+      </w:hyperlink>
     </w:p>
     <w:p>
       <w:pPr>
         <w:pStyle w:val="Compact"/>
         <w:numPr>
           <w:ilvl w:val="1"/>
-          <w:numId w:val="1010"/>
+          <w:numId w:val="1003"/>
         </w:numPr>
       </w:pPr>
-      <w:r>
-        <w:t xml:space="preserve">Success criteria (definition of done)</w:t>
-      </w:r>
+      <w:hyperlink w:anchor="success-criteria-definition-of-done">
+        <w:r>
+          <w:rPr>
+            <w:rStyle w:val="Hyperlink"/>
+          </w:rPr>
+          <w:t xml:space="preserve">Success criteria (definition of done)</w:t>
+        </w:r>
+      </w:hyperlink>
     </w:p>
     <w:p>
       <w:pPr>
@@ -356,9 +347,14 @@
           <w:numId w:val="1001"/>
         </w:numPr>
       </w:pPr>
-      <w:r>
-        <w:t xml:space="preserve">Appendix A — Defect inventory of the unfinished rewrite</w:t>
-      </w:r>
+      <w:hyperlink w:anchor="X33da7a9887db7dca18403af2801a6c421349e58">
+        <w:r>
+          <w:rPr>
+            <w:rStyle w:val="Hyperlink"/>
+          </w:rPr>
+          <w:t xml:space="preserve">Appendix A — Defect inventory of the unfinished rewrite</w:t>
+        </w:r>
+      </w:hyperlink>
     </w:p>
     <w:p>
       <w:pPr>
@@ -368,9 +364,14 @@
           <w:numId w:val="1001"/>
         </w:numPr>
       </w:pPr>
-      <w:r>
-        <w:t xml:space="preserve">Appendix B — Hub 1.0 URL &amp; feature contract</w:t>
-      </w:r>
+      <w:hyperlink w:anchor="appendix-b--hub-10-url--feature-contract">
+        <w:r>
+          <w:rPr>
+            <w:rStyle w:val="Hyperlink"/>
+          </w:rPr>
+          <w:t xml:space="preserve">Appendix B — Hub 1.0 URL &amp; feature contract</w:t>
+        </w:r>
+      </w:hyperlink>
     </w:p>
     <w:p>
       <w:pPr>
@@ -380,9 +381,14 @@
           <w:numId w:val="1001"/>
         </w:numPr>
       </w:pPr>
-      <w:r>
-        <w:t xml:space="preserve">Appendix C — Reuse checklist</w:t>
-      </w:r>
+      <w:hyperlink w:anchor="appendix-c--reuse-checklist">
+        <w:r>
+          <w:rPr>
+            <w:rStyle w:val="Hyperlink"/>
+          </w:rPr>
+          <w:t xml:space="preserve">Appendix C — Reuse checklist</w:t>
+        </w:r>
+      </w:hyperlink>
     </w:p>
     <w:p>
       <w:pPr>
@@ -392,9 +398,14 @@
           <w:numId w:val="1001"/>
         </w:numPr>
       </w:pPr>
-      <w:r>
-        <w:t xml:space="preserve">Appendix D — Glossary (for non-technical readers)</w:t>
-      </w:r>
+      <w:hyperlink w:anchor="X8e127df9c12176fb20b75c96653728f7de60746">
+        <w:r>
+          <w:rPr>
+            <w:rStyle w:val="Hyperlink"/>
+          </w:rPr>
+          <w:t xml:space="preserve">Appendix D — Glossary (for non-technical readers)</w:t>
+        </w:r>
+      </w:hyperlink>
     </w:p>
     <w:p>
       <w:pPr>
@@ -404,9 +415,14 @@
           <w:numId w:val="1001"/>
         </w:numPr>
       </w:pPr>
-      <w:r>
-        <w:t xml:space="preserve">Appendix E — Referenced resources (plain-text addresses)</w:t>
-      </w:r>
+      <w:hyperlink w:anchor="Xb84e9dc3efedb0c31378e15b857311068c3cded">
+        <w:r>
+          <w:rPr>
+            <w:rStyle w:val="Hyperlink"/>
+          </w:rPr>
+          <w:t xml:space="preserve">Appendix E — Referenced resources (plain-text addresses)</w:t>
+        </w:r>
+      </w:hyperlink>
     </w:p>
     <w:p>
       <w:r>
@@ -415,7 +431,7 @@
         </w:pict>
       </w:r>
     </w:p>
-    <w:bookmarkStart w:id="16" w:name="part-i-for-decision-makers"/>
+    <w:bookmarkStart w:id="16" w:name="part-i--for-decision-makers"/>
     <w:p>
       <w:pPr>
         <w:pStyle w:val="Heading1"/>
@@ -424,7 +440,7 @@
         <w:t xml:space="preserve">Part I — For Decision-Makers</w:t>
       </w:r>
     </w:p>
-    <w:bookmarkStart w:id="9" w:name="tldr-the-60-second-version"/>
+    <w:bookmarkStart w:id="9" w:name="X3c5dfd78eac7c83f69ae6c6a6cef851b255cc88"/>
     <w:p>
       <w:pPr>
         <w:pStyle w:val="Heading2"/>
@@ -586,7 +602,7 @@
         <w:pStyle w:val="Compact"/>
         <w:numPr>
           <w:ilvl w:val="0"/>
-          <w:numId w:val="1014"/>
+          <w:numId w:val="1004"/>
         </w:numPr>
       </w:pPr>
       <w:r>
@@ -598,7 +614,7 @@
         <w:pStyle w:val="Compact"/>
         <w:numPr>
           <w:ilvl w:val="0"/>
-          <w:numId w:val="1014"/>
+          <w:numId w:val="1004"/>
         </w:numPr>
       </w:pPr>
       <w:r>
@@ -610,7 +626,7 @@
         <w:pStyle w:val="Compact"/>
         <w:numPr>
           <w:ilvl w:val="0"/>
-          <w:numId w:val="1014"/>
+          <w:numId w:val="1004"/>
         </w:numPr>
       </w:pPr>
       <w:r>
@@ -638,7 +654,7 @@
         <w:pStyle w:val="Compact"/>
         <w:numPr>
           <w:ilvl w:val="0"/>
-          <w:numId w:val="1014"/>
+          <w:numId w:val="1004"/>
         </w:numPr>
       </w:pPr>
       <w:r>
@@ -650,7 +666,7 @@
         <w:pStyle w:val="Compact"/>
         <w:numPr>
           <w:ilvl w:val="0"/>
-          <w:numId w:val="1014"/>
+          <w:numId w:val="1004"/>
         </w:numPr>
       </w:pPr>
       <w:r>
@@ -658,7 +674,7 @@
       </w:r>
     </w:p>
     <w:bookmarkEnd w:id="9"/>
-    <w:bookmarkStart w:id="10" w:name="why-a-codename-copperhead"/>
+    <w:bookmarkStart w:id="10" w:name="X0c83e4ff255cf0792bb35617f4fe689b5935894"/>
     <w:p>
       <w:pPr>
         <w:pStyle w:val="Heading2"/>
@@ -686,7 +702,7 @@
         <w:pStyle w:val="Compact"/>
         <w:numPr>
           <w:ilvl w:val="0"/>
-          <w:numId w:val="1015"/>
+          <w:numId w:val="1005"/>
         </w:numPr>
       </w:pPr>
       <w:r>
@@ -772,7 +788,7 @@
         <w:pStyle w:val="Compact"/>
         <w:numPr>
           <w:ilvl w:val="0"/>
-          <w:numId w:val="1015"/>
+          <w:numId w:val="1005"/>
         </w:numPr>
       </w:pPr>
       <w:r>
@@ -810,7 +826,7 @@
         <w:pStyle w:val="Compact"/>
         <w:numPr>
           <w:ilvl w:val="0"/>
-          <w:numId w:val="1015"/>
+          <w:numId w:val="1005"/>
         </w:numPr>
       </w:pPr>
       <w:r>
@@ -832,7 +848,7 @@
         <w:pStyle w:val="Compact"/>
         <w:numPr>
           <w:ilvl w:val="0"/>
-          <w:numId w:val="1015"/>
+          <w:numId w:val="1005"/>
         </w:numPr>
       </w:pPr>
       <w:r>
@@ -958,7 +974,7 @@
       </w:r>
     </w:p>
     <w:bookmarkEnd w:id="10"/>
-    <w:bookmarkStart w:id="11" w:name="the-research-hub-today-hub-1.0"/>
+    <w:bookmarkStart w:id="11" w:name="X1ce37e2e01f5f9d87df450cb16da045b4700c76"/>
     <w:p>
       <w:pPr>
         <w:pStyle w:val="Heading2"/>
@@ -1440,7 +1456,7 @@
         <w:pStyle w:val="Compact"/>
         <w:numPr>
           <w:ilvl w:val="0"/>
-          <w:numId w:val="1016"/>
+          <w:numId w:val="1006"/>
         </w:numPr>
       </w:pPr>
       <w:r>
@@ -1462,7 +1478,7 @@
         <w:pStyle w:val="Compact"/>
         <w:numPr>
           <w:ilvl w:val="0"/>
-          <w:numId w:val="1016"/>
+          <w:numId w:val="1006"/>
         </w:numPr>
       </w:pPr>
       <w:r>
@@ -1496,7 +1512,7 @@
         <w:pStyle w:val="Compact"/>
         <w:numPr>
           <w:ilvl w:val="0"/>
-          <w:numId w:val="1016"/>
+          <w:numId w:val="1006"/>
         </w:numPr>
       </w:pPr>
       <w:r>
@@ -1530,7 +1546,7 @@
         <w:pStyle w:val="Compact"/>
         <w:numPr>
           <w:ilvl w:val="0"/>
-          <w:numId w:val="1016"/>
+          <w:numId w:val="1006"/>
         </w:numPr>
       </w:pPr>
       <w:r>
@@ -1564,7 +1580,7 @@
         <w:pStyle w:val="Compact"/>
         <w:numPr>
           <w:ilvl w:val="0"/>
-          <w:numId w:val="1017"/>
+          <w:numId w:val="1007"/>
         </w:numPr>
       </w:pPr>
       <w:r>
@@ -1602,7 +1618,7 @@
         <w:pStyle w:val="Compact"/>
         <w:numPr>
           <w:ilvl w:val="0"/>
-          <w:numId w:val="1017"/>
+          <w:numId w:val="1007"/>
         </w:numPr>
       </w:pPr>
       <w:r>
@@ -1624,7 +1640,7 @@
         <w:pStyle w:val="Compact"/>
         <w:numPr>
           <w:ilvl w:val="0"/>
-          <w:numId w:val="1017"/>
+          <w:numId w:val="1007"/>
         </w:numPr>
       </w:pPr>
       <w:r>
@@ -1662,7 +1678,7 @@
         <w:pStyle w:val="Compact"/>
         <w:numPr>
           <w:ilvl w:val="0"/>
-          <w:numId w:val="1017"/>
+          <w:numId w:val="1007"/>
         </w:numPr>
       </w:pPr>
       <w:r>
@@ -1680,7 +1696,7 @@
       </w:r>
     </w:p>
     <w:bookmarkEnd w:id="11"/>
-    <w:bookmarkStart w:id="12" w:name="Xcf4b021fc9a052612014447689334d47f2f5da7"/>
+    <w:bookmarkStart w:id="12" w:name="Xfb4eabddbe3f1d08b21a183f16495ef0ce2a521"/>
     <w:p>
       <w:pPr>
         <w:pStyle w:val="Heading2"/>
@@ -1982,7 +1998,7 @@
       </w:r>
     </w:p>
     <w:bookmarkEnd w:id="12"/>
-    <w:bookmarkStart w:id="13" w:name="Xd2656f85e7aa5b5cedb09c6f7ba7545d7999af1"/>
+    <w:bookmarkStart w:id="13" w:name="Xfbd16643e4b85070e07d15573167010e730de97"/>
     <w:p>
       <w:pPr>
         <w:pStyle w:val="Heading2"/>
@@ -2038,7 +2054,7 @@
         <w:pStyle w:val="Compact"/>
         <w:numPr>
           <w:ilvl w:val="0"/>
-          <w:numId w:val="1018"/>
+          <w:numId w:val="1008"/>
         </w:numPr>
       </w:pPr>
       <w:r>
@@ -2050,7 +2066,7 @@
         <w:pStyle w:val="Compact"/>
         <w:numPr>
           <w:ilvl w:val="0"/>
-          <w:numId w:val="1018"/>
+          <w:numId w:val="1008"/>
         </w:numPr>
       </w:pPr>
       <w:r>
@@ -2078,7 +2094,7 @@
         <w:pStyle w:val="Compact"/>
         <w:numPr>
           <w:ilvl w:val="0"/>
-          <w:numId w:val="1018"/>
+          <w:numId w:val="1008"/>
         </w:numPr>
       </w:pPr>
       <w:r>
@@ -2090,7 +2106,7 @@
         <w:pStyle w:val="Compact"/>
         <w:numPr>
           <w:ilvl w:val="0"/>
-          <w:numId w:val="1018"/>
+          <w:numId w:val="1008"/>
         </w:numPr>
       </w:pPr>
       <w:r>
@@ -2144,7 +2160,7 @@
         <w:pStyle w:val="Compact"/>
         <w:numPr>
           <w:ilvl w:val="0"/>
-          <w:numId w:val="1019"/>
+          <w:numId w:val="1009"/>
         </w:numPr>
       </w:pPr>
       <w:r>
@@ -2227,7 +2243,7 @@
         <w:pStyle w:val="Compact"/>
         <w:numPr>
           <w:ilvl w:val="0"/>
-          <w:numId w:val="1019"/>
+          <w:numId w:val="1009"/>
         </w:numPr>
       </w:pPr>
       <w:r>
@@ -2264,7 +2280,7 @@
         <w:pStyle w:val="Compact"/>
         <w:numPr>
           <w:ilvl w:val="0"/>
-          <w:numId w:val="1019"/>
+          <w:numId w:val="1009"/>
         </w:numPr>
       </w:pPr>
       <w:r>
@@ -2314,7 +2330,7 @@
         <w:pStyle w:val="Compact"/>
         <w:numPr>
           <w:ilvl w:val="0"/>
-          <w:numId w:val="1019"/>
+          <w:numId w:val="1009"/>
         </w:numPr>
       </w:pPr>
       <w:r>
@@ -2352,7 +2368,7 @@
         <w:pStyle w:val="Compact"/>
         <w:numPr>
           <w:ilvl w:val="0"/>
-          <w:numId w:val="1019"/>
+          <w:numId w:val="1009"/>
         </w:numPr>
       </w:pPr>
       <w:r>
@@ -2374,7 +2390,7 @@
         <w:pStyle w:val="Compact"/>
         <w:numPr>
           <w:ilvl w:val="0"/>
-          <w:numId w:val="1019"/>
+          <w:numId w:val="1009"/>
         </w:numPr>
       </w:pPr>
       <w:r>
@@ -2386,7 +2402,7 @@
         <w:pStyle w:val="Compact"/>
         <w:numPr>
           <w:ilvl w:val="0"/>
-          <w:numId w:val="1019"/>
+          <w:numId w:val="1009"/>
         </w:numPr>
       </w:pPr>
       <w:r>
@@ -2420,7 +2436,7 @@
         <w:pStyle w:val="Compact"/>
         <w:numPr>
           <w:ilvl w:val="0"/>
-          <w:numId w:val="1019"/>
+          <w:numId w:val="1009"/>
         </w:numPr>
       </w:pPr>
       <w:r>
@@ -2450,7 +2466,7 @@
         <w:pStyle w:val="Compact"/>
         <w:numPr>
           <w:ilvl w:val="0"/>
-          <w:numId w:val="1020"/>
+          <w:numId w:val="1010"/>
         </w:numPr>
       </w:pPr>
       <w:r>
@@ -2505,7 +2521,7 @@
         <w:pStyle w:val="Compact"/>
         <w:numPr>
           <w:ilvl w:val="0"/>
-          <w:numId w:val="1020"/>
+          <w:numId w:val="1010"/>
         </w:numPr>
       </w:pPr>
       <w:r>
@@ -2542,7 +2558,7 @@
         <w:pStyle w:val="Compact"/>
         <w:numPr>
           <w:ilvl w:val="0"/>
-          <w:numId w:val="1020"/>
+          <w:numId w:val="1010"/>
         </w:numPr>
       </w:pPr>
       <w:r>
@@ -2563,7 +2579,7 @@
         <w:pStyle w:val="Compact"/>
         <w:numPr>
           <w:ilvl w:val="0"/>
-          <w:numId w:val="1020"/>
+          <w:numId w:val="1010"/>
         </w:numPr>
       </w:pPr>
       <w:r>
@@ -2665,7 +2681,7 @@
       </w:r>
     </w:p>
     <w:bookmarkEnd w:id="13"/>
-    <w:bookmarkStart w:id="14" w:name="what-we-keep-the-2-plus-lessons"/>
+    <w:bookmarkStart w:id="14" w:name="Xb0f41b7d0b4b936e232757f1eba73f5d1f6bc77"/>
     <w:p>
       <w:pPr>
         <w:pStyle w:val="Heading2"/>
@@ -2709,7 +2725,7 @@
         <w:pStyle w:val="Compact"/>
         <w:numPr>
           <w:ilvl w:val="0"/>
-          <w:numId w:val="1021"/>
+          <w:numId w:val="1011"/>
         </w:numPr>
       </w:pPr>
       <w:r>
@@ -2769,7 +2785,7 @@
         <w:pStyle w:val="Compact"/>
         <w:numPr>
           <w:ilvl w:val="0"/>
-          <w:numId w:val="1021"/>
+          <w:numId w:val="1011"/>
         </w:numPr>
       </w:pPr>
       <w:r>
@@ -2805,7 +2821,7 @@
         <w:pStyle w:val="Compact"/>
         <w:numPr>
           <w:ilvl w:val="0"/>
-          <w:numId w:val="1021"/>
+          <w:numId w:val="1011"/>
         </w:numPr>
       </w:pPr>
       <w:r>
@@ -2817,7 +2833,7 @@
         <w:pStyle w:val="Compact"/>
         <w:numPr>
           <w:ilvl w:val="0"/>
-          <w:numId w:val="1021"/>
+          <w:numId w:val="1011"/>
         </w:numPr>
       </w:pPr>
       <w:r>
@@ -2829,7 +2845,7 @@
         <w:pStyle w:val="Compact"/>
         <w:numPr>
           <w:ilvl w:val="0"/>
-          <w:numId w:val="1021"/>
+          <w:numId w:val="1011"/>
         </w:numPr>
       </w:pPr>
       <w:r>
@@ -2984,7 +3000,7 @@
       </w:r>
     </w:p>
     <w:bookmarkEnd w:id="14"/>
-    <w:bookmarkStart w:id="15" w:name="the-plan-at-a-glance-managers-view"/>
+    <w:bookmarkStart w:id="15" w:name="X4387035572670e7844f3e099942cf73a48bc328"/>
     <w:p>
       <w:pPr>
         <w:pStyle w:val="Heading2"/>
@@ -3035,7 +3051,7 @@
         <w:pStyle w:val="Compact"/>
         <w:numPr>
           <w:ilvl w:val="0"/>
-          <w:numId w:val="1022"/>
+          <w:numId w:val="1012"/>
         </w:numPr>
       </w:pPr>
       <w:r>
@@ -3097,7 +3113,7 @@
         <w:pStyle w:val="Compact"/>
         <w:numPr>
           <w:ilvl w:val="0"/>
-          <w:numId w:val="1022"/>
+          <w:numId w:val="1012"/>
         </w:numPr>
       </w:pPr>
       <w:r>
@@ -3119,7 +3135,7 @@
         <w:pStyle w:val="Compact"/>
         <w:numPr>
           <w:ilvl w:val="0"/>
-          <w:numId w:val="1022"/>
+          <w:numId w:val="1012"/>
         </w:numPr>
       </w:pPr>
       <w:r>
@@ -3141,7 +3157,7 @@
         <w:pStyle w:val="Compact"/>
         <w:numPr>
           <w:ilvl w:val="0"/>
-          <w:numId w:val="1022"/>
+          <w:numId w:val="1012"/>
         </w:numPr>
       </w:pPr>
       <w:r>
@@ -3167,7 +3183,7 @@
     </w:p>
     <w:bookmarkEnd w:id="15"/>
     <w:bookmarkEnd w:id="16"/>
-    <w:bookmarkStart w:id="21" w:name="part-ii-for-developers"/>
+    <w:bookmarkStart w:id="21" w:name="part-ii--for-developers"/>
     <w:p>
       <w:pPr>
         <w:pStyle w:val="Heading1"/>
@@ -3176,7 +3192,7 @@
         <w:t xml:space="preserve">Part II — For Developers</w:t>
       </w:r>
     </w:p>
-    <w:bookmarkStart w:id="17" w:name="target-architecture"/>
+    <w:bookmarkStart w:id="17" w:name="X4b376c53ac9bb35d3714f3533f5dac60661a280"/>
     <w:p>
       <w:pPr>
         <w:pStyle w:val="Heading2"/>
@@ -3841,7 +3857,7 @@
       </w:r>
     </w:p>
     <w:bookmarkEnd w:id="17"/>
-    <w:bookmarkStart w:id="18" w:name="roadmap"/>
+    <w:bookmarkStart w:id="18" w:name="X065bc66d7a523af6e74bfea16eff29096c841b1"/>
     <w:p>
       <w:pPr>
         <w:pStyle w:val="Heading2"/>
@@ -4409,7 +4425,7 @@
       </w:r>
     </w:p>
     <w:bookmarkEnd w:id="18"/>
-    <w:bookmarkStart w:id="19" w:name="risks-and-mitigations"/>
+    <w:bookmarkStart w:id="19" w:name="Xd23567b368629d7d6e369ba0946f4da9ea6a469"/>
     <w:p>
       <w:pPr>
         <w:pStyle w:val="Heading2"/>
@@ -4755,7 +4771,7 @@
         <w:pStyle w:val="Compact"/>
         <w:numPr>
           <w:ilvl w:val="0"/>
-          <w:numId w:val="1023"/>
+          <w:numId w:val="1013"/>
         </w:numPr>
       </w:pPr>
       <w:r>
@@ -4777,7 +4793,7 @@
         <w:pStyle w:val="Compact"/>
         <w:numPr>
           <w:ilvl w:val="0"/>
-          <w:numId w:val="1023"/>
+          <w:numId w:val="1013"/>
         </w:numPr>
       </w:pPr>
       <w:r>
@@ -4799,7 +4815,7 @@
         <w:pStyle w:val="Compact"/>
         <w:numPr>
           <w:ilvl w:val="0"/>
-          <w:numId w:val="1023"/>
+          <w:numId w:val="1013"/>
         </w:numPr>
       </w:pPr>
       <w:r>
@@ -4821,7 +4837,7 @@
         <w:pStyle w:val="Compact"/>
         <w:numPr>
           <w:ilvl w:val="0"/>
-          <w:numId w:val="1023"/>
+          <w:numId w:val="1013"/>
         </w:numPr>
       </w:pPr>
       <w:r>
@@ -4843,7 +4859,7 @@
         <w:pStyle w:val="Compact"/>
         <w:numPr>
           <w:ilvl w:val="0"/>
-          <w:numId w:val="1023"/>
+          <w:numId w:val="1013"/>
         </w:numPr>
       </w:pPr>
       <w:r>
@@ -4893,7 +4909,7 @@
         <w:pStyle w:val="Compact"/>
         <w:numPr>
           <w:ilvl w:val="0"/>
-          <w:numId w:val="1023"/>
+          <w:numId w:val="1013"/>
         </w:numPr>
       </w:pPr>
       <w:r>
@@ -4915,7 +4931,7 @@
         <w:pStyle w:val="Compact"/>
         <w:numPr>
           <w:ilvl w:val="0"/>
-          <w:numId w:val="1023"/>
+          <w:numId w:val="1013"/>
         </w:numPr>
       </w:pPr>
       <w:r>
@@ -4937,7 +4953,7 @@
         <w:pStyle w:val="Compact"/>
         <w:numPr>
           <w:ilvl w:val="0"/>
-          <w:numId w:val="1023"/>
+          <w:numId w:val="1013"/>
         </w:numPr>
       </w:pPr>
       <w:r>
@@ -4963,7 +4979,7 @@
     </w:p>
     <w:bookmarkEnd w:id="20"/>
     <w:bookmarkEnd w:id="21"/>
-    <w:bookmarkStart w:id="27" w:name="X0a7e76681aae60db9cf65d036e5ffc1b73de931"/>
+    <w:bookmarkStart w:id="27" w:name="X33da7a9887db7dca18403af2801a6c421349e58"/>
     <w:p>
       <w:pPr>
         <w:pStyle w:val="Heading1"/>
@@ -5021,7 +5037,7 @@
         <w:t xml:space="preserve">(of ~55 catalogued) follow, grouped by theme. File references are to repository paths.</w:t>
       </w:r>
     </w:p>
-    <w:bookmarkStart w:id="22" w:name="a.1-security-major"/>
+    <w:bookmarkStart w:id="22" w:name="a1-security--major"/>
     <w:p>
       <w:pPr>
         <w:pStyle w:val="Heading2"/>
@@ -5955,7 +5971,7 @@
       </w:tr>
     </w:tbl>
     <w:bookmarkEnd w:id="22"/>
-    <w:bookmarkStart w:id="23" w:name="a.2-architecture-major"/>
+    <w:bookmarkStart w:id="23" w:name="a2-architecture--major"/>
     <w:p>
       <w:pPr>
         <w:pStyle w:val="Heading2"/>
@@ -6837,7 +6853,7 @@
       </w:tr>
     </w:tbl>
     <w:bookmarkEnd w:id="23"/>
-    <w:bookmarkStart w:id="24" w:name="a.3-correctness-parity-major"/>
+    <w:bookmarkStart w:id="24" w:name="a3-correctness--parity--major"/>
     <w:p>
       <w:pPr>
         <w:pStyle w:val="Heading2"/>
@@ -7526,7 +7542,7 @@
       </w:tr>
     </w:tbl>
     <w:bookmarkEnd w:id="24"/>
-    <w:bookmarkStart w:id="25" w:name="a.4-quality-accessibility-process-major"/>
+    <w:bookmarkStart w:id="25" w:name="a4-quality-accessibility-process--major"/>
     <w:p>
       <w:pPr>
         <w:pStyle w:val="Heading2"/>
@@ -8112,7 +8128,7 @@
       </w:tr>
     </w:tbl>
     <w:bookmarkEnd w:id="25"/>
-    <w:bookmarkStart w:id="26" w:name="a.5-minor-defects-curated-30"/>
+    <w:bookmarkStart w:id="26" w:name="a5-minor-defects-curated-30"/>
     <w:p>
       <w:pPr>
         <w:pStyle w:val="Heading2"/>
@@ -8126,7 +8142,7 @@
         <w:pStyle w:val="Compact"/>
         <w:numPr>
           <w:ilvl w:val="0"/>
-          <w:numId w:val="1024"/>
+          <w:numId w:val="1014"/>
         </w:numPr>
       </w:pPr>
       <w:r>
@@ -8162,7 +8178,7 @@
         <w:pStyle w:val="Compact"/>
         <w:numPr>
           <w:ilvl w:val="0"/>
-          <w:numId w:val="1024"/>
+          <w:numId w:val="1014"/>
         </w:numPr>
       </w:pPr>
       <w:r>
@@ -8204,7 +8220,7 @@
         <w:pStyle w:val="Compact"/>
         <w:numPr>
           <w:ilvl w:val="0"/>
-          <w:numId w:val="1024"/>
+          <w:numId w:val="1014"/>
         </w:numPr>
       </w:pPr>
       <w:r>
@@ -8246,7 +8262,7 @@
         <w:pStyle w:val="Compact"/>
         <w:numPr>
           <w:ilvl w:val="0"/>
-          <w:numId w:val="1024"/>
+          <w:numId w:val="1014"/>
         </w:numPr>
       </w:pPr>
       <w:r>
@@ -8258,7 +8274,7 @@
         <w:pStyle w:val="Compact"/>
         <w:numPr>
           <w:ilvl w:val="0"/>
-          <w:numId w:val="1024"/>
+          <w:numId w:val="1014"/>
         </w:numPr>
       </w:pPr>
       <w:r>
@@ -8270,7 +8286,7 @@
         <w:pStyle w:val="Compact"/>
         <w:numPr>
           <w:ilvl w:val="0"/>
-          <w:numId w:val="1024"/>
+          <w:numId w:val="1014"/>
         </w:numPr>
       </w:pPr>
       <w:r>
@@ -8333,7 +8349,7 @@
         <w:pStyle w:val="Compact"/>
         <w:numPr>
           <w:ilvl w:val="0"/>
-          <w:numId w:val="1024"/>
+          <w:numId w:val="1014"/>
         </w:numPr>
       </w:pPr>
       <w:r>
@@ -8378,7 +8394,7 @@
         <w:pStyle w:val="Compact"/>
         <w:numPr>
           <w:ilvl w:val="0"/>
-          <w:numId w:val="1024"/>
+          <w:numId w:val="1014"/>
         </w:numPr>
       </w:pPr>
       <w:r>
@@ -8390,7 +8406,7 @@
         <w:pStyle w:val="Compact"/>
         <w:numPr>
           <w:ilvl w:val="0"/>
-          <w:numId w:val="1024"/>
+          <w:numId w:val="1014"/>
         </w:numPr>
       </w:pPr>
       <w:r>
@@ -8432,7 +8448,7 @@
         <w:pStyle w:val="Compact"/>
         <w:numPr>
           <w:ilvl w:val="0"/>
-          <w:numId w:val="1024"/>
+          <w:numId w:val="1014"/>
         </w:numPr>
       </w:pPr>
       <w:r>
@@ -8471,7 +8487,7 @@
         <w:pStyle w:val="Compact"/>
         <w:numPr>
           <w:ilvl w:val="0"/>
-          <w:numId w:val="1024"/>
+          <w:numId w:val="1014"/>
         </w:numPr>
       </w:pPr>
       <w:r>
@@ -8483,7 +8499,7 @@
         <w:pStyle w:val="Compact"/>
         <w:numPr>
           <w:ilvl w:val="0"/>
-          <w:numId w:val="1024"/>
+          <w:numId w:val="1014"/>
         </w:numPr>
       </w:pPr>
       <w:r>
@@ -8501,7 +8517,7 @@
         <w:pStyle w:val="Compact"/>
         <w:numPr>
           <w:ilvl w:val="0"/>
-          <w:numId w:val="1024"/>
+          <w:numId w:val="1014"/>
         </w:numPr>
       </w:pPr>
       <w:r>
@@ -8513,7 +8529,7 @@
         <w:pStyle w:val="Compact"/>
         <w:numPr>
           <w:ilvl w:val="0"/>
-          <w:numId w:val="1024"/>
+          <w:numId w:val="1014"/>
         </w:numPr>
       </w:pPr>
       <w:r>
@@ -8543,7 +8559,7 @@
         <w:pStyle w:val="Compact"/>
         <w:numPr>
           <w:ilvl w:val="0"/>
-          <w:numId w:val="1024"/>
+          <w:numId w:val="1014"/>
         </w:numPr>
       </w:pPr>
       <w:r>
@@ -8570,7 +8586,7 @@
         <w:pStyle w:val="Compact"/>
         <w:numPr>
           <w:ilvl w:val="0"/>
-          <w:numId w:val="1024"/>
+          <w:numId w:val="1014"/>
         </w:numPr>
       </w:pPr>
       <w:r>
@@ -8582,7 +8598,7 @@
         <w:pStyle w:val="Compact"/>
         <w:numPr>
           <w:ilvl w:val="0"/>
-          <w:numId w:val="1024"/>
+          <w:numId w:val="1014"/>
         </w:numPr>
       </w:pPr>
       <w:r>
@@ -8606,7 +8622,7 @@
         <w:pStyle w:val="Compact"/>
         <w:numPr>
           <w:ilvl w:val="0"/>
-          <w:numId w:val="1024"/>
+          <w:numId w:val="1014"/>
         </w:numPr>
       </w:pPr>
       <w:r>
@@ -8627,7 +8643,7 @@
         <w:pStyle w:val="Compact"/>
         <w:numPr>
           <w:ilvl w:val="0"/>
-          <w:numId w:val="1024"/>
+          <w:numId w:val="1014"/>
         </w:numPr>
       </w:pPr>
       <w:r>
@@ -8639,7 +8655,7 @@
         <w:pStyle w:val="Compact"/>
         <w:numPr>
           <w:ilvl w:val="0"/>
-          <w:numId w:val="1024"/>
+          <w:numId w:val="1014"/>
         </w:numPr>
       </w:pPr>
       <w:r>
@@ -8675,7 +8691,7 @@
         <w:pStyle w:val="Compact"/>
         <w:numPr>
           <w:ilvl w:val="0"/>
-          <w:numId w:val="1024"/>
+          <w:numId w:val="1014"/>
         </w:numPr>
       </w:pPr>
       <w:r>
@@ -8708,7 +8724,7 @@
         <w:pStyle w:val="Compact"/>
         <w:numPr>
           <w:ilvl w:val="0"/>
-          <w:numId w:val="1024"/>
+          <w:numId w:val="1014"/>
         </w:numPr>
       </w:pPr>
       <w:r>
@@ -8747,7 +8763,7 @@
         <w:pStyle w:val="Compact"/>
         <w:numPr>
           <w:ilvl w:val="0"/>
-          <w:numId w:val="1024"/>
+          <w:numId w:val="1014"/>
         </w:numPr>
       </w:pPr>
       <w:r>
@@ -8768,7 +8784,7 @@
         <w:pStyle w:val="Compact"/>
         <w:numPr>
           <w:ilvl w:val="0"/>
-          <w:numId w:val="1024"/>
+          <w:numId w:val="1014"/>
         </w:numPr>
       </w:pPr>
       <w:r>
@@ -8804,7 +8820,7 @@
         <w:pStyle w:val="Compact"/>
         <w:numPr>
           <w:ilvl w:val="0"/>
-          <w:numId w:val="1024"/>
+          <w:numId w:val="1014"/>
         </w:numPr>
       </w:pPr>
       <w:r>
@@ -8843,7 +8859,7 @@
         <w:pStyle w:val="Compact"/>
         <w:numPr>
           <w:ilvl w:val="0"/>
-          <w:numId w:val="1024"/>
+          <w:numId w:val="1014"/>
         </w:numPr>
       </w:pPr>
       <w:r>
@@ -8879,7 +8895,7 @@
         <w:pStyle w:val="Compact"/>
         <w:numPr>
           <w:ilvl w:val="0"/>
-          <w:numId w:val="1024"/>
+          <w:numId w:val="1014"/>
         </w:numPr>
       </w:pPr>
       <w:r>
@@ -8900,7 +8916,7 @@
         <w:pStyle w:val="Compact"/>
         <w:numPr>
           <w:ilvl w:val="0"/>
-          <w:numId w:val="1024"/>
+          <w:numId w:val="1014"/>
         </w:numPr>
       </w:pPr>
       <w:r>
@@ -8972,7 +8988,7 @@
         <w:pStyle w:val="Compact"/>
         <w:numPr>
           <w:ilvl w:val="0"/>
-          <w:numId w:val="1024"/>
+          <w:numId w:val="1014"/>
         </w:numPr>
       </w:pPr>
       <w:r>
@@ -8999,7 +9015,7 @@
         <w:pStyle w:val="Compact"/>
         <w:numPr>
           <w:ilvl w:val="0"/>
-          <w:numId w:val="1024"/>
+          <w:numId w:val="1014"/>
         </w:numPr>
       </w:pPr>
       <w:r>
@@ -9078,7 +9094,7 @@
     </w:p>
     <w:bookmarkEnd w:id="26"/>
     <w:bookmarkEnd w:id="27"/>
-    <w:bookmarkStart w:id="28" w:name="appendix-b-hub-1.0-url-feature-contract"/>
+    <w:bookmarkStart w:id="28" w:name="appendix-b--hub-10-url--feature-contract"/>
     <w:p>
       <w:pPr>
         <w:pStyle w:val="Heading1"/>
@@ -9649,7 +9665,7 @@
       </w:r>
     </w:p>
     <w:bookmarkEnd w:id="28"/>
-    <w:bookmarkStart w:id="29" w:name="appendix-c-reuse-checklist"/>
+    <w:bookmarkStart w:id="29" w:name="appendix-c--reuse-checklist"/>
     <w:p>
       <w:pPr>
         <w:pStyle w:val="Heading1"/>
@@ -10236,7 +10252,7 @@
       </w:tr>
     </w:tbl>
     <w:bookmarkEnd w:id="29"/>
-    <w:bookmarkStart w:id="30" w:name="Xc0026ba403efa730b43d9d9771e9ecca6c692e7"/>
+    <w:bookmarkStart w:id="30" w:name="X8e127df9c12176fb20b75c96653728f7de60746"/>
     <w:p>
       <w:pPr>
         <w:pStyle w:val="Heading1"/>
@@ -10250,7 +10266,7 @@
         <w:pStyle w:val="Compact"/>
         <w:numPr>
           <w:ilvl w:val="0"/>
-          <w:numId w:val="1025"/>
+          <w:numId w:val="1015"/>
         </w:numPr>
       </w:pPr>
       <w:r>
@@ -10288,7 +10304,7 @@
         <w:pStyle w:val="Compact"/>
         <w:numPr>
           <w:ilvl w:val="0"/>
-          <w:numId w:val="1025"/>
+          <w:numId w:val="1015"/>
         </w:numPr>
       </w:pPr>
       <w:r>
@@ -10310,7 +10326,7 @@
         <w:pStyle w:val="Compact"/>
         <w:numPr>
           <w:ilvl w:val="0"/>
-          <w:numId w:val="1025"/>
+          <w:numId w:val="1015"/>
         </w:numPr>
       </w:pPr>
       <w:r>
@@ -10332,7 +10348,7 @@
         <w:pStyle w:val="Compact"/>
         <w:numPr>
           <w:ilvl w:val="0"/>
-          <w:numId w:val="1025"/>
+          <w:numId w:val="1015"/>
         </w:numPr>
       </w:pPr>
       <w:r>
@@ -10354,7 +10370,7 @@
         <w:pStyle w:val="Compact"/>
         <w:numPr>
           <w:ilvl w:val="0"/>
-          <w:numId w:val="1025"/>
+          <w:numId w:val="1015"/>
         </w:numPr>
       </w:pPr>
       <w:r>
@@ -10376,7 +10392,7 @@
         <w:pStyle w:val="Compact"/>
         <w:numPr>
           <w:ilvl w:val="0"/>
-          <w:numId w:val="1025"/>
+          <w:numId w:val="1015"/>
         </w:numPr>
       </w:pPr>
       <w:r>
@@ -10414,7 +10430,7 @@
         <w:pStyle w:val="Compact"/>
         <w:numPr>
           <w:ilvl w:val="0"/>
-          <w:numId w:val="1025"/>
+          <w:numId w:val="1015"/>
         </w:numPr>
       </w:pPr>
       <w:r>
@@ -10452,7 +10468,7 @@
         <w:pStyle w:val="Compact"/>
         <w:numPr>
           <w:ilvl w:val="0"/>
-          <w:numId w:val="1025"/>
+          <w:numId w:val="1015"/>
         </w:numPr>
       </w:pPr>
       <w:r>
@@ -10474,7 +10490,7 @@
         <w:pStyle w:val="Compact"/>
         <w:numPr>
           <w:ilvl w:val="0"/>
-          <w:numId w:val="1025"/>
+          <w:numId w:val="1015"/>
         </w:numPr>
       </w:pPr>
       <w:r>
@@ -10496,7 +10512,7 @@
         <w:pStyle w:val="Compact"/>
         <w:numPr>
           <w:ilvl w:val="0"/>
-          <w:numId w:val="1025"/>
+          <w:numId w:val="1015"/>
         </w:numPr>
       </w:pPr>
       <w:r>
@@ -10518,7 +10534,7 @@
         <w:pStyle w:val="Compact"/>
         <w:numPr>
           <w:ilvl w:val="0"/>
-          <w:numId w:val="1025"/>
+          <w:numId w:val="1015"/>
         </w:numPr>
       </w:pPr>
       <w:r>
@@ -10540,7 +10556,7 @@
         <w:pStyle w:val="Compact"/>
         <w:numPr>
           <w:ilvl w:val="0"/>
-          <w:numId w:val="1025"/>
+          <w:numId w:val="1015"/>
         </w:numPr>
       </w:pPr>
       <w:r>
@@ -10574,7 +10590,7 @@
         <w:pStyle w:val="Compact"/>
         <w:numPr>
           <w:ilvl w:val="0"/>
-          <w:numId w:val="1025"/>
+          <w:numId w:val="1015"/>
         </w:numPr>
       </w:pPr>
       <w:r>
@@ -10596,7 +10612,7 @@
         <w:pStyle w:val="Compact"/>
         <w:numPr>
           <w:ilvl w:val="0"/>
-          <w:numId w:val="1025"/>
+          <w:numId w:val="1015"/>
         </w:numPr>
       </w:pPr>
       <w:r>
@@ -10630,7 +10646,7 @@
         <w:pStyle w:val="Compact"/>
         <w:numPr>
           <w:ilvl w:val="0"/>
-          <w:numId w:val="1025"/>
+          <w:numId w:val="1015"/>
         </w:numPr>
       </w:pPr>
       <w:r>
@@ -10648,7 +10664,7 @@
       </w:r>
     </w:p>
     <w:bookmarkEnd w:id="30"/>
-    <w:bookmarkStart w:id="31" w:name="X00ec0df21b4ecbfb31d80aa66c14dd81a1db510"/>
+    <w:bookmarkStart w:id="31" w:name="Xb84e9dc3efedb0c31378e15b857311068c3cded"/>
     <w:p>
       <w:pPr>
         <w:pStyle w:val="Heading1"/>
@@ -11636,771 +11652,6 @@
       </w:pPr>
     </w:lvl>
   </w:abstractNum>
-  <w:abstractNum w:abstractNumId="99412">
-    <w:nsid w:val="00A99412"/>
-    <w:multiLevelType w:val="multilevel"/>
-    <w:lvl w:ilvl="0">
-      <w:start w:val="2"/>
-      <w:numFmt w:val="decimal"/>
-      <w:lvlText w:val="%1."/>
-      <w:lvlJc w:val="left"/>
-      <w:pPr>
-        <w:ind w:left="720" w:hanging="360"/>
-      </w:pPr>
-    </w:lvl>
-    <w:lvl w:ilvl="1">
-      <w:start w:val="2"/>
-      <w:numFmt w:val="decimal"/>
-      <w:lvlText w:val="%2."/>
-      <w:lvlJc w:val="left"/>
-      <w:pPr>
-        <w:ind w:left="1440" w:hanging="360"/>
-      </w:pPr>
-    </w:lvl>
-    <w:lvl w:ilvl="2">
-      <w:start w:val="2"/>
-      <w:numFmt w:val="decimal"/>
-      <w:lvlText w:val="%3."/>
-      <w:lvlJc w:val="left"/>
-      <w:pPr>
-        <w:ind w:left="2160" w:hanging="360"/>
-      </w:pPr>
-    </w:lvl>
-    <w:lvl w:ilvl="3">
-      <w:start w:val="2"/>
-      <w:numFmt w:val="decimal"/>
-      <w:lvlText w:val="%4."/>
-      <w:lvlJc w:val="left"/>
-      <w:pPr>
-        <w:ind w:left="2880" w:hanging="360"/>
-      </w:pPr>
-    </w:lvl>
-    <w:lvl w:ilvl="4">
-      <w:start w:val="2"/>
-      <w:numFmt w:val="decimal"/>
-      <w:lvlText w:val="%5."/>
-      <w:lvlJc w:val="left"/>
-      <w:pPr>
-        <w:ind w:left="3600" w:hanging="360"/>
-      </w:pPr>
-    </w:lvl>
-    <w:lvl w:ilvl="5">
-      <w:start w:val="2"/>
-      <w:numFmt w:val="decimal"/>
-      <w:lvlText w:val="%6."/>
-      <w:lvlJc w:val="left"/>
-      <w:pPr>
-        <w:ind w:left="4320" w:hanging="360"/>
-      </w:pPr>
-    </w:lvl>
-    <w:lvl w:ilvl="6">
-      <w:start w:val="2"/>
-      <w:numFmt w:val="decimal"/>
-      <w:lvlText w:val="%7."/>
-      <w:lvlJc w:val="left"/>
-      <w:pPr>
-        <w:ind w:left="5040" w:hanging="360"/>
-      </w:pPr>
-    </w:lvl>
-    <w:lvl w:ilvl="7">
-      <w:start w:val="2"/>
-      <w:numFmt w:val="decimal"/>
-      <w:lvlText w:val="%8."/>
-      <w:lvlJc w:val="left"/>
-      <w:pPr>
-        <w:ind w:left="5760" w:hanging="360"/>
-      </w:pPr>
-    </w:lvl>
-    <w:lvl w:ilvl="8">
-      <w:start w:val="2"/>
-      <w:numFmt w:val="decimal"/>
-      <w:lvlText w:val="%9."/>
-      <w:lvlJc w:val="left"/>
-      <w:pPr>
-        <w:ind w:left="6480" w:hanging="360"/>
-      </w:pPr>
-    </w:lvl>
-  </w:abstractNum>
-  <w:abstractNum w:abstractNumId="99413">
-    <w:nsid w:val="00A99413"/>
-    <w:multiLevelType w:val="multilevel"/>
-    <w:lvl w:ilvl="0">
-      <w:start w:val="3"/>
-      <w:numFmt w:val="decimal"/>
-      <w:lvlText w:val="%1."/>
-      <w:lvlJc w:val="left"/>
-      <w:pPr>
-        <w:ind w:left="720" w:hanging="360"/>
-      </w:pPr>
-    </w:lvl>
-    <w:lvl w:ilvl="1">
-      <w:start w:val="3"/>
-      <w:numFmt w:val="decimal"/>
-      <w:lvlText w:val="%2."/>
-      <w:lvlJc w:val="left"/>
-      <w:pPr>
-        <w:ind w:left="1440" w:hanging="360"/>
-      </w:pPr>
-    </w:lvl>
-    <w:lvl w:ilvl="2">
-      <w:start w:val="3"/>
-      <w:numFmt w:val="decimal"/>
-      <w:lvlText w:val="%3."/>
-      <w:lvlJc w:val="left"/>
-      <w:pPr>
-        <w:ind w:left="2160" w:hanging="360"/>
-      </w:pPr>
-    </w:lvl>
-    <w:lvl w:ilvl="3">
-      <w:start w:val="3"/>
-      <w:numFmt w:val="decimal"/>
-      <w:lvlText w:val="%4."/>
-      <w:lvlJc w:val="left"/>
-      <w:pPr>
-        <w:ind w:left="2880" w:hanging="360"/>
-      </w:pPr>
-    </w:lvl>
-    <w:lvl w:ilvl="4">
-      <w:start w:val="3"/>
-      <w:numFmt w:val="decimal"/>
-      <w:lvlText w:val="%5."/>
-      <w:lvlJc w:val="left"/>
-      <w:pPr>
-        <w:ind w:left="3600" w:hanging="360"/>
-      </w:pPr>
-    </w:lvl>
-    <w:lvl w:ilvl="5">
-      <w:start w:val="3"/>
-      <w:numFmt w:val="decimal"/>
-      <w:lvlText w:val="%6."/>
-      <w:lvlJc w:val="left"/>
-      <w:pPr>
-        <w:ind w:left="4320" w:hanging="360"/>
-      </w:pPr>
-    </w:lvl>
-    <w:lvl w:ilvl="6">
-      <w:start w:val="3"/>
-      <w:numFmt w:val="decimal"/>
-      <w:lvlText w:val="%7."/>
-      <w:lvlJc w:val="left"/>
-      <w:pPr>
-        <w:ind w:left="5040" w:hanging="360"/>
-      </w:pPr>
-    </w:lvl>
-    <w:lvl w:ilvl="7">
-      <w:start w:val="3"/>
-      <w:numFmt w:val="decimal"/>
-      <w:lvlText w:val="%8."/>
-      <w:lvlJc w:val="left"/>
-      <w:pPr>
-        <w:ind w:left="5760" w:hanging="360"/>
-      </w:pPr>
-    </w:lvl>
-    <w:lvl w:ilvl="8">
-      <w:start w:val="3"/>
-      <w:numFmt w:val="decimal"/>
-      <w:lvlText w:val="%9."/>
-      <w:lvlJc w:val="left"/>
-      <w:pPr>
-        <w:ind w:left="6480" w:hanging="360"/>
-      </w:pPr>
-    </w:lvl>
-  </w:abstractNum>
-  <w:abstractNum w:abstractNumId="99414">
-    <w:nsid w:val="00A99414"/>
-    <w:multiLevelType w:val="multilevel"/>
-    <w:lvl w:ilvl="0">
-      <w:start w:val="4"/>
-      <w:numFmt w:val="decimal"/>
-      <w:lvlText w:val="%1."/>
-      <w:lvlJc w:val="left"/>
-      <w:pPr>
-        <w:ind w:left="720" w:hanging="360"/>
-      </w:pPr>
-    </w:lvl>
-    <w:lvl w:ilvl="1">
-      <w:start w:val="4"/>
-      <w:numFmt w:val="decimal"/>
-      <w:lvlText w:val="%2."/>
-      <w:lvlJc w:val="left"/>
-      <w:pPr>
-        <w:ind w:left="1440" w:hanging="360"/>
-      </w:pPr>
-    </w:lvl>
-    <w:lvl w:ilvl="2">
-      <w:start w:val="4"/>
-      <w:numFmt w:val="decimal"/>
-      <w:lvlText w:val="%3."/>
-      <w:lvlJc w:val="left"/>
-      <w:pPr>
-        <w:ind w:left="2160" w:hanging="360"/>
-      </w:pPr>
-    </w:lvl>
-    <w:lvl w:ilvl="3">
-      <w:start w:val="4"/>
-      <w:numFmt w:val="decimal"/>
-      <w:lvlText w:val="%4."/>
-      <w:lvlJc w:val="left"/>
-      <w:pPr>
-        <w:ind w:left="2880" w:hanging="360"/>
-      </w:pPr>
-    </w:lvl>
-    <w:lvl w:ilvl="4">
-      <w:start w:val="4"/>
-      <w:numFmt w:val="decimal"/>
-      <w:lvlText w:val="%5."/>
-      <w:lvlJc w:val="left"/>
-      <w:pPr>
-        <w:ind w:left="3600" w:hanging="360"/>
-      </w:pPr>
-    </w:lvl>
-    <w:lvl w:ilvl="5">
-      <w:start w:val="4"/>
-      <w:numFmt w:val="decimal"/>
-      <w:lvlText w:val="%6."/>
-      <w:lvlJc w:val="left"/>
-      <w:pPr>
-        <w:ind w:left="4320" w:hanging="360"/>
-      </w:pPr>
-    </w:lvl>
-    <w:lvl w:ilvl="6">
-      <w:start w:val="4"/>
-      <w:numFmt w:val="decimal"/>
-      <w:lvlText w:val="%7."/>
-      <w:lvlJc w:val="left"/>
-      <w:pPr>
-        <w:ind w:left="5040" w:hanging="360"/>
-      </w:pPr>
-    </w:lvl>
-    <w:lvl w:ilvl="7">
-      <w:start w:val="4"/>
-      <w:numFmt w:val="decimal"/>
-      <w:lvlText w:val="%8."/>
-      <w:lvlJc w:val="left"/>
-      <w:pPr>
-        <w:ind w:left="5760" w:hanging="360"/>
-      </w:pPr>
-    </w:lvl>
-    <w:lvl w:ilvl="8">
-      <w:start w:val="4"/>
-      <w:numFmt w:val="decimal"/>
-      <w:lvlText w:val="%9."/>
-      <w:lvlJc w:val="left"/>
-      <w:pPr>
-        <w:ind w:left="6480" w:hanging="360"/>
-      </w:pPr>
-    </w:lvl>
-  </w:abstractNum>
-  <w:abstractNum w:abstractNumId="99415">
-    <w:nsid w:val="00A99415"/>
-    <w:multiLevelType w:val="multilevel"/>
-    <w:lvl w:ilvl="0">
-      <w:start w:val="5"/>
-      <w:numFmt w:val="decimal"/>
-      <w:lvlText w:val="%1."/>
-      <w:lvlJc w:val="left"/>
-      <w:pPr>
-        <w:ind w:left="720" w:hanging="360"/>
-      </w:pPr>
-    </w:lvl>
-    <w:lvl w:ilvl="1">
-      <w:start w:val="5"/>
-      <w:numFmt w:val="decimal"/>
-      <w:lvlText w:val="%2."/>
-      <w:lvlJc w:val="left"/>
-      <w:pPr>
-        <w:ind w:left="1440" w:hanging="360"/>
-      </w:pPr>
-    </w:lvl>
-    <w:lvl w:ilvl="2">
-      <w:start w:val="5"/>
-      <w:numFmt w:val="decimal"/>
-      <w:lvlText w:val="%3."/>
-      <w:lvlJc w:val="left"/>
-      <w:pPr>
-        <w:ind w:left="2160" w:hanging="360"/>
-      </w:pPr>
-    </w:lvl>
-    <w:lvl w:ilvl="3">
-      <w:start w:val="5"/>
-      <w:numFmt w:val="decimal"/>
-      <w:lvlText w:val="%4."/>
-      <w:lvlJc w:val="left"/>
-      <w:pPr>
-        <w:ind w:left="2880" w:hanging="360"/>
-      </w:pPr>
-    </w:lvl>
-    <w:lvl w:ilvl="4">
-      <w:start w:val="5"/>
-      <w:numFmt w:val="decimal"/>
-      <w:lvlText w:val="%5."/>
-      <w:lvlJc w:val="left"/>
-      <w:pPr>
-        <w:ind w:left="3600" w:hanging="360"/>
-      </w:pPr>
-    </w:lvl>
-    <w:lvl w:ilvl="5">
-      <w:start w:val="5"/>
-      <w:numFmt w:val="decimal"/>
-      <w:lvlText w:val="%6."/>
-      <w:lvlJc w:val="left"/>
-      <w:pPr>
-        <w:ind w:left="4320" w:hanging="360"/>
-      </w:pPr>
-    </w:lvl>
-    <w:lvl w:ilvl="6">
-      <w:start w:val="5"/>
-      <w:numFmt w:val="decimal"/>
-      <w:lvlText w:val="%7."/>
-      <w:lvlJc w:val="left"/>
-      <w:pPr>
-        <w:ind w:left="5040" w:hanging="360"/>
-      </w:pPr>
-    </w:lvl>
-    <w:lvl w:ilvl="7">
-      <w:start w:val="5"/>
-      <w:numFmt w:val="decimal"/>
-      <w:lvlText w:val="%8."/>
-      <w:lvlJc w:val="left"/>
-      <w:pPr>
-        <w:ind w:left="5760" w:hanging="360"/>
-      </w:pPr>
-    </w:lvl>
-    <w:lvl w:ilvl="8">
-      <w:start w:val="5"/>
-      <w:numFmt w:val="decimal"/>
-      <w:lvlText w:val="%9."/>
-      <w:lvlJc w:val="left"/>
-      <w:pPr>
-        <w:ind w:left="6480" w:hanging="360"/>
-      </w:pPr>
-    </w:lvl>
-  </w:abstractNum>
-  <w:abstractNum w:abstractNumId="99416">
-    <w:nsid w:val="00A99416"/>
-    <w:multiLevelType w:val="multilevel"/>
-    <w:lvl w:ilvl="0">
-      <w:start w:val="6"/>
-      <w:numFmt w:val="decimal"/>
-      <w:lvlText w:val="%1."/>
-      <w:lvlJc w:val="left"/>
-      <w:pPr>
-        <w:ind w:left="720" w:hanging="360"/>
-      </w:pPr>
-    </w:lvl>
-    <w:lvl w:ilvl="1">
-      <w:start w:val="6"/>
-      <w:numFmt w:val="decimal"/>
-      <w:lvlText w:val="%2."/>
-      <w:lvlJc w:val="left"/>
-      <w:pPr>
-        <w:ind w:left="1440" w:hanging="360"/>
-      </w:pPr>
-    </w:lvl>
-    <w:lvl w:ilvl="2">
-      <w:start w:val="6"/>
-      <w:numFmt w:val="decimal"/>
-      <w:lvlText w:val="%3."/>
-      <w:lvlJc w:val="left"/>
-      <w:pPr>
-        <w:ind w:left="2160" w:hanging="360"/>
-      </w:pPr>
-    </w:lvl>
-    <w:lvl w:ilvl="3">
-      <w:start w:val="6"/>
-      <w:numFmt w:val="decimal"/>
-      <w:lvlText w:val="%4."/>
-      <w:lvlJc w:val="left"/>
-      <w:pPr>
-        <w:ind w:left="2880" w:hanging="360"/>
-      </w:pPr>
-    </w:lvl>
-    <w:lvl w:ilvl="4">
-      <w:start w:val="6"/>
-      <w:numFmt w:val="decimal"/>
-      <w:lvlText w:val="%5."/>
-      <w:lvlJc w:val="left"/>
-      <w:pPr>
-        <w:ind w:left="3600" w:hanging="360"/>
-      </w:pPr>
-    </w:lvl>
-    <w:lvl w:ilvl="5">
-      <w:start w:val="6"/>
-      <w:numFmt w:val="decimal"/>
-      <w:lvlText w:val="%6."/>
-      <w:lvlJc w:val="left"/>
-      <w:pPr>
-        <w:ind w:left="4320" w:hanging="360"/>
-      </w:pPr>
-    </w:lvl>
-    <w:lvl w:ilvl="6">
-      <w:start w:val="6"/>
-      <w:numFmt w:val="decimal"/>
-      <w:lvlText w:val="%7."/>
-      <w:lvlJc w:val="left"/>
-      <w:pPr>
-        <w:ind w:left="5040" w:hanging="360"/>
-      </w:pPr>
-    </w:lvl>
-    <w:lvl w:ilvl="7">
-      <w:start w:val="6"/>
-      <w:numFmt w:val="decimal"/>
-      <w:lvlText w:val="%8."/>
-      <w:lvlJc w:val="left"/>
-      <w:pPr>
-        <w:ind w:left="5760" w:hanging="360"/>
-      </w:pPr>
-    </w:lvl>
-    <w:lvl w:ilvl="8">
-      <w:start w:val="6"/>
-      <w:numFmt w:val="decimal"/>
-      <w:lvlText w:val="%9."/>
-      <w:lvlJc w:val="left"/>
-      <w:pPr>
-        <w:ind w:left="6480" w:hanging="360"/>
-      </w:pPr>
-    </w:lvl>
-  </w:abstractNum>
-  <w:abstractNum w:abstractNumId="99417">
-    <w:nsid w:val="00A99417"/>
-    <w:multiLevelType w:val="multilevel"/>
-    <w:lvl w:ilvl="0">
-      <w:start w:val="7"/>
-      <w:numFmt w:val="decimal"/>
-      <w:lvlText w:val="%1."/>
-      <w:lvlJc w:val="left"/>
-      <w:pPr>
-        <w:ind w:left="720" w:hanging="360"/>
-      </w:pPr>
-    </w:lvl>
-    <w:lvl w:ilvl="1">
-      <w:start w:val="7"/>
-      <w:numFmt w:val="decimal"/>
-      <w:lvlText w:val="%2."/>
-      <w:lvlJc w:val="left"/>
-      <w:pPr>
-        <w:ind w:left="1440" w:hanging="360"/>
-      </w:pPr>
-    </w:lvl>
-    <w:lvl w:ilvl="2">
-      <w:start w:val="7"/>
-      <w:numFmt w:val="decimal"/>
-      <w:lvlText w:val="%3."/>
-      <w:lvlJc w:val="left"/>
-      <w:pPr>
-        <w:ind w:left="2160" w:hanging="360"/>
-      </w:pPr>
-    </w:lvl>
-    <w:lvl w:ilvl="3">
-      <w:start w:val="7"/>
-      <w:numFmt w:val="decimal"/>
-      <w:lvlText w:val="%4."/>
-      <w:lvlJc w:val="left"/>
-      <w:pPr>
-        <w:ind w:left="2880" w:hanging="360"/>
-      </w:pPr>
-    </w:lvl>
-    <w:lvl w:ilvl="4">
-      <w:start w:val="7"/>
-      <w:numFmt w:val="decimal"/>
-      <w:lvlText w:val="%5."/>
-      <w:lvlJc w:val="left"/>
-      <w:pPr>
-        <w:ind w:left="3600" w:hanging="360"/>
-      </w:pPr>
-    </w:lvl>
-    <w:lvl w:ilvl="5">
-      <w:start w:val="7"/>
-      <w:numFmt w:val="decimal"/>
-      <w:lvlText w:val="%6."/>
-      <w:lvlJc w:val="left"/>
-      <w:pPr>
-        <w:ind w:left="4320" w:hanging="360"/>
-      </w:pPr>
-    </w:lvl>
-    <w:lvl w:ilvl="6">
-      <w:start w:val="7"/>
-      <w:numFmt w:val="decimal"/>
-      <w:lvlText w:val="%7."/>
-      <w:lvlJc w:val="left"/>
-      <w:pPr>
-        <w:ind w:left="5040" w:hanging="360"/>
-      </w:pPr>
-    </w:lvl>
-    <w:lvl w:ilvl="7">
-      <w:start w:val="7"/>
-      <w:numFmt w:val="decimal"/>
-      <w:lvlText w:val="%8."/>
-      <w:lvlJc w:val="left"/>
-      <w:pPr>
-        <w:ind w:left="5760" w:hanging="360"/>
-      </w:pPr>
-    </w:lvl>
-    <w:lvl w:ilvl="8">
-      <w:start w:val="7"/>
-      <w:numFmt w:val="decimal"/>
-      <w:lvlText w:val="%9."/>
-      <w:lvlJc w:val="left"/>
-      <w:pPr>
-        <w:ind w:left="6480" w:hanging="360"/>
-      </w:pPr>
-    </w:lvl>
-  </w:abstractNum>
-  <w:abstractNum w:abstractNumId="99418">
-    <w:nsid w:val="00A99418"/>
-    <w:multiLevelType w:val="multilevel"/>
-    <w:lvl w:ilvl="0">
-      <w:start w:val="8"/>
-      <w:numFmt w:val="decimal"/>
-      <w:lvlText w:val="%1."/>
-      <w:lvlJc w:val="left"/>
-      <w:pPr>
-        <w:ind w:left="720" w:hanging="360"/>
-      </w:pPr>
-    </w:lvl>
-    <w:lvl w:ilvl="1">
-      <w:start w:val="8"/>
-      <w:numFmt w:val="decimal"/>
-      <w:lvlText w:val="%2."/>
-      <w:lvlJc w:val="left"/>
-      <w:pPr>
-        <w:ind w:left="1440" w:hanging="360"/>
-      </w:pPr>
-    </w:lvl>
-    <w:lvl w:ilvl="2">
-      <w:start w:val="8"/>
-      <w:numFmt w:val="decimal"/>
-      <w:lvlText w:val="%3."/>
-      <w:lvlJc w:val="left"/>
-      <w:pPr>
-        <w:ind w:left="2160" w:hanging="360"/>
-      </w:pPr>
-    </w:lvl>
-    <w:lvl w:ilvl="3">
-      <w:start w:val="8"/>
-      <w:numFmt w:val="decimal"/>
-      <w:lvlText w:val="%4."/>
-      <w:lvlJc w:val="left"/>
-      <w:pPr>
-        <w:ind w:left="2880" w:hanging="360"/>
-      </w:pPr>
-    </w:lvl>
-    <w:lvl w:ilvl="4">
-      <w:start w:val="8"/>
-      <w:numFmt w:val="decimal"/>
-      <w:lvlText w:val="%5."/>
-      <w:lvlJc w:val="left"/>
-      <w:pPr>
-        <w:ind w:left="3600" w:hanging="360"/>
-      </w:pPr>
-    </w:lvl>
-    <w:lvl w:ilvl="5">
-      <w:start w:val="8"/>
-      <w:numFmt w:val="decimal"/>
-      <w:lvlText w:val="%6."/>
-      <w:lvlJc w:val="left"/>
-      <w:pPr>
-        <w:ind w:left="4320" w:hanging="360"/>
-      </w:pPr>
-    </w:lvl>
-    <w:lvl w:ilvl="6">
-      <w:start w:val="8"/>
-      <w:numFmt w:val="decimal"/>
-      <w:lvlText w:val="%7."/>
-      <w:lvlJc w:val="left"/>
-      <w:pPr>
-        <w:ind w:left="5040" w:hanging="360"/>
-      </w:pPr>
-    </w:lvl>
-    <w:lvl w:ilvl="7">
-      <w:start w:val="8"/>
-      <w:numFmt w:val="decimal"/>
-      <w:lvlText w:val="%8."/>
-      <w:lvlJc w:val="left"/>
-      <w:pPr>
-        <w:ind w:left="5760" w:hanging="360"/>
-      </w:pPr>
-    </w:lvl>
-    <w:lvl w:ilvl="8">
-      <w:start w:val="8"/>
-      <w:numFmt w:val="decimal"/>
-      <w:lvlText w:val="%9."/>
-      <w:lvlJc w:val="left"/>
-      <w:pPr>
-        <w:ind w:left="6480" w:hanging="360"/>
-      </w:pPr>
-    </w:lvl>
-  </w:abstractNum>
-  <w:abstractNum w:abstractNumId="99419">
-    <w:nsid w:val="00A99419"/>
-    <w:multiLevelType w:val="multilevel"/>
-    <w:lvl w:ilvl="0">
-      <w:start w:val="9"/>
-      <w:numFmt w:val="decimal"/>
-      <w:lvlText w:val="%1."/>
-      <w:lvlJc w:val="left"/>
-      <w:pPr>
-        <w:ind w:left="720" w:hanging="360"/>
-      </w:pPr>
-    </w:lvl>
-    <w:lvl w:ilvl="1">
-      <w:start w:val="9"/>
-      <w:numFmt w:val="decimal"/>
-      <w:lvlText w:val="%2."/>
-      <w:lvlJc w:val="left"/>
-      <w:pPr>
-        <w:ind w:left="1440" w:hanging="360"/>
-      </w:pPr>
-    </w:lvl>
-    <w:lvl w:ilvl="2">
-      <w:start w:val="9"/>
-      <w:numFmt w:val="decimal"/>
-      <w:lvlText w:val="%3."/>
-      <w:lvlJc w:val="left"/>
-      <w:pPr>
-        <w:ind w:left="2160" w:hanging="360"/>
-      </w:pPr>
-    </w:lvl>
-    <w:lvl w:ilvl="3">
-      <w:start w:val="9"/>
-      <w:numFmt w:val="decimal"/>
-      <w:lvlText w:val="%4."/>
-      <w:lvlJc w:val="left"/>
-      <w:pPr>
-        <w:ind w:left="2880" w:hanging="360"/>
-      </w:pPr>
-    </w:lvl>
-    <w:lvl w:ilvl="4">
-      <w:start w:val="9"/>
-      <w:numFmt w:val="decimal"/>
-      <w:lvlText w:val="%5."/>
-      <w:lvlJc w:val="left"/>
-      <w:pPr>
-        <w:ind w:left="3600" w:hanging="360"/>
-      </w:pPr>
-    </w:lvl>
-    <w:lvl w:ilvl="5">
-      <w:start w:val="9"/>
-      <w:numFmt w:val="decimal"/>
-      <w:lvlText w:val="%6."/>
-      <w:lvlJc w:val="left"/>
-      <w:pPr>
-        <w:ind w:left="4320" w:hanging="360"/>
-      </w:pPr>
-    </w:lvl>
-    <w:lvl w:ilvl="6">
-      <w:start w:val="9"/>
-      <w:numFmt w:val="decimal"/>
-      <w:lvlText w:val="%7."/>
-      <w:lvlJc w:val="left"/>
-      <w:pPr>
-        <w:ind w:left="5040" w:hanging="360"/>
-      </w:pPr>
-    </w:lvl>
-    <w:lvl w:ilvl="7">
-      <w:start w:val="9"/>
-      <w:numFmt w:val="decimal"/>
-      <w:lvlText w:val="%8."/>
-      <w:lvlJc w:val="left"/>
-      <w:pPr>
-        <w:ind w:left="5760" w:hanging="360"/>
-      </w:pPr>
-    </w:lvl>
-    <w:lvl w:ilvl="8">
-      <w:start w:val="9"/>
-      <w:numFmt w:val="decimal"/>
-      <w:lvlText w:val="%9."/>
-      <w:lvlJc w:val="left"/>
-      <w:pPr>
-        <w:ind w:left="6480" w:hanging="360"/>
-      </w:pPr>
-    </w:lvl>
-  </w:abstractNum>
-  <w:abstractNum w:abstractNumId="994110">
-    <w:nsid w:val="0A994110"/>
-    <w:multiLevelType w:val="multilevel"/>
-    <w:lvl w:ilvl="0">
-      <w:start w:val="10"/>
-      <w:numFmt w:val="decimal"/>
-      <w:lvlText w:val="%1."/>
-      <w:lvlJc w:val="left"/>
-      <w:pPr>
-        <w:ind w:left="720" w:hanging="360"/>
-      </w:pPr>
-    </w:lvl>
-    <w:lvl w:ilvl="1">
-      <w:start w:val="10"/>
-      <w:numFmt w:val="decimal"/>
-      <w:lvlText w:val="%2."/>
-      <w:lvlJc w:val="left"/>
-      <w:pPr>
-        <w:ind w:left="1440" w:hanging="360"/>
-      </w:pPr>
-    </w:lvl>
-    <w:lvl w:ilvl="2">
-      <w:start w:val="10"/>
-      <w:numFmt w:val="decimal"/>
-      <w:lvlText w:val="%3."/>
-      <w:lvlJc w:val="left"/>
-      <w:pPr>
-        <w:ind w:left="2160" w:hanging="360"/>
-      </w:pPr>
-    </w:lvl>
-    <w:lvl w:ilvl="3">
-      <w:start w:val="10"/>
-      <w:numFmt w:val="decimal"/>
-      <w:lvlText w:val="%4."/>
-      <w:lvlJc w:val="left"/>
-      <w:pPr>
-        <w:ind w:left="2880" w:hanging="360"/>
-      </w:pPr>
-    </w:lvl>
-    <w:lvl w:ilvl="4">
-      <w:start w:val="10"/>
-      <w:numFmt w:val="decimal"/>
-      <w:lvlText w:val="%5."/>
-      <w:lvlJc w:val="left"/>
-      <w:pPr>
-        <w:ind w:left="3600" w:hanging="360"/>
-      </w:pPr>
-    </w:lvl>
-    <w:lvl w:ilvl="5">
-      <w:start w:val="10"/>
-      <w:numFmt w:val="decimal"/>
-      <w:lvlText w:val="%6."/>
-      <w:lvlJc w:val="left"/>
-      <w:pPr>
-        <w:ind w:left="4320" w:hanging="360"/>
-      </w:pPr>
-    </w:lvl>
-    <w:lvl w:ilvl="6">
-      <w:start w:val="10"/>
-      <w:numFmt w:val="decimal"/>
-      <w:lvlText w:val="%7."/>
-      <w:lvlJc w:val="left"/>
-      <w:pPr>
-        <w:ind w:left="5040" w:hanging="360"/>
-      </w:pPr>
-    </w:lvl>
-    <w:lvl w:ilvl="7">
-      <w:start w:val="10"/>
-      <w:numFmt w:val="decimal"/>
-      <w:lvlText w:val="%8."/>
-      <w:lvlJc w:val="left"/>
-      <w:pPr>
-        <w:ind w:left="5760" w:hanging="360"/>
-      </w:pPr>
-    </w:lvl>
-    <w:lvl w:ilvl="8">
-      <w:start w:val="10"/>
-      <w:numFmt w:val="decimal"/>
-      <w:lvlText w:val="%9."/>
-      <w:lvlJc w:val="left"/>
-      <w:pPr>
-        <w:ind w:left="6480" w:hanging="360"/>
-      </w:pPr>
-    </w:lvl>
-  </w:abstractNum>
   <w:num w:numId="1000">
     <w:abstractNumId w:val="990"/>
   </w:num>
@@ -12411,6 +11662,9 @@
     <w:abstractNumId w:val="991"/>
   </w:num>
   <w:num w:numId="1003">
+    <w:abstractNumId w:val="991"/>
+  </w:num>
+  <w:num w:numId="1004">
     <w:abstractNumId w:val="99411"/>
     <w:lvlOverride w:ilvl="0">
       <w:startOverride w:val="1"/>
@@ -12440,277 +11694,85 @@
       <w:startOverride w:val="1"/>
     </w:lvlOverride>
   </w:num>
-  <w:num w:numId="1004">
-    <w:abstractNumId w:val="99412"/>
+  <w:num w:numId="1005">
+    <w:abstractNumId w:val="991"/>
+  </w:num>
+  <w:num w:numId="1006">
+    <w:abstractNumId w:val="991"/>
+  </w:num>
+  <w:num w:numId="1007">
+    <w:abstractNumId w:val="991"/>
+  </w:num>
+  <w:num w:numId="1008">
+    <w:abstractNumId w:val="991"/>
+  </w:num>
+  <w:num w:numId="1009">
+    <w:abstractNumId w:val="991"/>
+  </w:num>
+  <w:num w:numId="1010">
+    <w:abstractNumId w:val="99411"/>
     <w:lvlOverride w:ilvl="0">
-      <w:startOverride w:val="2"/>
+      <w:startOverride w:val="1"/>
     </w:lvlOverride>
     <w:lvlOverride w:ilvl="1">
-      <w:startOverride w:val="2"/>
+      <w:startOverride w:val="1"/>
     </w:lvlOverride>
     <w:lvlOverride w:ilvl="2">
-      <w:startOverride w:val="2"/>
+      <w:startOverride w:val="1"/>
     </w:lvlOverride>
     <w:lvlOverride w:ilvl="3">
-      <w:startOverride w:val="2"/>
+      <w:startOverride w:val="1"/>
     </w:lvlOverride>
     <w:lvlOverride w:ilvl="4">
-      <w:startOverride w:val="2"/>
+      <w:startOverride w:val="1"/>
     </w:lvlOverride>
     <w:lvlOverride w:ilvl="5">
-      <w:startOverride w:val="2"/>
+      <w:startOverride w:val="1"/>
     </w:lvlOverride>
     <w:lvlOverride w:ilvl="6">
-      <w:startOverride w:val="2"/>
+      <w:startOverride w:val="1"/>
     </w:lvlOverride>
     <w:lvlOverride w:ilvl="7">
-      <w:startOverride w:val="2"/>
+      <w:startOverride w:val="1"/>
     </w:lvlOverride>
     <w:lvlOverride w:ilvl="8">
-      <w:startOverride w:val="2"/>
+      <w:startOverride w:val="1"/>
     </w:lvlOverride>
   </w:num>
-  <w:num w:numId="1005">
-    <w:abstractNumId w:val="99413"/>
+  <w:num w:numId="1011">
+    <w:abstractNumId w:val="991"/>
+  </w:num>
+  <w:num w:numId="1012">
+    <w:abstractNumId w:val="991"/>
+  </w:num>
+  <w:num w:numId="1013">
+    <w:abstractNumId w:val="99411"/>
     <w:lvlOverride w:ilvl="0">
-      <w:startOverride w:val="3"/>
+      <w:startOverride w:val="1"/>
     </w:lvlOverride>
     <w:lvlOverride w:ilvl="1">
-      <w:startOverride w:val="3"/>
+      <w:startOverride w:val="1"/>
     </w:lvlOverride>
     <w:lvlOverride w:ilvl="2">
-      <w:startOverride w:val="3"/>
+      <w:startOverride w:val="1"/>
     </w:lvlOverride>
     <w:lvlOverride w:ilvl="3">
-      <w:startOverride w:val="3"/>
+      <w:startOverride w:val="1"/>
     </w:lvlOverride>
     <w:lvlOverride w:ilvl="4">
-      <w:startOverride w:val="3"/>
+      <w:startOverride w:val="1"/>
     </w:lvlOverride>
     <w:lvlOverride w:ilvl="5">
-      <w:startOverride w:val="3"/>
+      <w:startOverride w:val="1"/>
     </w:lvlOverride>
     <w:lvlOverride w:ilvl="6">
-      <w:startOverride w:val="3"/>
+      <w:startOverride w:val="1"/>
     </w:lvlOverride>
     <w:lvlOverride w:ilvl="7">
-      <w:startOverride w:val="3"/>
+      <w:startOverride w:val="1"/>
     </w:lvlOverride>
     <w:lvlOverride w:ilvl="8">
-      <w:startOverride w:val="3"/>
-    </w:lvlOverride>
-  </w:num>
-  <w:num w:numId="1006">
-    <w:abstractNumId w:val="99414"/>
-    <w:lvlOverride w:ilvl="0">
-      <w:startOverride w:val="4"/>
-    </w:lvlOverride>
-    <w:lvlOverride w:ilvl="1">
-      <w:startOverride w:val="4"/>
-    </w:lvlOverride>
-    <w:lvlOverride w:ilvl="2">
-      <w:startOverride w:val="4"/>
-    </w:lvlOverride>
-    <w:lvlOverride w:ilvl="3">
-      <w:startOverride w:val="4"/>
-    </w:lvlOverride>
-    <w:lvlOverride w:ilvl="4">
-      <w:startOverride w:val="4"/>
-    </w:lvlOverride>
-    <w:lvlOverride w:ilvl="5">
-      <w:startOverride w:val="4"/>
-    </w:lvlOverride>
-    <w:lvlOverride w:ilvl="6">
-      <w:startOverride w:val="4"/>
-    </w:lvlOverride>
-    <w:lvlOverride w:ilvl="7">
-      <w:startOverride w:val="4"/>
-    </w:lvlOverride>
-    <w:lvlOverride w:ilvl="8">
-      <w:startOverride w:val="4"/>
-    </w:lvlOverride>
-  </w:num>
-  <w:num w:numId="1007">
-    <w:abstractNumId w:val="99415"/>
-    <w:lvlOverride w:ilvl="0">
-      <w:startOverride w:val="5"/>
-    </w:lvlOverride>
-    <w:lvlOverride w:ilvl="1">
-      <w:startOverride w:val="5"/>
-    </w:lvlOverride>
-    <w:lvlOverride w:ilvl="2">
-      <w:startOverride w:val="5"/>
-    </w:lvlOverride>
-    <w:lvlOverride w:ilvl="3">
-      <w:startOverride w:val="5"/>
-    </w:lvlOverride>
-    <w:lvlOverride w:ilvl="4">
-      <w:startOverride w:val="5"/>
-    </w:lvlOverride>
-    <w:lvlOverride w:ilvl="5">
-      <w:startOverride w:val="5"/>
-    </w:lvlOverride>
-    <w:lvlOverride w:ilvl="6">
-      <w:startOverride w:val="5"/>
-    </w:lvlOverride>
-    <w:lvlOverride w:ilvl="7">
-      <w:startOverride w:val="5"/>
-    </w:lvlOverride>
-    <w:lvlOverride w:ilvl="8">
-      <w:startOverride w:val="5"/>
-    </w:lvlOverride>
-  </w:num>
-  <w:num w:numId="1008">
-    <w:abstractNumId w:val="99416"/>
-    <w:lvlOverride w:ilvl="0">
-      <w:startOverride w:val="6"/>
-    </w:lvlOverride>
-    <w:lvlOverride w:ilvl="1">
-      <w:startOverride w:val="6"/>
-    </w:lvlOverride>
-    <w:lvlOverride w:ilvl="2">
-      <w:startOverride w:val="6"/>
-    </w:lvlOverride>
-    <w:lvlOverride w:ilvl="3">
-      <w:startOverride w:val="6"/>
-    </w:lvlOverride>
-    <w:lvlOverride w:ilvl="4">
-      <w:startOverride w:val="6"/>
-    </w:lvlOverride>
-    <w:lvlOverride w:ilvl="5">
-      <w:startOverride w:val="6"/>
-    </w:lvlOverride>
-    <w:lvlOverride w:ilvl="6">
-      <w:startOverride w:val="6"/>
-    </w:lvlOverride>
-    <w:lvlOverride w:ilvl="7">
-      <w:startOverride w:val="6"/>
-    </w:lvlOverride>
-    <w:lvlOverride w:ilvl="8">
-      <w:startOverride w:val="6"/>
-    </w:lvlOverride>
-  </w:num>
-  <w:num w:numId="1009">
-    <w:abstractNumId w:val="99417"/>
-    <w:lvlOverride w:ilvl="0">
-      <w:startOverride w:val="7"/>
-    </w:lvlOverride>
-    <w:lvlOverride w:ilvl="1">
-      <w:startOverride w:val="7"/>
-    </w:lvlOverride>
-    <w:lvlOverride w:ilvl="2">
-      <w:startOverride w:val="7"/>
-    </w:lvlOverride>
-    <w:lvlOverride w:ilvl="3">
-      <w:startOverride w:val="7"/>
-    </w:lvlOverride>
-    <w:lvlOverride w:ilvl="4">
-      <w:startOverride w:val="7"/>
-    </w:lvlOverride>
-    <w:lvlOverride w:ilvl="5">
-      <w:startOverride w:val="7"/>
-    </w:lvlOverride>
-    <w:lvlOverride w:ilvl="6">
-      <w:startOverride w:val="7"/>
-    </w:lvlOverride>
-    <w:lvlOverride w:ilvl="7">
-      <w:startOverride w:val="7"/>
-    </w:lvlOverride>
-    <w:lvlOverride w:ilvl="8">
-      <w:startOverride w:val="7"/>
-    </w:lvlOverride>
-  </w:num>
-  <w:num w:numId="1010">
-    <w:abstractNumId w:val="991"/>
-  </w:num>
-  <w:num w:numId="1011">
-    <w:abstractNumId w:val="99418"/>
-    <w:lvlOverride w:ilvl="0">
-      <w:startOverride w:val="8"/>
-    </w:lvlOverride>
-    <w:lvlOverride w:ilvl="1">
-      <w:startOverride w:val="8"/>
-    </w:lvlOverride>
-    <w:lvlOverride w:ilvl="2">
-      <w:startOverride w:val="8"/>
-    </w:lvlOverride>
-    <w:lvlOverride w:ilvl="3">
-      <w:startOverride w:val="8"/>
-    </w:lvlOverride>
-    <w:lvlOverride w:ilvl="4">
-      <w:startOverride w:val="8"/>
-    </w:lvlOverride>
-    <w:lvlOverride w:ilvl="5">
-      <w:startOverride w:val="8"/>
-    </w:lvlOverride>
-    <w:lvlOverride w:ilvl="6">
-      <w:startOverride w:val="8"/>
-    </w:lvlOverride>
-    <w:lvlOverride w:ilvl="7">
-      <w:startOverride w:val="8"/>
-    </w:lvlOverride>
-    <w:lvlOverride w:ilvl="8">
-      <w:startOverride w:val="8"/>
-    </w:lvlOverride>
-  </w:num>
-  <w:num w:numId="1012">
-    <w:abstractNumId w:val="99419"/>
-    <w:lvlOverride w:ilvl="0">
-      <w:startOverride w:val="9"/>
-    </w:lvlOverride>
-    <w:lvlOverride w:ilvl="1">
-      <w:startOverride w:val="9"/>
-    </w:lvlOverride>
-    <w:lvlOverride w:ilvl="2">
-      <w:startOverride w:val="9"/>
-    </w:lvlOverride>
-    <w:lvlOverride w:ilvl="3">
-      <w:startOverride w:val="9"/>
-    </w:lvlOverride>
-    <w:lvlOverride w:ilvl="4">
-      <w:startOverride w:val="9"/>
-    </w:lvlOverride>
-    <w:lvlOverride w:ilvl="5">
-      <w:startOverride w:val="9"/>
-    </w:lvlOverride>
-    <w:lvlOverride w:ilvl="6">
-      <w:startOverride w:val="9"/>
-    </w:lvlOverride>
-    <w:lvlOverride w:ilvl="7">
-      <w:startOverride w:val="9"/>
-    </w:lvlOverride>
-    <w:lvlOverride w:ilvl="8">
-      <w:startOverride w:val="9"/>
-    </w:lvlOverride>
-  </w:num>
-  <w:num w:numId="1013">
-    <w:abstractNumId w:val="994110"/>
-    <w:lvlOverride w:ilvl="0">
-      <w:startOverride w:val="10"/>
-    </w:lvlOverride>
-    <w:lvlOverride w:ilvl="1">
-      <w:startOverride w:val="10"/>
-    </w:lvlOverride>
-    <w:lvlOverride w:ilvl="2">
-      <w:startOverride w:val="10"/>
-    </w:lvlOverride>
-    <w:lvlOverride w:ilvl="3">
-      <w:startOverride w:val="10"/>
-    </w:lvlOverride>
-    <w:lvlOverride w:ilvl="4">
-      <w:startOverride w:val="10"/>
-    </w:lvlOverride>
-    <w:lvlOverride w:ilvl="5">
-      <w:startOverride w:val="10"/>
-    </w:lvlOverride>
-    <w:lvlOverride w:ilvl="6">
-      <w:startOverride w:val="10"/>
-    </w:lvlOverride>
-    <w:lvlOverride w:ilvl="7">
-      <w:startOverride w:val="10"/>
-    </w:lvlOverride>
-    <w:lvlOverride w:ilvl="8">
-      <w:startOverride w:val="10"/>
+      <w:startOverride w:val="1"/>
     </w:lvlOverride>
   </w:num>
   <w:num w:numId="1014">
@@ -12744,117 +11806,6 @@
     </w:lvlOverride>
   </w:num>
   <w:num w:numId="1015">
-    <w:abstractNumId w:val="991"/>
-  </w:num>
-  <w:num w:numId="1016">
-    <w:abstractNumId w:val="991"/>
-  </w:num>
-  <w:num w:numId="1017">
-    <w:abstractNumId w:val="991"/>
-  </w:num>
-  <w:num w:numId="1018">
-    <w:abstractNumId w:val="991"/>
-  </w:num>
-  <w:num w:numId="1019">
-    <w:abstractNumId w:val="991"/>
-  </w:num>
-  <w:num w:numId="1020">
-    <w:abstractNumId w:val="99411"/>
-    <w:lvlOverride w:ilvl="0">
-      <w:startOverride w:val="1"/>
-    </w:lvlOverride>
-    <w:lvlOverride w:ilvl="1">
-      <w:startOverride w:val="1"/>
-    </w:lvlOverride>
-    <w:lvlOverride w:ilvl="2">
-      <w:startOverride w:val="1"/>
-    </w:lvlOverride>
-    <w:lvlOverride w:ilvl="3">
-      <w:startOverride w:val="1"/>
-    </w:lvlOverride>
-    <w:lvlOverride w:ilvl="4">
-      <w:startOverride w:val="1"/>
-    </w:lvlOverride>
-    <w:lvlOverride w:ilvl="5">
-      <w:startOverride w:val="1"/>
-    </w:lvlOverride>
-    <w:lvlOverride w:ilvl="6">
-      <w:startOverride w:val="1"/>
-    </w:lvlOverride>
-    <w:lvlOverride w:ilvl="7">
-      <w:startOverride w:val="1"/>
-    </w:lvlOverride>
-    <w:lvlOverride w:ilvl="8">
-      <w:startOverride w:val="1"/>
-    </w:lvlOverride>
-  </w:num>
-  <w:num w:numId="1021">
-    <w:abstractNumId w:val="991"/>
-  </w:num>
-  <w:num w:numId="1022">
-    <w:abstractNumId w:val="991"/>
-  </w:num>
-  <w:num w:numId="1023">
-    <w:abstractNumId w:val="99411"/>
-    <w:lvlOverride w:ilvl="0">
-      <w:startOverride w:val="1"/>
-    </w:lvlOverride>
-    <w:lvlOverride w:ilvl="1">
-      <w:startOverride w:val="1"/>
-    </w:lvlOverride>
-    <w:lvlOverride w:ilvl="2">
-      <w:startOverride w:val="1"/>
-    </w:lvlOverride>
-    <w:lvlOverride w:ilvl="3">
-      <w:startOverride w:val="1"/>
-    </w:lvlOverride>
-    <w:lvlOverride w:ilvl="4">
-      <w:startOverride w:val="1"/>
-    </w:lvlOverride>
-    <w:lvlOverride w:ilvl="5">
-      <w:startOverride w:val="1"/>
-    </w:lvlOverride>
-    <w:lvlOverride w:ilvl="6">
-      <w:startOverride w:val="1"/>
-    </w:lvlOverride>
-    <w:lvlOverride w:ilvl="7">
-      <w:startOverride w:val="1"/>
-    </w:lvlOverride>
-    <w:lvlOverride w:ilvl="8">
-      <w:startOverride w:val="1"/>
-    </w:lvlOverride>
-  </w:num>
-  <w:num w:numId="1024">
-    <w:abstractNumId w:val="99411"/>
-    <w:lvlOverride w:ilvl="0">
-      <w:startOverride w:val="1"/>
-    </w:lvlOverride>
-    <w:lvlOverride w:ilvl="1">
-      <w:startOverride w:val="1"/>
-    </w:lvlOverride>
-    <w:lvlOverride w:ilvl="2">
-      <w:startOverride w:val="1"/>
-    </w:lvlOverride>
-    <w:lvlOverride w:ilvl="3">
-      <w:startOverride w:val="1"/>
-    </w:lvlOverride>
-    <w:lvlOverride w:ilvl="4">
-      <w:startOverride w:val="1"/>
-    </w:lvlOverride>
-    <w:lvlOverride w:ilvl="5">
-      <w:startOverride w:val="1"/>
-    </w:lvlOverride>
-    <w:lvlOverride w:ilvl="6">
-      <w:startOverride w:val="1"/>
-    </w:lvlOverride>
-    <w:lvlOverride w:ilvl="7">
-      <w:startOverride w:val="1"/>
-    </w:lvlOverride>
-    <w:lvlOverride w:ilvl="8">
-      <w:startOverride w:val="1"/>
-    </w:lvlOverride>
-  </w:num>
-  <w:num w:numId="1025">
     <w:abstractNumId w:val="991"/>
   </w:num>
 </w:numbering>

</xml_diff>

<commit_message>
Plan doc: clickable links and plain-English roadmap for managers
- All referenced resources are now live hyperlinks in the docx/md
  (Appendix E, Section 3-5 inline mentions); no Word fields, so the
  document still opens without a warning prompt
- New Section 7 subsections: 'So, what exactly has to be done?' (the
  six phases in plain English) and 'What we need from leadership'
  (five concrete asks: scope call, design reviews, content freeze,
  cutover coordination, launch-gate agreement)
</commit_message>
<xml_diff>
--- a/docs/ICJIA-Hub-20-rewrite-copperhead.docx
+++ b/docs/ICJIA-Hub-20-rewrite-copperhead.docx
@@ -81,7 +81,7 @@
         <w:t xml:space="preserve"> </w:t>
       </w:r>
       <w:r>
-        <w:t xml:space="preserve">Part I (Sections 1–7) is written for managers and decision-makers — about ten minutes of reading, no technical background assumed; unfamiliar terms are in the Glossary (Appendix D). Part II (Sections 8–10) and the Appendices are for developers. Web addresses for every system mentioned are collected as plain text in Appendix E. Figma design mockups will be attached in a future revision; this document is the planning and engineering baseline.</w:t>
+        <w:t xml:space="preserve">Part I (Sections 1–7) is written for managers and decision-makers — about ten minutes of reading, no technical background assumed; unfamiliar terms are in the Glossary (Appendix D). Part II (Sections 8–10) and the Appendices are for developers. Web addresses for every system mentioned are collected as clickable links in Appendix E. Figma design mockups will be attached in a future revision; this document is the planning and engineering baseline.</w:t>
       </w:r>
     </w:p>
     <w:p>
@@ -415,12 +415,12 @@
           <w:numId w:val="1001"/>
         </w:numPr>
       </w:pPr>
-      <w:hyperlink w:anchor="Xb84e9dc3efedb0c31378e15b857311068c3cded">
+      <w:hyperlink w:anchor="appendix-e--referenced-resources">
         <w:r>
           <w:rPr>
             <w:rStyle w:val="Hyperlink"/>
           </w:rPr>
-          <w:t xml:space="preserve">Appendix E — Referenced resources (plain-text addresses)</w:t>
+          <w:t xml:space="preserve">Appendix E — Referenced resources</w:t>
         </w:r>
       </w:hyperlink>
     </w:p>
@@ -431,7 +431,7 @@
         </w:pict>
       </w:r>
     </w:p>
-    <w:bookmarkStart w:id="16" w:name="part-i--for-decision-makers"/>
+    <w:bookmarkStart w:id="24" w:name="part-i--for-decision-makers"/>
     <w:p>
       <w:pPr>
         <w:pStyle w:val="Heading1"/>
@@ -974,7 +974,7 @@
       </w:r>
     </w:p>
     <w:bookmarkEnd w:id="10"/>
-    <w:bookmarkStart w:id="11" w:name="X1ce37e2e01f5f9d87df450cb16da045b4700c76"/>
+    <w:bookmarkStart w:id="12" w:name="X1ce37e2e01f5f9d87df450cb16da045b4700c76"/>
     <w:p>
       <w:pPr>
         <w:pStyle w:val="Heading2"/>
@@ -999,12 +999,14 @@
       <w:r>
         <w:t xml:space="preserve"> </w:t>
       </w:r>
-      <w:r>
-        <w:rPr>
-          <w:rStyle w:val="VerbatimChar"/>
-        </w:rPr>
-        <w:t xml:space="preserve">icjia.illinois.gov/researchhub/</w:t>
-      </w:r>
+      <w:hyperlink r:id="rId11">
+        <w:r>
+          <w:rPr>
+            <w:rStyle w:val="VerbatimChar"/>
+          </w:rPr>
+          <w:t xml:space="preserve">icjia.illinois.gov/researchhub/</w:t>
+        </w:r>
+      </w:hyperlink>
       <w:r>
         <w:t xml:space="preserve"> </w:t>
       </w:r>
@@ -1695,8 +1697,8 @@
         <w:t xml:space="preserve">The 2019 frontend stack (Vue 2 / Vuetify era) is itself at end-of-support, slow by modern standards, and increasingly hard to hire for or maintain.</w:t>
       </w:r>
     </w:p>
-    <w:bookmarkEnd w:id="11"/>
-    <w:bookmarkStart w:id="12" w:name="Xfb4eabddbe3f1d08b21a183f16495ef0ce2a521"/>
+    <w:bookmarkEnd w:id="12"/>
+    <w:bookmarkStart w:id="17" w:name="Xfb4eabddbe3f1d08b21a183f16495ef0ce2a521"/>
     <w:p>
       <w:pPr>
         <w:pStyle w:val="Heading2"/>
@@ -1783,12 +1785,14 @@
             <w:r>
               <w:t xml:space="preserve">(</w:t>
             </w:r>
-            <w:r>
-              <w:rPr>
-                <w:rStyle w:val="VerbatimChar"/>
-              </w:rPr>
-              <w:t xml:space="preserve">hub-migration-tools</w:t>
-            </w:r>
+            <w:hyperlink r:id="rId13">
+              <w:r>
+                <w:rPr>
+                  <w:rStyle w:val="VerbatimChar"/>
+                </w:rPr>
+                <w:t xml:space="preserve">hub-migration-tools</w:t>
+              </w:r>
+            </w:hyperlink>
             <w:r>
               <w:t xml:space="preserve">, v4.1)</w:t>
             </w:r>
@@ -1863,12 +1867,14 @@
             <w:r>
               <w:t xml:space="preserve">(</w:t>
             </w:r>
-            <w:r>
-              <w:rPr>
-                <w:rStyle w:val="VerbatimChar"/>
-              </w:rPr>
-              <w:t xml:space="preserve">hub-studio-2026</w:t>
-            </w:r>
+            <w:hyperlink r:id="rId14">
+              <w:r>
+                <w:rPr>
+                  <w:rStyle w:val="VerbatimChar"/>
+                </w:rPr>
+                <w:t xml:space="preserve">hub-studio-2026</w:t>
+              </w:r>
+            </w:hyperlink>
             <w:r>
               <w:t xml:space="preserve">)</w:t>
             </w:r>
@@ -1940,12 +1946,14 @@
             <w:r>
               <w:t xml:space="preserve">(</w:t>
             </w:r>
-            <w:r>
-              <w:rPr>
-                <w:rStyle w:val="VerbatimChar"/>
-              </w:rPr>
-              <w:t xml:space="preserve">v2-hub-demo</w:t>
-            </w:r>
+            <w:hyperlink r:id="rId15">
+              <w:r>
+                <w:rPr>
+                  <w:rStyle w:val="VerbatimChar"/>
+                </w:rPr>
+                <w:t xml:space="preserve">v2-hub-demo</w:t>
+              </w:r>
+            </w:hyperlink>
             <w:r>
               <w:t xml:space="preserve">)</w:t>
             </w:r>
@@ -1985,37 +1993,39 @@
       <w:r>
         <w:t xml:space="preserve"> </w:t>
       </w:r>
-      <w:r>
-        <w:rPr>
-          <w:rStyle w:val="VerbatimChar"/>
+      <w:hyperlink r:id="rId16">
+        <w:r>
+          <w:rPr>
+            <w:rStyle w:val="VerbatimChar"/>
+            <w:b/>
+            <w:bCs/>
+          </w:rPr>
+          <w:t xml:space="preserve">@icjia/pdf-search-index</w:t>
+        </w:r>
+      </w:hyperlink>
+      <w:r>
+        <w:t xml:space="preserve">, an in-house package that extracts searchable text from PDF/Word/Excel documents at build time, with a first-party Nuxt 4 integration — replaces the most fragile subsystem of the unfinished rewrite (see Section 5).</w:t>
+      </w:r>
+    </w:p>
+    <w:bookmarkEnd w:id="17"/>
+    <w:bookmarkStart w:id="19" w:name="Xfbd16643e4b85070e07d15573167010e730de97"/>
+    <w:p>
+      <w:pPr>
+        <w:pStyle w:val="Heading2"/>
+      </w:pPr>
+      <w:r>
+        <w:t xml:space="preserve">5. The unfinished rewrite: what it is, what it includes, what it doesn’t</w:t>
+      </w:r>
+    </w:p>
+    <w:p>
+      <w:pPr>
+        <w:pStyle w:val="FirstParagraph"/>
+      </w:pPr>
+      <w:r>
+        <w:rPr>
           <w:b/>
           <w:bCs/>
         </w:rPr>
-        <w:t xml:space="preserve">@icjia/pdf-search-index</w:t>
-      </w:r>
-      <w:r>
-        <w:t xml:space="preserve">, an in-house package that extracts searchable text from PDF/Word/Excel documents at build time, with a first-party Nuxt 4 integration — replaces the most fragile subsystem of the unfinished rewrite (see Section 5).</w:t>
-      </w:r>
-    </w:p>
-    <w:bookmarkEnd w:id="12"/>
-    <w:bookmarkStart w:id="13" w:name="Xfbd16643e4b85070e07d15573167010e730de97"/>
-    <w:p>
-      <w:pPr>
-        <w:pStyle w:val="Heading2"/>
-      </w:pPr>
-      <w:r>
-        <w:t xml:space="preserve">5. The unfinished rewrite: what it is, what it includes, what it doesn’t</w:t>
-      </w:r>
-    </w:p>
-    <w:p>
-      <w:pPr>
-        <w:pStyle w:val="FirstParagraph"/>
-      </w:pPr>
-      <w:r>
-        <w:rPr>
-          <w:b/>
-          <w:bCs/>
-        </w:rPr>
         <w:t xml:space="preserve">Shape of the effort.</w:t>
       </w:r>
       <w:r>
@@ -2027,12 +2037,14 @@
       <w:r>
         <w:t xml:space="preserve"> </w:t>
       </w:r>
-      <w:r>
-        <w:rPr>
-          <w:rStyle w:val="VerbatimChar"/>
-        </w:rPr>
-        <w:t xml:space="preserve">ICJIA/hub-frontend</w:t>
-      </w:r>
+      <w:hyperlink r:id="rId18">
+        <w:r>
+          <w:rPr>
+            <w:rStyle w:val="VerbatimChar"/>
+          </w:rPr>
+          <w:t xml:space="preserve">ICJIA/hub-frontend</w:t>
+        </w:r>
+      </w:hyperlink>
       <w:r>
         <w:t xml:space="preserve">, created March 17, 2026; last activity July 8, 2026; ~55 pull requests over about four months. It is a Nuxt 4 + Nuxt UI application — the same stack this plan recommends. We analyzed the complete repository snapshot (~12,000 lines across 98 files) file-by-file; the full defect inventory is Appendix A.</w:t>
       </w:r>
@@ -2680,8 +2692,8 @@
         <w:t xml:space="preserve">archive it read-only on GitHub as reference material, extract the salvage list (Section 6), and rotate every secret it ever touched.</w:t>
       </w:r>
     </w:p>
-    <w:bookmarkEnd w:id="13"/>
-    <w:bookmarkStart w:id="14" w:name="Xb0f41b7d0b4b936e232757f1eba73f5d1f6bc77"/>
+    <w:bookmarkEnd w:id="19"/>
+    <w:bookmarkStart w:id="20" w:name="Xb0f41b7d0b4b936e232757f1eba73f5d1f6bc77"/>
     <w:p>
       <w:pPr>
         <w:pStyle w:val="Heading2"/>
@@ -2999,8 +3011,8 @@
         <w:t xml:space="preserve">, Quill/Turndown editor stack).</w:t>
       </w:r>
     </w:p>
-    <w:bookmarkEnd w:id="14"/>
-    <w:bookmarkStart w:id="15" w:name="X4387035572670e7844f3e099942cf73a48bc328"/>
+    <w:bookmarkEnd w:id="20"/>
+    <w:bookmarkStart w:id="23" w:name="X4387035572670e7844f3e099942cf73a48bc328"/>
     <w:p>
       <w:pPr>
         <w:pStyle w:val="Heading2"/>
@@ -3174,6 +3186,387 @@
         <w:t xml:space="preserve">— foundations → content layer → parity pages → search &amp; filtering → SEO/URL verification → hardening &amp; launch — each with public exit criteria (Section 9). Indicatively 8–11 focused weeks; assumptions and risks in Sections 9–10.</w:t>
       </w:r>
     </w:p>
+    <w:bookmarkStart w:id="21" w:name="so-what-exactly-has-to-be-done"/>
+    <w:p>
+      <w:pPr>
+        <w:pStyle w:val="Heading3"/>
+      </w:pPr>
+      <w:r>
+        <w:t xml:space="preserve">So, what exactly has to be done?</w:t>
+      </w:r>
+    </w:p>
+    <w:p>
+      <w:pPr>
+        <w:pStyle w:val="FirstParagraph"/>
+      </w:pPr>
+      <w:r>
+        <w:t xml:space="preserve">The same roadmap in plain English — the answer to</w:t>
+      </w:r>
+      <w:r>
+        <w:t xml:space="preserve"> </w:t>
+      </w:r>
+      <w:r>
+        <w:t xml:space="preserve">“what will you actually be doing for those weeks?”</w:t>
+      </w:r>
+      <w:r>
+        <w:t xml:space="preserve">:</w:t>
+      </w:r>
+    </w:p>
+    <w:p>
+      <w:pPr>
+        <w:pStyle w:val="Compact"/>
+        <w:numPr>
+          <w:ilvl w:val="0"/>
+          <w:numId w:val="1013"/>
+        </w:numPr>
+      </w:pPr>
+      <w:r>
+        <w:rPr>
+          <w:b/>
+          <w:bCs/>
+        </w:rPr>
+        <w:t xml:space="preserve">Set up the foundations (Phase 0, about a week).</w:t>
+      </w:r>
+      <w:r>
+        <w:t xml:space="preserve"> </w:t>
+      </w:r>
+      <w:r>
+        <w:t xml:space="preserve">Create the new application shell and its hosting, and wire in the automated quality checks — code standards, tests, accessibility — so that from the first week, nothing can be added to Copperhead that fails them. A private preview web address exists from day one; every phase after this ends with something you can click and review there.</w:t>
+      </w:r>
+    </w:p>
+    <w:p>
+      <w:pPr>
+        <w:pStyle w:val="Compact"/>
+        <w:numPr>
+          <w:ilvl w:val="0"/>
+          <w:numId w:val="1013"/>
+        </w:numPr>
+      </w:pPr>
+      <w:r>
+        <w:rPr>
+          <w:b/>
+          <w:bCs/>
+        </w:rPr>
+        <w:t xml:space="preserve">Teach it to read our content (Phase 1, 1–1.5 weeks).</w:t>
+      </w:r>
+      <w:r>
+        <w:t xml:space="preserve"> </w:t>
+      </w:r>
+      <w:r>
+        <w:t xml:space="preserve">Connect Copperhead to the new Strapi 5 content database and build, with tests, the machinery that turns stored articles into web-ready pages. Everything else sits on this layer, so it is built carefully and first.</w:t>
+      </w:r>
+    </w:p>
+    <w:p>
+      <w:pPr>
+        <w:pStyle w:val="Compact"/>
+        <w:numPr>
+          <w:ilvl w:val="0"/>
+          <w:numId w:val="1013"/>
+        </w:numPr>
+      </w:pPr>
+      <w:r>
+        <w:rPr>
+          <w:b/>
+          <w:bCs/>
+        </w:rPr>
+        <w:t xml:space="preserve">Rebuild every page type (Phase 2, 2–3 weeks — the largest block).</w:t>
+      </w:r>
+      <w:r>
+        <w:t xml:space="preserve"> </w:t>
+      </w:r>
+      <w:r>
+        <w:t xml:space="preserve">Hub home, the article page with all of its anatomy (table of contents, downloads, citations, author biographies, funding notes, related content), dataset and dashboard pages, listings, and the small standalone pages. This is where the Figma designs get applied.</w:t>
+      </w:r>
+    </w:p>
+    <w:p>
+      <w:pPr>
+        <w:pStyle w:val="Compact"/>
+        <w:numPr>
+          <w:ilvl w:val="0"/>
+          <w:numId w:val="1013"/>
+        </w:numPr>
+      </w:pPr>
+      <w:r>
+        <w:rPr>
+          <w:b/>
+          <w:bCs/>
+        </w:rPr>
+        <w:t xml:space="preserve">Add search and filtering (Phase 3, 1–2 weeks).</w:t>
+      </w:r>
+      <w:r>
+        <w:t xml:space="preserve"> </w:t>
+      </w:r>
+      <w:r>
+        <w:t xml:space="preserve">The filtering experience stakeholders already reviewed in the live demo — one-click research reports, highlighted matches, author names — plus search that finds words</w:t>
+      </w:r>
+      <w:r>
+        <w:t xml:space="preserve"> </w:t>
+      </w:r>
+      <w:r>
+        <w:rPr>
+          <w:i/>
+          <w:iCs/>
+        </w:rPr>
+        <w:t xml:space="preserve">inside</w:t>
+      </w:r>
+      <w:r>
+        <w:t xml:space="preserve"> </w:t>
+      </w:r>
+      <w:r>
+        <w:t xml:space="preserve">published PDFs and spreadsheets.</w:t>
+      </w:r>
+    </w:p>
+    <w:p>
+      <w:pPr>
+        <w:pStyle w:val="Compact"/>
+        <w:numPr>
+          <w:ilvl w:val="0"/>
+          <w:numId w:val="1013"/>
+        </w:numPr>
+      </w:pPr>
+      <w:r>
+        <w:rPr>
+          <w:b/>
+          <w:bCs/>
+        </w:rPr>
+        <w:t xml:space="preserve">Prove nothing breaks (Phase 4, about a week).</w:t>
+      </w:r>
+      <w:r>
+        <w:t xml:space="preserve"> </w:t>
+      </w:r>
+      <w:r>
+        <w:t xml:space="preserve">Generate everything search engines need (sitemap, scholarly metadata), set up analytics, and run the automated check that</w:t>
+      </w:r>
+      <w:r>
+        <w:t xml:space="preserve"> </w:t>
+      </w:r>
+      <w:r>
+        <w:rPr>
+          <w:b/>
+          <w:bCs/>
+        </w:rPr>
+        <w:t xml:space="preserve">every one of the 266 existing Hub addresses</w:t>
+      </w:r>
+      <w:r>
+        <w:t xml:space="preserve"> </w:t>
+      </w:r>
+      <w:r>
+        <w:t xml:space="preserve">works on the new site. This check is the launch gate.</w:t>
+      </w:r>
+    </w:p>
+    <w:p>
+      <w:pPr>
+        <w:pStyle w:val="Compact"/>
+        <w:numPr>
+          <w:ilvl w:val="0"/>
+          <w:numId w:val="1013"/>
+        </w:numPr>
+      </w:pPr>
+      <w:r>
+        <w:rPr>
+          <w:b/>
+          <w:bCs/>
+        </w:rPr>
+        <w:t xml:space="preserve">Harden, then launch (Phases 5–6, about two weeks).</w:t>
+      </w:r>
+      <w:r>
+        <w:t xml:space="preserve"> </w:t>
+      </w:r>
+      <w:r>
+        <w:t xml:space="preserve">Full accessibility and performance audits, documentation, credential rotation, a short content freeze with a final content sync — then the cutover: the main website starts passing</w:t>
+      </w:r>
+      <w:r>
+        <w:t xml:space="preserve"> </w:t>
+      </w:r>
+      <w:r>
+        <w:rPr>
+          <w:rStyle w:val="VerbatimChar"/>
+        </w:rPr>
+        <w:t xml:space="preserve">/researchhub/</w:t>
+      </w:r>
+      <w:r>
+        <w:t xml:space="preserve"> </w:t>
+      </w:r>
+      <w:r>
+        <w:t xml:space="preserve">traffic to Copperhead. Rollback is a one-line change, so launch risk stays small. Afterward, the old Hub code is removed from the main website.</w:t>
+      </w:r>
+    </w:p>
+    <w:bookmarkEnd w:id="21"/>
+    <w:bookmarkStart w:id="22" w:name="what-we-need-from-leadership"/>
+    <w:p>
+      <w:pPr>
+        <w:pStyle w:val="Heading3"/>
+      </w:pPr>
+      <w:r>
+        <w:t xml:space="preserve">What we need from leadership</w:t>
+      </w:r>
+    </w:p>
+    <w:p>
+      <w:pPr>
+        <w:pStyle w:val="FirstParagraph"/>
+      </w:pPr>
+      <w:r>
+        <w:t xml:space="preserve">Managers will reasonably ask</w:t>
+      </w:r>
+      <w:r>
+        <w:t xml:space="preserve"> </w:t>
+      </w:r>
+      <w:r>
+        <w:t xml:space="preserve">“what do you need from</w:t>
+      </w:r>
+      <w:r>
+        <w:t xml:space="preserve"> </w:t>
+      </w:r>
+      <w:r>
+        <w:rPr>
+          <w:i/>
+          <w:iCs/>
+        </w:rPr>
+        <w:t xml:space="preserve">us</w:t>
+      </w:r>
+      <w:r>
+        <w:t xml:space="preserve">?”</w:t>
+      </w:r>
+      <w:r>
+        <w:t xml:space="preserve"> </w:t>
+      </w:r>
+      <w:r>
+        <w:t xml:space="preserve">Five things:</w:t>
+      </w:r>
+    </w:p>
+    <w:p>
+      <w:pPr>
+        <w:pStyle w:val="Compact"/>
+        <w:numPr>
+          <w:ilvl w:val="0"/>
+          <w:numId w:val="1014"/>
+        </w:numPr>
+      </w:pPr>
+      <w:r>
+        <w:rPr>
+          <w:b/>
+          <w:bCs/>
+        </w:rPr>
+        <w:t xml:space="preserve">A scope confirmation before Phase 2:</w:t>
+      </w:r>
+      <w:r>
+        <w:t xml:space="preserve"> </w:t>
+      </w:r>
+      <w:r>
+        <w:t xml:space="preserve">launch with the new Centers and Projects pages included (adds roughly one week), or add them shortly after launch. Either is fine; it just needs deciding once.</w:t>
+      </w:r>
+    </w:p>
+    <w:p>
+      <w:pPr>
+        <w:pStyle w:val="Compact"/>
+        <w:numPr>
+          <w:ilvl w:val="0"/>
+          <w:numId w:val="1014"/>
+        </w:numPr>
+      </w:pPr>
+      <w:r>
+        <w:rPr>
+          <w:b/>
+          <w:bCs/>
+        </w:rPr>
+        <w:t xml:space="preserve">Design review availability during Phase 2</w:t>
+      </w:r>
+      <w:r>
+        <w:t xml:space="preserve"> </w:t>
+      </w:r>
+      <w:r>
+        <w:t xml:space="preserve">— short, prompt Figma sign-offs so page-building doesn’t stall waiting on approvals.</w:t>
+      </w:r>
+    </w:p>
+    <w:p>
+      <w:pPr>
+        <w:pStyle w:val="Compact"/>
+        <w:numPr>
+          <w:ilvl w:val="0"/>
+          <w:numId w:val="1014"/>
+        </w:numPr>
+      </w:pPr>
+      <w:r>
+        <w:rPr>
+          <w:b/>
+          <w:bCs/>
+        </w:rPr>
+        <w:t xml:space="preserve">A content-freeze window near launch</w:t>
+      </w:r>
+      <w:r>
+        <w:t xml:space="preserve"> </w:t>
+      </w:r>
+      <w:r>
+        <w:t xml:space="preserve">— roughly 2–3 business days when R&amp;A holds new publications while the final sync and cutover happen (rehearsed in Phase 5, used in Phase 6).</w:t>
+      </w:r>
+    </w:p>
+    <w:p>
+      <w:pPr>
+        <w:pStyle w:val="Compact"/>
+        <w:numPr>
+          <w:ilvl w:val="0"/>
+          <w:numId w:val="1014"/>
+        </w:numPr>
+      </w:pPr>
+      <w:r>
+        <w:rPr>
+          <w:b/>
+          <w:bCs/>
+        </w:rPr>
+        <w:t xml:space="preserve">Coordination with the main-website deployment</w:t>
+      </w:r>
+      <w:r>
+        <w:t xml:space="preserve"> </w:t>
+      </w:r>
+      <w:r>
+        <w:t xml:space="preserve">for the one-time switch that routes</w:t>
+      </w:r>
+      <w:r>
+        <w:t xml:space="preserve"> </w:t>
+      </w:r>
+      <w:r>
+        <w:rPr>
+          <w:rStyle w:val="VerbatimChar"/>
+        </w:rPr>
+        <w:t xml:space="preserve">/researchhub/</w:t>
+      </w:r>
+      <w:r>
+        <w:t xml:space="preserve"> </w:t>
+      </w:r>
+      <w:r>
+        <w:t xml:space="preserve">traffic to Copperhead (and a fallback owner identified, though rollback is trivial).</w:t>
+      </w:r>
+    </w:p>
+    <w:p>
+      <w:pPr>
+        <w:pStyle w:val="Compact"/>
+        <w:numPr>
+          <w:ilvl w:val="0"/>
+          <w:numId w:val="1014"/>
+        </w:numPr>
+      </w:pPr>
+      <w:r>
+        <w:rPr>
+          <w:b/>
+          <w:bCs/>
+        </w:rPr>
+        <w:t xml:space="preserve">Agreement that the Success Criteria at the end of Part II are the launch gate</w:t>
+      </w:r>
+      <w:r>
+        <w:t xml:space="preserve"> </w:t>
+      </w:r>
+      <w:r>
+        <w:t xml:space="preserve">— Copperhead ships when every box is checked, and isn’t held past that for additions that can come later.</w:t>
+      </w:r>
+    </w:p>
+    <w:p>
+      <w:pPr>
+        <w:pStyle w:val="FirstParagraph"/>
+      </w:pPr>
+      <w:r>
+        <w:t xml:space="preserve">Beyond those: one developer’s focused time for the 8–11 weeks, and nothing else — no new infrastructure purchases, no additional licenses (the hosting and analytics accounts already exist).</w:t>
+      </w:r>
+    </w:p>
     <w:p>
       <w:r>
         <w:pict>
@@ -3181,9 +3574,10 @@
         </w:pict>
       </w:r>
     </w:p>
-    <w:bookmarkEnd w:id="15"/>
-    <w:bookmarkEnd w:id="16"/>
-    <w:bookmarkStart w:id="21" w:name="part-ii--for-developers"/>
+    <w:bookmarkEnd w:id="22"/>
+    <w:bookmarkEnd w:id="23"/>
+    <w:bookmarkEnd w:id="24"/>
+    <w:bookmarkStart w:id="29" w:name="part-ii--for-developers"/>
     <w:p>
       <w:pPr>
         <w:pStyle w:val="Heading1"/>
@@ -3192,7 +3586,7 @@
         <w:t xml:space="preserve">Part II — For Developers</w:t>
       </w:r>
     </w:p>
-    <w:bookmarkStart w:id="17" w:name="X4b376c53ac9bb35d3714f3533f5dac60661a280"/>
+    <w:bookmarkStart w:id="25" w:name="X4b376c53ac9bb35d3714f3533f5dac60661a280"/>
     <w:p>
       <w:pPr>
         <w:pStyle w:val="Heading2"/>
@@ -3856,8 +4250,8 @@
         <w:t xml:space="preserve">actually committed.</w:t>
       </w:r>
     </w:p>
-    <w:bookmarkEnd w:id="17"/>
-    <w:bookmarkStart w:id="18" w:name="X065bc66d7a523af6e74bfea16eff29096c841b1"/>
+    <w:bookmarkEnd w:id="25"/>
+    <w:bookmarkStart w:id="26" w:name="X065bc66d7a523af6e74bfea16eff29096c841b1"/>
     <w:p>
       <w:pPr>
         <w:pStyle w:val="Heading2"/>
@@ -4424,8 +4818,8 @@
         <w:t xml:space="preserve">Centers/Projects pages (Hub 2.0 additions already modeled in Strapi 5 and present in the unfinished app) are a scope decision to confirm before Phase 2; they fit inside the same template system at roughly +1 week if included at launch.</w:t>
       </w:r>
     </w:p>
-    <w:bookmarkEnd w:id="18"/>
-    <w:bookmarkStart w:id="19" w:name="Xd23567b368629d7d6e369ba0946f4da9ea6a469"/>
+    <w:bookmarkEnd w:id="26"/>
+    <w:bookmarkStart w:id="27" w:name="Xd23567b368629d7d6e369ba0946f4da9ea6a469"/>
     <w:p>
       <w:pPr>
         <w:pStyle w:val="Heading2"/>
@@ -4756,8 +5150,8 @@
         </w:tc>
       </w:tr>
     </w:tbl>
-    <w:bookmarkEnd w:id="19"/>
-    <w:bookmarkStart w:id="20" w:name="success-criteria-definition-of-done"/>
+    <w:bookmarkEnd w:id="27"/>
+    <w:bookmarkStart w:id="28" w:name="success-criteria-definition-of-done"/>
     <w:p>
       <w:pPr>
         <w:pStyle w:val="Heading2"/>
@@ -4771,7 +5165,7 @@
         <w:pStyle w:val="Compact"/>
         <w:numPr>
           <w:ilvl w:val="0"/>
-          <w:numId w:val="1013"/>
+          <w:numId w:val="1015"/>
         </w:numPr>
       </w:pPr>
       <w:r>
@@ -4793,7 +5187,7 @@
         <w:pStyle w:val="Compact"/>
         <w:numPr>
           <w:ilvl w:val="0"/>
-          <w:numId w:val="1013"/>
+          <w:numId w:val="1015"/>
         </w:numPr>
       </w:pPr>
       <w:r>
@@ -4815,7 +5209,7 @@
         <w:pStyle w:val="Compact"/>
         <w:numPr>
           <w:ilvl w:val="0"/>
-          <w:numId w:val="1013"/>
+          <w:numId w:val="1015"/>
         </w:numPr>
       </w:pPr>
       <w:r>
@@ -4837,7 +5231,7 @@
         <w:pStyle w:val="Compact"/>
         <w:numPr>
           <w:ilvl w:val="0"/>
-          <w:numId w:val="1013"/>
+          <w:numId w:val="1015"/>
         </w:numPr>
       </w:pPr>
       <w:r>
@@ -4859,7 +5253,7 @@
         <w:pStyle w:val="Compact"/>
         <w:numPr>
           <w:ilvl w:val="0"/>
-          <w:numId w:val="1013"/>
+          <w:numId w:val="1015"/>
         </w:numPr>
       </w:pPr>
       <w:r>
@@ -4909,7 +5303,7 @@
         <w:pStyle w:val="Compact"/>
         <w:numPr>
           <w:ilvl w:val="0"/>
-          <w:numId w:val="1013"/>
+          <w:numId w:val="1015"/>
         </w:numPr>
       </w:pPr>
       <w:r>
@@ -4931,7 +5325,7 @@
         <w:pStyle w:val="Compact"/>
         <w:numPr>
           <w:ilvl w:val="0"/>
-          <w:numId w:val="1013"/>
+          <w:numId w:val="1015"/>
         </w:numPr>
       </w:pPr>
       <w:r>
@@ -4953,7 +5347,7 @@
         <w:pStyle w:val="Compact"/>
         <w:numPr>
           <w:ilvl w:val="0"/>
-          <w:numId w:val="1013"/>
+          <w:numId w:val="1015"/>
         </w:numPr>
       </w:pPr>
       <w:r>
@@ -4977,9 +5371,9 @@
         </w:pict>
       </w:r>
     </w:p>
-    <w:bookmarkEnd w:id="20"/>
-    <w:bookmarkEnd w:id="21"/>
-    <w:bookmarkStart w:id="27" w:name="X33da7a9887db7dca18403af2801a6c421349e58"/>
+    <w:bookmarkEnd w:id="28"/>
+    <w:bookmarkEnd w:id="29"/>
+    <w:bookmarkStart w:id="35" w:name="X33da7a9887db7dca18403af2801a6c421349e58"/>
     <w:p>
       <w:pPr>
         <w:pStyle w:val="Heading1"/>
@@ -5037,7 +5431,7 @@
         <w:t xml:space="preserve">(of ~55 catalogued) follow, grouped by theme. File references are to repository paths.</w:t>
       </w:r>
     </w:p>
-    <w:bookmarkStart w:id="22" w:name="a1-security--major"/>
+    <w:bookmarkStart w:id="30" w:name="a1-security--major"/>
     <w:p>
       <w:pPr>
         <w:pStyle w:val="Heading2"/>
@@ -5970,8 +6364,8 @@
         </w:tc>
       </w:tr>
     </w:tbl>
-    <w:bookmarkEnd w:id="22"/>
-    <w:bookmarkStart w:id="23" w:name="a2-architecture--major"/>
+    <w:bookmarkEnd w:id="30"/>
+    <w:bookmarkStart w:id="31" w:name="a2-architecture--major"/>
     <w:p>
       <w:pPr>
         <w:pStyle w:val="Heading2"/>
@@ -6852,8 +7246,8 @@
         </w:tc>
       </w:tr>
     </w:tbl>
-    <w:bookmarkEnd w:id="23"/>
-    <w:bookmarkStart w:id="24" w:name="a3-correctness--parity--major"/>
+    <w:bookmarkEnd w:id="31"/>
+    <w:bookmarkStart w:id="32" w:name="a3-correctness--parity--major"/>
     <w:p>
       <w:pPr>
         <w:pStyle w:val="Heading2"/>
@@ -7541,8 +7935,8 @@
         </w:tc>
       </w:tr>
     </w:tbl>
-    <w:bookmarkEnd w:id="24"/>
-    <w:bookmarkStart w:id="25" w:name="a4-quality-accessibility-process--major"/>
+    <w:bookmarkEnd w:id="32"/>
+    <w:bookmarkStart w:id="33" w:name="a4-quality-accessibility-process--major"/>
     <w:p>
       <w:pPr>
         <w:pStyle w:val="Heading2"/>
@@ -8127,8 +8521,8 @@
         </w:tc>
       </w:tr>
     </w:tbl>
-    <w:bookmarkEnd w:id="25"/>
-    <w:bookmarkStart w:id="26" w:name="a5-minor-defects-curated-30"/>
+    <w:bookmarkEnd w:id="33"/>
+    <w:bookmarkStart w:id="34" w:name="a5-minor-defects-curated-30"/>
     <w:p>
       <w:pPr>
         <w:pStyle w:val="Heading2"/>
@@ -8142,7 +8536,7 @@
         <w:pStyle w:val="Compact"/>
         <w:numPr>
           <w:ilvl w:val="0"/>
-          <w:numId w:val="1014"/>
+          <w:numId w:val="1016"/>
         </w:numPr>
       </w:pPr>
       <w:r>
@@ -8178,7 +8572,7 @@
         <w:pStyle w:val="Compact"/>
         <w:numPr>
           <w:ilvl w:val="0"/>
-          <w:numId w:val="1014"/>
+          <w:numId w:val="1016"/>
         </w:numPr>
       </w:pPr>
       <w:r>
@@ -8220,7 +8614,7 @@
         <w:pStyle w:val="Compact"/>
         <w:numPr>
           <w:ilvl w:val="0"/>
-          <w:numId w:val="1014"/>
+          <w:numId w:val="1016"/>
         </w:numPr>
       </w:pPr>
       <w:r>
@@ -8262,7 +8656,7 @@
         <w:pStyle w:val="Compact"/>
         <w:numPr>
           <w:ilvl w:val="0"/>
-          <w:numId w:val="1014"/>
+          <w:numId w:val="1016"/>
         </w:numPr>
       </w:pPr>
       <w:r>
@@ -8274,7 +8668,7 @@
         <w:pStyle w:val="Compact"/>
         <w:numPr>
           <w:ilvl w:val="0"/>
-          <w:numId w:val="1014"/>
+          <w:numId w:val="1016"/>
         </w:numPr>
       </w:pPr>
       <w:r>
@@ -8286,7 +8680,7 @@
         <w:pStyle w:val="Compact"/>
         <w:numPr>
           <w:ilvl w:val="0"/>
-          <w:numId w:val="1014"/>
+          <w:numId w:val="1016"/>
         </w:numPr>
       </w:pPr>
       <w:r>
@@ -8349,7 +8743,7 @@
         <w:pStyle w:val="Compact"/>
         <w:numPr>
           <w:ilvl w:val="0"/>
-          <w:numId w:val="1014"/>
+          <w:numId w:val="1016"/>
         </w:numPr>
       </w:pPr>
       <w:r>
@@ -8394,7 +8788,7 @@
         <w:pStyle w:val="Compact"/>
         <w:numPr>
           <w:ilvl w:val="0"/>
-          <w:numId w:val="1014"/>
+          <w:numId w:val="1016"/>
         </w:numPr>
       </w:pPr>
       <w:r>
@@ -8406,7 +8800,7 @@
         <w:pStyle w:val="Compact"/>
         <w:numPr>
           <w:ilvl w:val="0"/>
-          <w:numId w:val="1014"/>
+          <w:numId w:val="1016"/>
         </w:numPr>
       </w:pPr>
       <w:r>
@@ -8448,7 +8842,7 @@
         <w:pStyle w:val="Compact"/>
         <w:numPr>
           <w:ilvl w:val="0"/>
-          <w:numId w:val="1014"/>
+          <w:numId w:val="1016"/>
         </w:numPr>
       </w:pPr>
       <w:r>
@@ -8487,7 +8881,7 @@
         <w:pStyle w:val="Compact"/>
         <w:numPr>
           <w:ilvl w:val="0"/>
-          <w:numId w:val="1014"/>
+          <w:numId w:val="1016"/>
         </w:numPr>
       </w:pPr>
       <w:r>
@@ -8499,7 +8893,7 @@
         <w:pStyle w:val="Compact"/>
         <w:numPr>
           <w:ilvl w:val="0"/>
-          <w:numId w:val="1014"/>
+          <w:numId w:val="1016"/>
         </w:numPr>
       </w:pPr>
       <w:r>
@@ -8517,7 +8911,7 @@
         <w:pStyle w:val="Compact"/>
         <w:numPr>
           <w:ilvl w:val="0"/>
-          <w:numId w:val="1014"/>
+          <w:numId w:val="1016"/>
         </w:numPr>
       </w:pPr>
       <w:r>
@@ -8529,7 +8923,7 @@
         <w:pStyle w:val="Compact"/>
         <w:numPr>
           <w:ilvl w:val="0"/>
-          <w:numId w:val="1014"/>
+          <w:numId w:val="1016"/>
         </w:numPr>
       </w:pPr>
       <w:r>
@@ -8559,7 +8953,7 @@
         <w:pStyle w:val="Compact"/>
         <w:numPr>
           <w:ilvl w:val="0"/>
-          <w:numId w:val="1014"/>
+          <w:numId w:val="1016"/>
         </w:numPr>
       </w:pPr>
       <w:r>
@@ -8586,7 +8980,7 @@
         <w:pStyle w:val="Compact"/>
         <w:numPr>
           <w:ilvl w:val="0"/>
-          <w:numId w:val="1014"/>
+          <w:numId w:val="1016"/>
         </w:numPr>
       </w:pPr>
       <w:r>
@@ -8598,7 +8992,7 @@
         <w:pStyle w:val="Compact"/>
         <w:numPr>
           <w:ilvl w:val="0"/>
-          <w:numId w:val="1014"/>
+          <w:numId w:val="1016"/>
         </w:numPr>
       </w:pPr>
       <w:r>
@@ -8622,7 +9016,7 @@
         <w:pStyle w:val="Compact"/>
         <w:numPr>
           <w:ilvl w:val="0"/>
-          <w:numId w:val="1014"/>
+          <w:numId w:val="1016"/>
         </w:numPr>
       </w:pPr>
       <w:r>
@@ -8643,7 +9037,7 @@
         <w:pStyle w:val="Compact"/>
         <w:numPr>
           <w:ilvl w:val="0"/>
-          <w:numId w:val="1014"/>
+          <w:numId w:val="1016"/>
         </w:numPr>
       </w:pPr>
       <w:r>
@@ -8655,7 +9049,7 @@
         <w:pStyle w:val="Compact"/>
         <w:numPr>
           <w:ilvl w:val="0"/>
-          <w:numId w:val="1014"/>
+          <w:numId w:val="1016"/>
         </w:numPr>
       </w:pPr>
       <w:r>
@@ -8691,7 +9085,7 @@
         <w:pStyle w:val="Compact"/>
         <w:numPr>
           <w:ilvl w:val="0"/>
-          <w:numId w:val="1014"/>
+          <w:numId w:val="1016"/>
         </w:numPr>
       </w:pPr>
       <w:r>
@@ -8724,7 +9118,7 @@
         <w:pStyle w:val="Compact"/>
         <w:numPr>
           <w:ilvl w:val="0"/>
-          <w:numId w:val="1014"/>
+          <w:numId w:val="1016"/>
         </w:numPr>
       </w:pPr>
       <w:r>
@@ -8763,7 +9157,7 @@
         <w:pStyle w:val="Compact"/>
         <w:numPr>
           <w:ilvl w:val="0"/>
-          <w:numId w:val="1014"/>
+          <w:numId w:val="1016"/>
         </w:numPr>
       </w:pPr>
       <w:r>
@@ -8784,7 +9178,7 @@
         <w:pStyle w:val="Compact"/>
         <w:numPr>
           <w:ilvl w:val="0"/>
-          <w:numId w:val="1014"/>
+          <w:numId w:val="1016"/>
         </w:numPr>
       </w:pPr>
       <w:r>
@@ -8820,7 +9214,7 @@
         <w:pStyle w:val="Compact"/>
         <w:numPr>
           <w:ilvl w:val="0"/>
-          <w:numId w:val="1014"/>
+          <w:numId w:val="1016"/>
         </w:numPr>
       </w:pPr>
       <w:r>
@@ -8859,7 +9253,7 @@
         <w:pStyle w:val="Compact"/>
         <w:numPr>
           <w:ilvl w:val="0"/>
-          <w:numId w:val="1014"/>
+          <w:numId w:val="1016"/>
         </w:numPr>
       </w:pPr>
       <w:r>
@@ -8895,7 +9289,7 @@
         <w:pStyle w:val="Compact"/>
         <w:numPr>
           <w:ilvl w:val="0"/>
-          <w:numId w:val="1014"/>
+          <w:numId w:val="1016"/>
         </w:numPr>
       </w:pPr>
       <w:r>
@@ -8916,7 +9310,7 @@
         <w:pStyle w:val="Compact"/>
         <w:numPr>
           <w:ilvl w:val="0"/>
-          <w:numId w:val="1014"/>
+          <w:numId w:val="1016"/>
         </w:numPr>
       </w:pPr>
       <w:r>
@@ -8988,7 +9382,7 @@
         <w:pStyle w:val="Compact"/>
         <w:numPr>
           <w:ilvl w:val="0"/>
-          <w:numId w:val="1014"/>
+          <w:numId w:val="1016"/>
         </w:numPr>
       </w:pPr>
       <w:r>
@@ -9015,7 +9409,7 @@
         <w:pStyle w:val="Compact"/>
         <w:numPr>
           <w:ilvl w:val="0"/>
-          <w:numId w:val="1014"/>
+          <w:numId w:val="1016"/>
         </w:numPr>
       </w:pPr>
       <w:r>
@@ -9092,9 +9486,9 @@
         <w:t xml:space="preserve">exist.</w:t>
       </w:r>
     </w:p>
-    <w:bookmarkEnd w:id="26"/>
-    <w:bookmarkEnd w:id="27"/>
-    <w:bookmarkStart w:id="28" w:name="appendix-b--hub-10-url--feature-contract"/>
+    <w:bookmarkEnd w:id="34"/>
+    <w:bookmarkEnd w:id="35"/>
+    <w:bookmarkStart w:id="36" w:name="appendix-b--hub-10-url--feature-contract"/>
     <w:p>
       <w:pPr>
         <w:pStyle w:val="Heading1"/>
@@ -9664,8 +10058,8 @@
         <w:t xml:space="preserve">. Media/upload URL continuity for externally cited files: inventory + decision in Phase 4 (Section 10).</w:t>
       </w:r>
     </w:p>
-    <w:bookmarkEnd w:id="28"/>
-    <w:bookmarkStart w:id="29" w:name="appendix-c--reuse-checklist"/>
+    <w:bookmarkEnd w:id="36"/>
+    <w:bookmarkStart w:id="37" w:name="appendix-c--reuse-checklist"/>
     <w:p>
       <w:pPr>
         <w:pStyle w:val="Heading1"/>
@@ -10251,8 +10645,8 @@
         </w:tc>
       </w:tr>
     </w:tbl>
-    <w:bookmarkEnd w:id="29"/>
-    <w:bookmarkStart w:id="30" w:name="X8e127df9c12176fb20b75c96653728f7de60746"/>
+    <w:bookmarkEnd w:id="37"/>
+    <w:bookmarkStart w:id="38" w:name="X8e127df9c12176fb20b75c96653728f7de60746"/>
     <w:p>
       <w:pPr>
         <w:pStyle w:val="Heading1"/>
@@ -10266,7 +10660,7 @@
         <w:pStyle w:val="Compact"/>
         <w:numPr>
           <w:ilvl w:val="0"/>
-          <w:numId w:val="1015"/>
+          <w:numId w:val="1017"/>
         </w:numPr>
       </w:pPr>
       <w:r>
@@ -10304,7 +10698,7 @@
         <w:pStyle w:val="Compact"/>
         <w:numPr>
           <w:ilvl w:val="0"/>
-          <w:numId w:val="1015"/>
+          <w:numId w:val="1017"/>
         </w:numPr>
       </w:pPr>
       <w:r>
@@ -10326,7 +10720,7 @@
         <w:pStyle w:val="Compact"/>
         <w:numPr>
           <w:ilvl w:val="0"/>
-          <w:numId w:val="1015"/>
+          <w:numId w:val="1017"/>
         </w:numPr>
       </w:pPr>
       <w:r>
@@ -10348,7 +10742,7 @@
         <w:pStyle w:val="Compact"/>
         <w:numPr>
           <w:ilvl w:val="0"/>
-          <w:numId w:val="1015"/>
+          <w:numId w:val="1017"/>
         </w:numPr>
       </w:pPr>
       <w:r>
@@ -10370,7 +10764,7 @@
         <w:pStyle w:val="Compact"/>
         <w:numPr>
           <w:ilvl w:val="0"/>
-          <w:numId w:val="1015"/>
+          <w:numId w:val="1017"/>
         </w:numPr>
       </w:pPr>
       <w:r>
@@ -10392,7 +10786,7 @@
         <w:pStyle w:val="Compact"/>
         <w:numPr>
           <w:ilvl w:val="0"/>
-          <w:numId w:val="1015"/>
+          <w:numId w:val="1017"/>
         </w:numPr>
       </w:pPr>
       <w:r>
@@ -10430,7 +10824,7 @@
         <w:pStyle w:val="Compact"/>
         <w:numPr>
           <w:ilvl w:val="0"/>
-          <w:numId w:val="1015"/>
+          <w:numId w:val="1017"/>
         </w:numPr>
       </w:pPr>
       <w:r>
@@ -10468,7 +10862,7 @@
         <w:pStyle w:val="Compact"/>
         <w:numPr>
           <w:ilvl w:val="0"/>
-          <w:numId w:val="1015"/>
+          <w:numId w:val="1017"/>
         </w:numPr>
       </w:pPr>
       <w:r>
@@ -10490,7 +10884,7 @@
         <w:pStyle w:val="Compact"/>
         <w:numPr>
           <w:ilvl w:val="0"/>
-          <w:numId w:val="1015"/>
+          <w:numId w:val="1017"/>
         </w:numPr>
       </w:pPr>
       <w:r>
@@ -10512,7 +10906,7 @@
         <w:pStyle w:val="Compact"/>
         <w:numPr>
           <w:ilvl w:val="0"/>
-          <w:numId w:val="1015"/>
+          <w:numId w:val="1017"/>
         </w:numPr>
       </w:pPr>
       <w:r>
@@ -10534,7 +10928,7 @@
         <w:pStyle w:val="Compact"/>
         <w:numPr>
           <w:ilvl w:val="0"/>
-          <w:numId w:val="1015"/>
+          <w:numId w:val="1017"/>
         </w:numPr>
       </w:pPr>
       <w:r>
@@ -10556,7 +10950,7 @@
         <w:pStyle w:val="Compact"/>
         <w:numPr>
           <w:ilvl w:val="0"/>
-          <w:numId w:val="1015"/>
+          <w:numId w:val="1017"/>
         </w:numPr>
       </w:pPr>
       <w:r>
@@ -10590,7 +10984,7 @@
         <w:pStyle w:val="Compact"/>
         <w:numPr>
           <w:ilvl w:val="0"/>
-          <w:numId w:val="1015"/>
+          <w:numId w:val="1017"/>
         </w:numPr>
       </w:pPr>
       <w:r>
@@ -10612,7 +11006,7 @@
         <w:pStyle w:val="Compact"/>
         <w:numPr>
           <w:ilvl w:val="0"/>
-          <w:numId w:val="1015"/>
+          <w:numId w:val="1017"/>
         </w:numPr>
       </w:pPr>
       <w:r>
@@ -10646,7 +11040,7 @@
         <w:pStyle w:val="Compact"/>
         <w:numPr>
           <w:ilvl w:val="0"/>
-          <w:numId w:val="1015"/>
+          <w:numId w:val="1017"/>
         </w:numPr>
       </w:pPr>
       <w:r>
@@ -10663,14 +11057,14 @@
         <w:t xml:space="preserve">a one-page written record of a significant technical decision and why it was made.</w:t>
       </w:r>
     </w:p>
-    <w:bookmarkEnd w:id="30"/>
-    <w:bookmarkStart w:id="31" w:name="Xb84e9dc3efedb0c31378e15b857311068c3cded"/>
+    <w:bookmarkEnd w:id="38"/>
+    <w:bookmarkStart w:id="48" w:name="appendix-e--referenced-resources"/>
     <w:p>
       <w:pPr>
         <w:pStyle w:val="Heading1"/>
       </w:pPr>
       <w:r>
-        <w:t xml:space="preserve">Appendix E — Referenced resources (plain-text addresses)</w:t>
+        <w:t xml:space="preserve">Appendix E — Referenced resources</w:t>
       </w:r>
     </w:p>
     <w:p>
@@ -10678,7 +11072,7 @@
         <w:pStyle w:val="FirstParagraph"/>
       </w:pPr>
       <w:r>
-        <w:t xml:space="preserve">All addresses below are intentionally</w:t>
+        <w:t xml:space="preserve">Every address below is a</w:t>
       </w:r>
       <w:r>
         <w:t xml:space="preserve"> </w:t>
@@ -10688,13 +11082,13 @@
           <w:b/>
           <w:bCs/>
         </w:rPr>
-        <w:t xml:space="preserve">plain text, not clickable links</w:t>
-      </w:r>
-      <w:r>
-        <w:t xml:space="preserve"> </w:t>
-      </w:r>
-      <w:r>
-        <w:t xml:space="preserve">— copy them into a browser if needed.</w:t>
+        <w:t xml:space="preserve">live, clickable link</w:t>
+      </w:r>
+      <w:r>
+        <w:t xml:space="preserve"> </w:t>
+      </w:r>
+      <w:r>
+        <w:t xml:space="preserve">(the visible text is the full address, so it can also be copied from a printout).</w:t>
       </w:r>
     </w:p>
     <w:p>
@@ -10765,12 +11159,14 @@
             <w:pPr>
               <w:pStyle w:val="Compact"/>
             </w:pPr>
-            <w:r>
-              <w:rPr>
-                <w:rStyle w:val="VerbatimChar"/>
-              </w:rPr>
-              <w:t xml:space="preserve">https://icjia.illinois.gov/researchhub/</w:t>
-            </w:r>
+            <w:hyperlink r:id="rId11">
+              <w:r>
+                <w:rPr>
+                  <w:rStyle w:val="VerbatimChar"/>
+                </w:rPr>
+                <w:t xml:space="preserve">https://icjia.illinois.gov/researchhub/</w:t>
+              </w:r>
+            </w:hyperlink>
           </w:p>
         </w:tc>
       </w:tr>
@@ -10792,12 +11188,14 @@
             <w:pPr>
               <w:pStyle w:val="Compact"/>
             </w:pPr>
-            <w:r>
-              <w:rPr>
-                <w:rStyle w:val="VerbatimChar"/>
-              </w:rPr>
-              <w:t xml:space="preserve">https://icjia.illinois.gov/</w:t>
-            </w:r>
+            <w:hyperlink r:id="rId39">
+              <w:r>
+                <w:rPr>
+                  <w:rStyle w:val="VerbatimChar"/>
+                </w:rPr>
+                <w:t xml:space="preserve">https://icjia.illinois.gov/</w:t>
+              </w:r>
+            </w:hyperlink>
           </w:p>
         </w:tc>
       </w:tr>
@@ -10819,12 +11217,14 @@
             <w:pPr>
               <w:pStyle w:val="Compact"/>
             </w:pPr>
-            <w:r>
-              <w:rPr>
-                <w:rStyle w:val="VerbatimChar"/>
-              </w:rPr>
-              <w:t xml:space="preserve">https://v2-hub-demo.netlify.app/</w:t>
-            </w:r>
+            <w:hyperlink r:id="rId40">
+              <w:r>
+                <w:rPr>
+                  <w:rStyle w:val="VerbatimChar"/>
+                </w:rPr>
+                <w:t xml:space="preserve">https://v2-hub-demo.netlify.app/</w:t>
+              </w:r>
+            </w:hyperlink>
           </w:p>
         </w:tc>
       </w:tr>
@@ -10897,12 +11297,14 @@
             <w:pPr>
               <w:pStyle w:val="Compact"/>
             </w:pPr>
-            <w:r>
-              <w:rPr>
-                <w:rStyle w:val="VerbatimChar"/>
-              </w:rPr>
-              <w:t xml:space="preserve">https://researchhub.icjia-api.cloud</w:t>
-            </w:r>
+            <w:hyperlink r:id="rId41">
+              <w:r>
+                <w:rPr>
+                  <w:rStyle w:val="VerbatimChar"/>
+                </w:rPr>
+                <w:t xml:space="preserve">https://researchhub.icjia-api.cloud</w:t>
+              </w:r>
+            </w:hyperlink>
           </w:p>
         </w:tc>
       </w:tr>
@@ -10924,12 +11326,14 @@
             <w:pPr>
               <w:pStyle w:val="Compact"/>
             </w:pPr>
-            <w:r>
-              <w:rPr>
-                <w:rStyle w:val="VerbatimChar"/>
-              </w:rPr>
-              <w:t xml:space="preserve">https://v2.hub.icjia-api.cloud</w:t>
-            </w:r>
+            <w:hyperlink r:id="rId42">
+              <w:r>
+                <w:rPr>
+                  <w:rStyle w:val="VerbatimChar"/>
+                </w:rPr>
+                <w:t xml:space="preserve">https://v2.hub.icjia-api.cloud</w:t>
+              </w:r>
+            </w:hyperlink>
           </w:p>
         </w:tc>
       </w:tr>
@@ -11013,12 +11417,14 @@
             <w:pPr>
               <w:pStyle w:val="Compact"/>
             </w:pPr>
-            <w:r>
-              <w:rPr>
-                <w:rStyle w:val="VerbatimChar"/>
-              </w:rPr>
-              <w:t xml:space="preserve">github.com/ICJIA/copperhead-hub-20</w:t>
-            </w:r>
+            <w:hyperlink r:id="rId43">
+              <w:r>
+                <w:rPr>
+                  <w:rStyle w:val="VerbatimChar"/>
+                </w:rPr>
+                <w:t xml:space="preserve">github.com/ICJIA/copperhead-hub-20</w:t>
+              </w:r>
+            </w:hyperlink>
           </w:p>
         </w:tc>
         <w:tc>
@@ -11050,12 +11456,14 @@
             <w:pPr>
               <w:pStyle w:val="Compact"/>
             </w:pPr>
-            <w:r>
-              <w:rPr>
-                <w:rStyle w:val="VerbatimChar"/>
-              </w:rPr>
-              <w:t xml:space="preserve">github.com/ICJIA/hub-frontend</w:t>
-            </w:r>
+            <w:hyperlink r:id="rId18">
+              <w:r>
+                <w:rPr>
+                  <w:rStyle w:val="VerbatimChar"/>
+                </w:rPr>
+                <w:t xml:space="preserve">github.com/ICJIA/hub-frontend</w:t>
+              </w:r>
+            </w:hyperlink>
           </w:p>
         </w:tc>
         <w:tc>
@@ -11077,12 +11485,14 @@
             <w:pPr>
               <w:pStyle w:val="Compact"/>
             </w:pPr>
-            <w:r>
-              <w:rPr>
-                <w:rStyle w:val="VerbatimChar"/>
-              </w:rPr>
-              <w:t xml:space="preserve">github.com/ICJIA/hub-studio-2026</w:t>
-            </w:r>
+            <w:hyperlink r:id="rId14">
+              <w:r>
+                <w:rPr>
+                  <w:rStyle w:val="VerbatimChar"/>
+                </w:rPr>
+                <w:t xml:space="preserve">github.com/ICJIA/hub-studio-2026</w:t>
+              </w:r>
+            </w:hyperlink>
           </w:p>
         </w:tc>
         <w:tc>
@@ -11104,12 +11514,14 @@
             <w:pPr>
               <w:pStyle w:val="Compact"/>
             </w:pPr>
-            <w:r>
-              <w:rPr>
-                <w:rStyle w:val="VerbatimChar"/>
-              </w:rPr>
-              <w:t xml:space="preserve">github.com/ICJIA/hub-migration-tools</w:t>
-            </w:r>
+            <w:hyperlink r:id="rId13">
+              <w:r>
+                <w:rPr>
+                  <w:rStyle w:val="VerbatimChar"/>
+                </w:rPr>
+                <w:t xml:space="preserve">github.com/ICJIA/hub-migration-tools</w:t>
+              </w:r>
+            </w:hyperlink>
           </w:p>
         </w:tc>
         <w:tc>
@@ -11131,12 +11543,14 @@
             <w:pPr>
               <w:pStyle w:val="Compact"/>
             </w:pPr>
-            <w:r>
-              <w:rPr>
-                <w:rStyle w:val="VerbatimChar"/>
-              </w:rPr>
-              <w:t xml:space="preserve">github.com/ICJIA/v2-hub-demo</w:t>
-            </w:r>
+            <w:hyperlink r:id="rId15">
+              <w:r>
+                <w:rPr>
+                  <w:rStyle w:val="VerbatimChar"/>
+                </w:rPr>
+                <w:t xml:space="preserve">github.com/ICJIA/v2-hub-demo</w:t>
+              </w:r>
+            </w:hyperlink>
           </w:p>
         </w:tc>
         <w:tc>
@@ -11158,12 +11572,14 @@
             <w:pPr>
               <w:pStyle w:val="Compact"/>
             </w:pPr>
-            <w:r>
-              <w:rPr>
-                <w:rStyle w:val="VerbatimChar"/>
-              </w:rPr>
-              <w:t xml:space="preserve">github.com/ICJIA/pdf-search-index</w:t>
-            </w:r>
+            <w:hyperlink r:id="rId16">
+              <w:r>
+                <w:rPr>
+                  <w:rStyle w:val="VerbatimChar"/>
+                </w:rPr>
+                <w:t xml:space="preserve">github.com/ICJIA/pdf-search-index</w:t>
+              </w:r>
+            </w:hyperlink>
           </w:p>
         </w:tc>
         <w:tc>
@@ -11194,12 +11610,14 @@
             <w:pPr>
               <w:pStyle w:val="Compact"/>
             </w:pPr>
-            <w:r>
-              <w:rPr>
-                <w:rStyle w:val="VerbatimChar"/>
-              </w:rPr>
-              <w:t xml:space="preserve">github.com/ICJIA/icjia-public-client-2021</w:t>
-            </w:r>
+            <w:hyperlink r:id="rId44">
+              <w:r>
+                <w:rPr>
+                  <w:rStyle w:val="VerbatimChar"/>
+                </w:rPr>
+                <w:t xml:space="preserve">github.com/ICJIA/icjia-public-client-2021</w:t>
+              </w:r>
+            </w:hyperlink>
           </w:p>
         </w:tc>
         <w:tc>
@@ -11283,12 +11701,14 @@
             <w:pPr>
               <w:pStyle w:val="Compact"/>
             </w:pPr>
-            <w:r>
-              <w:rPr>
-                <w:rStyle w:val="VerbatimChar"/>
-              </w:rPr>
-              <w:t xml:space="preserve">https://www.w3.org/TR/WCAG21/</w:t>
-            </w:r>
+            <w:hyperlink r:id="rId45">
+              <w:r>
+                <w:rPr>
+                  <w:rStyle w:val="VerbatimChar"/>
+                </w:rPr>
+                <w:t xml:space="preserve">https://www.w3.org/TR/WCAG21/</w:t>
+              </w:r>
+            </w:hyperlink>
           </w:p>
         </w:tc>
       </w:tr>
@@ -11310,12 +11730,14 @@
             <w:pPr>
               <w:pStyle w:val="Compact"/>
             </w:pPr>
-            <w:r>
-              <w:rPr>
-                <w:rStyle w:val="VerbatimChar"/>
-              </w:rPr>
-              <w:t xml:space="preserve">https://www.ada.gov/resources/2024-03-08-web-rule/</w:t>
-            </w:r>
+            <w:hyperlink r:id="rId46">
+              <w:r>
+                <w:rPr>
+                  <w:rStyle w:val="VerbatimChar"/>
+                </w:rPr>
+                <w:t xml:space="preserve">https://www.ada.gov/resources/2024-03-08-web-rule/</w:t>
+              </w:r>
+            </w:hyperlink>
           </w:p>
         </w:tc>
       </w:tr>
@@ -11337,12 +11759,14 @@
             <w:pPr>
               <w:pStyle w:val="Compact"/>
             </w:pPr>
-            <w:r>
-              <w:rPr>
-                <w:rStyle w:val="VerbatimChar"/>
-              </w:rPr>
-              <w:t xml:space="preserve">https://doit.illinois.gov</w:t>
-            </w:r>
+            <w:hyperlink r:id="rId47">
+              <w:r>
+                <w:rPr>
+                  <w:rStyle w:val="VerbatimChar"/>
+                </w:rPr>
+                <w:t xml:space="preserve">https://doit.illinois.gov</w:t>
+              </w:r>
+            </w:hyperlink>
             <w:r>
               <w:t xml:space="preserve"> </w:t>
             </w:r>
@@ -11353,7 +11777,7 @@
         </w:tc>
       </w:tr>
     </w:tbl>
-    <w:bookmarkEnd w:id="31"/>
+    <w:bookmarkEnd w:id="48"/>
     <w:sectPr>
       <w:footnotePr>
         <w:numRestart w:val="eachSect"/>
@@ -11806,6 +12230,66 @@
     </w:lvlOverride>
   </w:num>
   <w:num w:numId="1015">
+    <w:abstractNumId w:val="99411"/>
+    <w:lvlOverride w:ilvl="0">
+      <w:startOverride w:val="1"/>
+    </w:lvlOverride>
+    <w:lvlOverride w:ilvl="1">
+      <w:startOverride w:val="1"/>
+    </w:lvlOverride>
+    <w:lvlOverride w:ilvl="2">
+      <w:startOverride w:val="1"/>
+    </w:lvlOverride>
+    <w:lvlOverride w:ilvl="3">
+      <w:startOverride w:val="1"/>
+    </w:lvlOverride>
+    <w:lvlOverride w:ilvl="4">
+      <w:startOverride w:val="1"/>
+    </w:lvlOverride>
+    <w:lvlOverride w:ilvl="5">
+      <w:startOverride w:val="1"/>
+    </w:lvlOverride>
+    <w:lvlOverride w:ilvl="6">
+      <w:startOverride w:val="1"/>
+    </w:lvlOverride>
+    <w:lvlOverride w:ilvl="7">
+      <w:startOverride w:val="1"/>
+    </w:lvlOverride>
+    <w:lvlOverride w:ilvl="8">
+      <w:startOverride w:val="1"/>
+    </w:lvlOverride>
+  </w:num>
+  <w:num w:numId="1016">
+    <w:abstractNumId w:val="99411"/>
+    <w:lvlOverride w:ilvl="0">
+      <w:startOverride w:val="1"/>
+    </w:lvlOverride>
+    <w:lvlOverride w:ilvl="1">
+      <w:startOverride w:val="1"/>
+    </w:lvlOverride>
+    <w:lvlOverride w:ilvl="2">
+      <w:startOverride w:val="1"/>
+    </w:lvlOverride>
+    <w:lvlOverride w:ilvl="3">
+      <w:startOverride w:val="1"/>
+    </w:lvlOverride>
+    <w:lvlOverride w:ilvl="4">
+      <w:startOverride w:val="1"/>
+    </w:lvlOverride>
+    <w:lvlOverride w:ilvl="5">
+      <w:startOverride w:val="1"/>
+    </w:lvlOverride>
+    <w:lvlOverride w:ilvl="6">
+      <w:startOverride w:val="1"/>
+    </w:lvlOverride>
+    <w:lvlOverride w:ilvl="7">
+      <w:startOverride w:val="1"/>
+    </w:lvlOverride>
+    <w:lvlOverride w:ilvl="8">
+      <w:startOverride w:val="1"/>
+    </w:lvlOverride>
+  </w:num>
+  <w:num w:numId="1017">
     <w:abstractNumId w:val="991"/>
   </w:num>
 </w:numbering>

</xml_diff>

<commit_message>
Phase 4: SEO, URL-parity infrastructure, analytics
- sitemap.xml emitted every build (269 URLs); llms.txt; WebSite JSON-LD
  on home; canonical URLs on all listing/search pages
- URL-parity checker (pnpm parity) vs the archived 266-URL Hub 1.0
  snapshot, advisory in CI / PARITY_STRICT=1 at launch: 246/266 resolve,
  all 20 misses accounted for (17 post-migration articles -> cutover
  sync; hub-home/hub-overview/dicra -> authoring)
- Redirect map: four legacy article slugs 301 to their current articles
  (fuzzy-matched, verified against the CMS)
- Plausible (plausible.icjia.cloud) via production-hostname-gated loader
  so previews never pollute icjia.illinois.gov statistics
- Plan doc Phase 4 row updated; docx rebuilt (anchors verified, 0 fields)
</commit_message>
<xml_diff>
--- a/docs/ICJIA-Hub-20-rewrite-copperhead.docx
+++ b/docs/ICJIA-Hub-20-rewrite-copperhead.docx
@@ -3828,7 +3828,33 @@
               <w:pStyle w:val="Compact"/>
             </w:pPr>
             <w:r>
-              <w:t xml:space="preserve">Partially underway (canonical URLs and JSON-LD ship already); sitemap, robots flip, the URL-parity crawler, and Plausible are next</w:t>
+              <w:rPr>
+                <w:b/>
+                <w:bCs/>
+              </w:rPr>
+              <w:t xml:space="preserve">Substantially complete.</w:t>
+            </w:r>
+            <w:r>
+              <w:t xml:space="preserve"> </w:t>
+            </w:r>
+            <w:r>
+              <w:t xml:space="preserve">Sitemap emitted every build; canonical URLs and structured data on all key pages; Plausible analytics wired (activates only on the production hostname, so preview traffic never pollutes the statistics); redirects recover four legacy article URLs whose slugs changed; llms.txt. The</w:t>
+            </w:r>
+            <w:r>
+              <w:t xml:space="preserve"> </w:t>
+            </w:r>
+            <w:r>
+              <w:rPr>
+                <w:b/>
+                <w:bCs/>
+              </w:rPr>
+              <w:t xml:space="preserve">URL-parity checker</w:t>
+            </w:r>
+            <w:r>
+              <w:t xml:space="preserve"> </w:t>
+            </w:r>
+            <w:r>
+              <w:t xml:space="preserve">runs in CI against the archived 266-URL snapshot: 246 already resolve, and all 20 remaining misses are accounted for — 17 articles published on Hub 1.0 after the March migration (the cutover content sync brings them over) and the 3 pages awaiting authoring. Remaining: the robots flip and strict parity enforcement, both launch-day steps</w:t>
             </w:r>
           </w:p>
         </w:tc>

</xml_diff>

<commit_message>
Docs: reframe status as authored first draft — private, not final
The rewrite plan's progress section and the README now lead with what
managers need to know: a complete working first draft of the new Hub
exists at a private preview (manuscript metaphor — every chapter
written, now entering editing), with an explicit list of what 'first
draft' still excludes: design review, placeholder copy, post-migration
content sync, the manual accessibility walkthrough, and the launch
checklist. Phase table wording softened from 'complete' to 'first
draft built'. Docx rebuilt (anchors verified, zero fields).
</commit_message>
<xml_diff>
--- a/docs/ICJIA-Hub-20-rewrite-copperhead.docx
+++ b/docs/ICJIA-Hub-20-rewrite-copperhead.docx
@@ -608,6 +608,76 @@
       </w:pPr>
       <w:r>
         <w:rPr>
+          <w:i/>
+          <w:iCs/>
+        </w:rPr>
+        <w:t xml:space="preserve">(Since this plan was approved, a complete working</w:t>
+      </w:r>
+      <w:r>
+        <w:rPr>
+          <w:i/>
+          <w:iCs/>
+        </w:rPr>
+        <w:t xml:space="preserve"> </w:t>
+      </w:r>
+      <w:r>
+        <w:rPr>
+          <w:b/>
+          <w:bCs/>
+          <w:i/>
+          <w:iCs/>
+        </w:rPr>
+        <w:t xml:space="preserve">first draft</w:t>
+      </w:r>
+      <w:r>
+        <w:rPr>
+          <w:i/>
+          <w:iCs/>
+        </w:rPr>
+        <w:t xml:space="preserve"> </w:t>
+      </w:r>
+      <w:r>
+        <w:rPr>
+          <w:i/>
+          <w:iCs/>
+        </w:rPr>
+        <w:t xml:space="preserve">of the new site has been built at a private preview address — see</w:t>
+      </w:r>
+      <w:r>
+        <w:rPr>
+          <w:i/>
+          <w:iCs/>
+        </w:rPr>
+        <w:t xml:space="preserve"> </w:t>
+      </w:r>
+      <w:r>
+        <w:rPr>
+          <w:i/>
+          <w:iCs/>
+        </w:rPr>
+        <w:t xml:space="preserve">“Progress update — July 11, 2026”</w:t>
+      </w:r>
+      <w:r>
+        <w:rPr>
+          <w:i/>
+          <w:iCs/>
+        </w:rPr>
+        <w:t xml:space="preserve"> </w:t>
+      </w:r>
+      <w:r>
+        <w:rPr>
+          <w:i/>
+          <w:iCs/>
+        </w:rPr>
+        <w:t xml:space="preserve">below. It is not public and not final; the phases, risks, and asks in this document remain the roadmap for finishing it.)</w:t>
+      </w:r>
+    </w:p>
+    <w:p>
+      <w:pPr>
+        <w:pStyle w:val="BodyText"/>
+      </w:pPr>
+      <w:r>
+        <w:rPr>
           <w:b/>
           <w:bCs/>
         </w:rPr>
@@ -3600,7 +3670,197 @@
         <w:pStyle w:val="FirstParagraph"/>
       </w:pPr>
       <w:r>
-        <w:t xml:space="preserve">Written the day this plan was approved — and the same day the first four phases were substantially built. Current state:</w:t>
+        <w:rPr>
+          <w:b/>
+          <w:bCs/>
+        </w:rPr>
+        <w:t xml:space="preserve">The one-sentence status: a complete working first draft of the new Research Hub now exists — private, not public, and not final.</w:t>
+      </w:r>
+    </w:p>
+    <w:p>
+      <w:pPr>
+        <w:pStyle w:val="BodyText"/>
+      </w:pPr>
+      <w:r>
+        <w:t xml:space="preserve">Think of it the way you’d think of a report manuscript: every chapter has been written and reads end-to-end, and now comes the editing. All ~540 pages of the new site render and work at a private preview address (the live Research Hub is untouched). Every article, dataset, and dashboard is browsable in the new design; search — including search</w:t>
+      </w:r>
+      <w:r>
+        <w:t xml:space="preserve"> </w:t>
+      </w:r>
+      <w:r>
+        <w:rPr>
+          <w:i/>
+          <w:iCs/>
+        </w:rPr>
+        <w:t xml:space="preserve">inside</w:t>
+      </w:r>
+      <w:r>
+        <w:t xml:space="preserve"> </w:t>
+      </w:r>
+      <w:r>
+        <w:t xml:space="preserve">published PDF documents — works; and every change is automatically checked against accessibility, performance, and correctness standards before it can ship.</w:t>
+      </w:r>
+      <w:r>
+        <w:t xml:space="preserve"> </w:t>
+      </w:r>
+      <w:r>
+        <w:rPr>
+          <w:b/>
+          <w:bCs/>
+        </w:rPr>
+        <w:t xml:space="preserve">None of this is public</w:t>
+      </w:r>
+      <w:r>
+        <w:t xml:space="preserve">, and none of it is finished: it is scaffolding and first-draft work, deliberately built early so that reviewing, refining, and content-writing can happen against something real rather than against mockups.</w:t>
+      </w:r>
+    </w:p>
+    <w:p>
+      <w:pPr>
+        <w:pStyle w:val="BodyText"/>
+      </w:pPr>
+      <w:r>
+        <w:rPr>
+          <w:b/>
+          <w:bCs/>
+        </w:rPr>
+        <w:t xml:space="preserve">What</w:t>
+      </w:r>
+      <w:r>
+        <w:rPr>
+          <w:b/>
+          <w:bCs/>
+        </w:rPr>
+        <w:t xml:space="preserve"> </w:t>
+      </w:r>
+      <w:r>
+        <w:rPr>
+          <w:b/>
+          <w:bCs/>
+        </w:rPr>
+        <w:t xml:space="preserve">“first draft”</w:t>
+      </w:r>
+      <w:r>
+        <w:rPr>
+          <w:b/>
+          <w:bCs/>
+        </w:rPr>
+        <w:t xml:space="preserve"> </w:t>
+      </w:r>
+      <w:r>
+        <w:rPr>
+          <w:b/>
+          <w:bCs/>
+        </w:rPr>
+        <w:t xml:space="preserve">means concretely — still to do before anyone outside the team sees it:</w:t>
+      </w:r>
+    </w:p>
+    <w:p>
+      <w:pPr>
+        <w:pStyle w:val="Compact"/>
+        <w:numPr>
+          <w:ilvl w:val="0"/>
+          <w:numId w:val="1015"/>
+        </w:numPr>
+      </w:pPr>
+      <w:r>
+        <w:t xml:space="preserve">Visual design has not been reviewed against the Figma mockups by its designer; polish passes will follow.</w:t>
+      </w:r>
+    </w:p>
+    <w:p>
+      <w:pPr>
+        <w:pStyle w:val="Compact"/>
+        <w:numPr>
+          <w:ilvl w:val="0"/>
+          <w:numId w:val="1015"/>
+        </w:numPr>
+      </w:pPr>
+      <w:r>
+        <w:t xml:space="preserve">Some copy on the site is</w:t>
+      </w:r>
+      <w:r>
+        <w:t xml:space="preserve"> </w:t>
+      </w:r>
+      <w:r>
+        <w:rPr>
+          <w:b/>
+          <w:bCs/>
+        </w:rPr>
+        <w:t xml:space="preserve">placeholder text</w:t>
+      </w:r>
+      <w:r>
+        <w:t xml:space="preserve"> </w:t>
+      </w:r>
+      <w:r>
+        <w:t xml:space="preserve">(clearly marked in the code) awaiting real content in the CMS — the homepage narrative, the projects section copy, and the publications/staff pages in particular.</w:t>
+      </w:r>
+    </w:p>
+    <w:p>
+      <w:pPr>
+        <w:pStyle w:val="Compact"/>
+        <w:numPr>
+          <w:ilvl w:val="0"/>
+          <w:numId w:val="1015"/>
+        </w:numPr>
+      </w:pPr>
+      <w:r>
+        <w:t xml:space="preserve">Content authored on the current Hub since March (about 17 newer articles) syncs over at cutover, and three standing pages (hub overview, DICRA, homepage content) are waiting to be written in the new CMS.</w:t>
+      </w:r>
+    </w:p>
+    <w:p>
+      <w:pPr>
+        <w:pStyle w:val="Compact"/>
+        <w:numPr>
+          <w:ilvl w:val="0"/>
+          <w:numId w:val="1015"/>
+        </w:numPr>
+      </w:pPr>
+      <w:r>
+        <w:t xml:space="preserve">A human accessibility walkthrough, a content-freeze rehearsal, and the launch-day checklist remain — all scripted in the project runbook.</w:t>
+      </w:r>
+    </w:p>
+    <w:p>
+      <w:pPr>
+        <w:pStyle w:val="Compact"/>
+        <w:numPr>
+          <w:ilvl w:val="0"/>
+          <w:numId w:val="1015"/>
+        </w:numPr>
+      </w:pPr>
+      <w:r>
+        <w:t xml:space="preserve">The preview is deliberately hidden from search engines until launch.</w:t>
+      </w:r>
+    </w:p>
+    <w:p>
+      <w:pPr>
+        <w:pStyle w:val="FirstParagraph"/>
+      </w:pPr>
+      <w:r>
+        <w:t xml:space="preserve">Build state by phase (engineering detail —</w:t>
+      </w:r>
+      <w:r>
+        <w:t xml:space="preserve"> </w:t>
+      </w:r>
+      <w:r>
+        <w:t xml:space="preserve">“built”</w:t>
+      </w:r>
+      <w:r>
+        <w:t xml:space="preserve"> </w:t>
+      </w:r>
+      <w:r>
+        <w:t xml:space="preserve">below means</w:t>
+      </w:r>
+      <w:r>
+        <w:t xml:space="preserve"> </w:t>
+      </w:r>
+      <w:r>
+        <w:rPr>
+          <w:i/>
+          <w:iCs/>
+        </w:rPr>
+        <w:t xml:space="preserve">working in the draft</w:t>
+      </w:r>
+      <w:r>
+        <w:t xml:space="preserve">, not launched):</w:t>
       </w:r>
     </w:p>
     <w:tbl>
@@ -3748,7 +4008,7 @@
                 <w:b/>
                 <w:bCs/>
               </w:rPr>
-              <w:t xml:space="preserve">Complete (code-side).</w:t>
+              <w:t xml:space="preserve">First draft built.</w:t>
             </w:r>
             <w:r>
               <w:t xml:space="preserve"> </w:t>
@@ -3782,13 +4042,13 @@
                 <w:b/>
                 <w:bCs/>
               </w:rPr>
-              <w:t xml:space="preserve">Complete (code-side).</w:t>
-            </w:r>
-            <w:r>
-              <w:t xml:space="preserve"> </w:t>
-            </w:r>
-            <w:r>
-              <w:t xml:space="preserve">The three stakeholder concerns are solved: one-click publication-type chips, author names on cards plus an author filter, and search-term highlighting — all shareable via URL. Site search finds words</w:t>
+              <w:t xml:space="preserve">First draft built.</w:t>
+            </w:r>
+            <w:r>
+              <w:t xml:space="preserve"> </w:t>
+            </w:r>
+            <w:r>
+              <w:t xml:space="preserve">The three stakeholder concerns are addressed: one-click publication-type chips, author names on cards plus an author filter, and search-term highlighting — all shareable via URL. Site search finds words</w:t>
             </w:r>
             <w:r>
               <w:t xml:space="preserve"> </w:t>
@@ -3832,7 +4092,7 @@
                 <w:b/>
                 <w:bCs/>
               </w:rPr>
-              <w:t xml:space="preserve">Substantially complete.</w:t>
+              <w:t xml:space="preserve">First draft built.</w:t>
             </w:r>
             <w:r>
               <w:t xml:space="preserve"> </w:t>
@@ -3882,7 +4142,7 @@
                 <w:b/>
                 <w:bCs/>
               </w:rPr>
-              <w:t xml:space="preserve">Substantially complete.</w:t>
+              <w:t xml:space="preserve">First draft built.</w:t>
             </w:r>
             <w:r>
               <w:t xml:space="preserve"> </w:t>
@@ -3943,7 +4203,7 @@
           <w:b/>
           <w:bCs/>
         </w:rPr>
-        <w:t xml:space="preserve">Live preview:</w:t>
+        <w:t xml:space="preserve">Private preview:</w:t>
       </w:r>
       <w:r>
         <w:t xml:space="preserve"> </w:t>
@@ -3958,7 +4218,7 @@
         <w:t xml:space="preserve"> </w:t>
       </w:r>
       <w:r>
-        <w:t xml:space="preserve">(blocked from search engines until launch). ~540 routes prerender in about ten seconds; the build carries 41 unit tests and 26 accessibility checks.</w:t>
+        <w:t xml:space="preserve">— a draft for internal review only, blocked from search engines until launch. ~540 pages rebuild in about ten seconds; every change passes 41 unit tests, 30 accessibility checks, and performance budgets before it can deploy.</w:t>
       </w:r>
     </w:p>
     <w:p>
@@ -5688,7 +5948,7 @@
         <w:pStyle w:val="Compact"/>
         <w:numPr>
           <w:ilvl w:val="0"/>
-          <w:numId w:val="1015"/>
+          <w:numId w:val="1016"/>
         </w:numPr>
       </w:pPr>
       <w:r>
@@ -5710,7 +5970,7 @@
         <w:pStyle w:val="Compact"/>
         <w:numPr>
           <w:ilvl w:val="0"/>
-          <w:numId w:val="1015"/>
+          <w:numId w:val="1016"/>
         </w:numPr>
       </w:pPr>
       <w:r>
@@ -5732,7 +5992,7 @@
         <w:pStyle w:val="Compact"/>
         <w:numPr>
           <w:ilvl w:val="0"/>
-          <w:numId w:val="1015"/>
+          <w:numId w:val="1016"/>
         </w:numPr>
       </w:pPr>
       <w:r>
@@ -5754,7 +6014,7 @@
         <w:pStyle w:val="Compact"/>
         <w:numPr>
           <w:ilvl w:val="0"/>
-          <w:numId w:val="1015"/>
+          <w:numId w:val="1016"/>
         </w:numPr>
       </w:pPr>
       <w:r>
@@ -5776,7 +6036,7 @@
         <w:pStyle w:val="Compact"/>
         <w:numPr>
           <w:ilvl w:val="0"/>
-          <w:numId w:val="1015"/>
+          <w:numId w:val="1016"/>
         </w:numPr>
       </w:pPr>
       <w:r>
@@ -5826,7 +6086,7 @@
         <w:pStyle w:val="Compact"/>
         <w:numPr>
           <w:ilvl w:val="0"/>
-          <w:numId w:val="1015"/>
+          <w:numId w:val="1016"/>
         </w:numPr>
       </w:pPr>
       <w:r>
@@ -5848,7 +6108,7 @@
         <w:pStyle w:val="Compact"/>
         <w:numPr>
           <w:ilvl w:val="0"/>
-          <w:numId w:val="1015"/>
+          <w:numId w:val="1016"/>
         </w:numPr>
       </w:pPr>
       <w:r>
@@ -5870,7 +6130,7 @@
         <w:pStyle w:val="Compact"/>
         <w:numPr>
           <w:ilvl w:val="0"/>
-          <w:numId w:val="1015"/>
+          <w:numId w:val="1016"/>
         </w:numPr>
       </w:pPr>
       <w:r>
@@ -9059,7 +9319,7 @@
         <w:pStyle w:val="Compact"/>
         <w:numPr>
           <w:ilvl w:val="0"/>
-          <w:numId w:val="1016"/>
+          <w:numId w:val="1017"/>
         </w:numPr>
       </w:pPr>
       <w:r>
@@ -9095,7 +9355,7 @@
         <w:pStyle w:val="Compact"/>
         <w:numPr>
           <w:ilvl w:val="0"/>
-          <w:numId w:val="1016"/>
+          <w:numId w:val="1017"/>
         </w:numPr>
       </w:pPr>
       <w:r>
@@ -9137,7 +9397,7 @@
         <w:pStyle w:val="Compact"/>
         <w:numPr>
           <w:ilvl w:val="0"/>
-          <w:numId w:val="1016"/>
+          <w:numId w:val="1017"/>
         </w:numPr>
       </w:pPr>
       <w:r>
@@ -9179,7 +9439,7 @@
         <w:pStyle w:val="Compact"/>
         <w:numPr>
           <w:ilvl w:val="0"/>
-          <w:numId w:val="1016"/>
+          <w:numId w:val="1017"/>
         </w:numPr>
       </w:pPr>
       <w:r>
@@ -9191,7 +9451,7 @@
         <w:pStyle w:val="Compact"/>
         <w:numPr>
           <w:ilvl w:val="0"/>
-          <w:numId w:val="1016"/>
+          <w:numId w:val="1017"/>
         </w:numPr>
       </w:pPr>
       <w:r>
@@ -9203,7 +9463,7 @@
         <w:pStyle w:val="Compact"/>
         <w:numPr>
           <w:ilvl w:val="0"/>
-          <w:numId w:val="1016"/>
+          <w:numId w:val="1017"/>
         </w:numPr>
       </w:pPr>
       <w:r>
@@ -9266,7 +9526,7 @@
         <w:pStyle w:val="Compact"/>
         <w:numPr>
           <w:ilvl w:val="0"/>
-          <w:numId w:val="1016"/>
+          <w:numId w:val="1017"/>
         </w:numPr>
       </w:pPr>
       <w:r>
@@ -9311,7 +9571,7 @@
         <w:pStyle w:val="Compact"/>
         <w:numPr>
           <w:ilvl w:val="0"/>
-          <w:numId w:val="1016"/>
+          <w:numId w:val="1017"/>
         </w:numPr>
       </w:pPr>
       <w:r>
@@ -9323,7 +9583,7 @@
         <w:pStyle w:val="Compact"/>
         <w:numPr>
           <w:ilvl w:val="0"/>
-          <w:numId w:val="1016"/>
+          <w:numId w:val="1017"/>
         </w:numPr>
       </w:pPr>
       <w:r>
@@ -9365,7 +9625,7 @@
         <w:pStyle w:val="Compact"/>
         <w:numPr>
           <w:ilvl w:val="0"/>
-          <w:numId w:val="1016"/>
+          <w:numId w:val="1017"/>
         </w:numPr>
       </w:pPr>
       <w:r>
@@ -9404,7 +9664,7 @@
         <w:pStyle w:val="Compact"/>
         <w:numPr>
           <w:ilvl w:val="0"/>
-          <w:numId w:val="1016"/>
+          <w:numId w:val="1017"/>
         </w:numPr>
       </w:pPr>
       <w:r>
@@ -9416,7 +9676,7 @@
         <w:pStyle w:val="Compact"/>
         <w:numPr>
           <w:ilvl w:val="0"/>
-          <w:numId w:val="1016"/>
+          <w:numId w:val="1017"/>
         </w:numPr>
       </w:pPr>
       <w:r>
@@ -9434,7 +9694,7 @@
         <w:pStyle w:val="Compact"/>
         <w:numPr>
           <w:ilvl w:val="0"/>
-          <w:numId w:val="1016"/>
+          <w:numId w:val="1017"/>
         </w:numPr>
       </w:pPr>
       <w:r>
@@ -9446,7 +9706,7 @@
         <w:pStyle w:val="Compact"/>
         <w:numPr>
           <w:ilvl w:val="0"/>
-          <w:numId w:val="1016"/>
+          <w:numId w:val="1017"/>
         </w:numPr>
       </w:pPr>
       <w:r>
@@ -9476,7 +9736,7 @@
         <w:pStyle w:val="Compact"/>
         <w:numPr>
           <w:ilvl w:val="0"/>
-          <w:numId w:val="1016"/>
+          <w:numId w:val="1017"/>
         </w:numPr>
       </w:pPr>
       <w:r>
@@ -9503,7 +9763,7 @@
         <w:pStyle w:val="Compact"/>
         <w:numPr>
           <w:ilvl w:val="0"/>
-          <w:numId w:val="1016"/>
+          <w:numId w:val="1017"/>
         </w:numPr>
       </w:pPr>
       <w:r>
@@ -9515,7 +9775,7 @@
         <w:pStyle w:val="Compact"/>
         <w:numPr>
           <w:ilvl w:val="0"/>
-          <w:numId w:val="1016"/>
+          <w:numId w:val="1017"/>
         </w:numPr>
       </w:pPr>
       <w:r>
@@ -9539,7 +9799,7 @@
         <w:pStyle w:val="Compact"/>
         <w:numPr>
           <w:ilvl w:val="0"/>
-          <w:numId w:val="1016"/>
+          <w:numId w:val="1017"/>
         </w:numPr>
       </w:pPr>
       <w:r>
@@ -9560,7 +9820,7 @@
         <w:pStyle w:val="Compact"/>
         <w:numPr>
           <w:ilvl w:val="0"/>
-          <w:numId w:val="1016"/>
+          <w:numId w:val="1017"/>
         </w:numPr>
       </w:pPr>
       <w:r>
@@ -9572,7 +9832,7 @@
         <w:pStyle w:val="Compact"/>
         <w:numPr>
           <w:ilvl w:val="0"/>
-          <w:numId w:val="1016"/>
+          <w:numId w:val="1017"/>
         </w:numPr>
       </w:pPr>
       <w:r>
@@ -9608,7 +9868,7 @@
         <w:pStyle w:val="Compact"/>
         <w:numPr>
           <w:ilvl w:val="0"/>
-          <w:numId w:val="1016"/>
+          <w:numId w:val="1017"/>
         </w:numPr>
       </w:pPr>
       <w:r>
@@ -9641,7 +9901,7 @@
         <w:pStyle w:val="Compact"/>
         <w:numPr>
           <w:ilvl w:val="0"/>
-          <w:numId w:val="1016"/>
+          <w:numId w:val="1017"/>
         </w:numPr>
       </w:pPr>
       <w:r>
@@ -9680,7 +9940,7 @@
         <w:pStyle w:val="Compact"/>
         <w:numPr>
           <w:ilvl w:val="0"/>
-          <w:numId w:val="1016"/>
+          <w:numId w:val="1017"/>
         </w:numPr>
       </w:pPr>
       <w:r>
@@ -9701,7 +9961,7 @@
         <w:pStyle w:val="Compact"/>
         <w:numPr>
           <w:ilvl w:val="0"/>
-          <w:numId w:val="1016"/>
+          <w:numId w:val="1017"/>
         </w:numPr>
       </w:pPr>
       <w:r>
@@ -9737,7 +9997,7 @@
         <w:pStyle w:val="Compact"/>
         <w:numPr>
           <w:ilvl w:val="0"/>
-          <w:numId w:val="1016"/>
+          <w:numId w:val="1017"/>
         </w:numPr>
       </w:pPr>
       <w:r>
@@ -9776,7 +10036,7 @@
         <w:pStyle w:val="Compact"/>
         <w:numPr>
           <w:ilvl w:val="0"/>
-          <w:numId w:val="1016"/>
+          <w:numId w:val="1017"/>
         </w:numPr>
       </w:pPr>
       <w:r>
@@ -9812,7 +10072,7 @@
         <w:pStyle w:val="Compact"/>
         <w:numPr>
           <w:ilvl w:val="0"/>
-          <w:numId w:val="1016"/>
+          <w:numId w:val="1017"/>
         </w:numPr>
       </w:pPr>
       <w:r>
@@ -9833,7 +10093,7 @@
         <w:pStyle w:val="Compact"/>
         <w:numPr>
           <w:ilvl w:val="0"/>
-          <w:numId w:val="1016"/>
+          <w:numId w:val="1017"/>
         </w:numPr>
       </w:pPr>
       <w:r>
@@ -9905,7 +10165,7 @@
         <w:pStyle w:val="Compact"/>
         <w:numPr>
           <w:ilvl w:val="0"/>
-          <w:numId w:val="1016"/>
+          <w:numId w:val="1017"/>
         </w:numPr>
       </w:pPr>
       <w:r>
@@ -9932,7 +10192,7 @@
         <w:pStyle w:val="Compact"/>
         <w:numPr>
           <w:ilvl w:val="0"/>
-          <w:numId w:val="1016"/>
+          <w:numId w:val="1017"/>
         </w:numPr>
       </w:pPr>
       <w:r>
@@ -11183,7 +11443,7 @@
         <w:pStyle w:val="Compact"/>
         <w:numPr>
           <w:ilvl w:val="0"/>
-          <w:numId w:val="1017"/>
+          <w:numId w:val="1018"/>
         </w:numPr>
       </w:pPr>
       <w:r>
@@ -11221,7 +11481,7 @@
         <w:pStyle w:val="Compact"/>
         <w:numPr>
           <w:ilvl w:val="0"/>
-          <w:numId w:val="1017"/>
+          <w:numId w:val="1018"/>
         </w:numPr>
       </w:pPr>
       <w:r>
@@ -11243,7 +11503,7 @@
         <w:pStyle w:val="Compact"/>
         <w:numPr>
           <w:ilvl w:val="0"/>
-          <w:numId w:val="1017"/>
+          <w:numId w:val="1018"/>
         </w:numPr>
       </w:pPr>
       <w:r>
@@ -11265,7 +11525,7 @@
         <w:pStyle w:val="Compact"/>
         <w:numPr>
           <w:ilvl w:val="0"/>
-          <w:numId w:val="1017"/>
+          <w:numId w:val="1018"/>
         </w:numPr>
       </w:pPr>
       <w:r>
@@ -11287,7 +11547,7 @@
         <w:pStyle w:val="Compact"/>
         <w:numPr>
           <w:ilvl w:val="0"/>
-          <w:numId w:val="1017"/>
+          <w:numId w:val="1018"/>
         </w:numPr>
       </w:pPr>
       <w:r>
@@ -11309,7 +11569,7 @@
         <w:pStyle w:val="Compact"/>
         <w:numPr>
           <w:ilvl w:val="0"/>
-          <w:numId w:val="1017"/>
+          <w:numId w:val="1018"/>
         </w:numPr>
       </w:pPr>
       <w:r>
@@ -11347,7 +11607,7 @@
         <w:pStyle w:val="Compact"/>
         <w:numPr>
           <w:ilvl w:val="0"/>
-          <w:numId w:val="1017"/>
+          <w:numId w:val="1018"/>
         </w:numPr>
       </w:pPr>
       <w:r>
@@ -11385,7 +11645,7 @@
         <w:pStyle w:val="Compact"/>
         <w:numPr>
           <w:ilvl w:val="0"/>
-          <w:numId w:val="1017"/>
+          <w:numId w:val="1018"/>
         </w:numPr>
       </w:pPr>
       <w:r>
@@ -11407,7 +11667,7 @@
         <w:pStyle w:val="Compact"/>
         <w:numPr>
           <w:ilvl w:val="0"/>
-          <w:numId w:val="1017"/>
+          <w:numId w:val="1018"/>
         </w:numPr>
       </w:pPr>
       <w:r>
@@ -11429,7 +11689,7 @@
         <w:pStyle w:val="Compact"/>
         <w:numPr>
           <w:ilvl w:val="0"/>
-          <w:numId w:val="1017"/>
+          <w:numId w:val="1018"/>
         </w:numPr>
       </w:pPr>
       <w:r>
@@ -11451,7 +11711,7 @@
         <w:pStyle w:val="Compact"/>
         <w:numPr>
           <w:ilvl w:val="0"/>
-          <w:numId w:val="1017"/>
+          <w:numId w:val="1018"/>
         </w:numPr>
       </w:pPr>
       <w:r>
@@ -11473,7 +11733,7 @@
         <w:pStyle w:val="Compact"/>
         <w:numPr>
           <w:ilvl w:val="0"/>
-          <w:numId w:val="1017"/>
+          <w:numId w:val="1018"/>
         </w:numPr>
       </w:pPr>
       <w:r>
@@ -11507,7 +11767,7 @@
         <w:pStyle w:val="Compact"/>
         <w:numPr>
           <w:ilvl w:val="0"/>
-          <w:numId w:val="1017"/>
+          <w:numId w:val="1018"/>
         </w:numPr>
       </w:pPr>
       <w:r>
@@ -11529,7 +11789,7 @@
         <w:pStyle w:val="Compact"/>
         <w:numPr>
           <w:ilvl w:val="0"/>
-          <w:numId w:val="1017"/>
+          <w:numId w:val="1018"/>
         </w:numPr>
       </w:pPr>
       <w:r>
@@ -11563,7 +11823,7 @@
         <w:pStyle w:val="Compact"/>
         <w:numPr>
           <w:ilvl w:val="0"/>
-          <w:numId w:val="1017"/>
+          <w:numId w:val="1018"/>
         </w:numPr>
       </w:pPr>
       <w:r>
@@ -12753,34 +13013,7 @@
     </w:lvlOverride>
   </w:num>
   <w:num w:numId="1015">
-    <w:abstractNumId w:val="99411"/>
-    <w:lvlOverride w:ilvl="0">
-      <w:startOverride w:val="1"/>
-    </w:lvlOverride>
-    <w:lvlOverride w:ilvl="1">
-      <w:startOverride w:val="1"/>
-    </w:lvlOverride>
-    <w:lvlOverride w:ilvl="2">
-      <w:startOverride w:val="1"/>
-    </w:lvlOverride>
-    <w:lvlOverride w:ilvl="3">
-      <w:startOverride w:val="1"/>
-    </w:lvlOverride>
-    <w:lvlOverride w:ilvl="4">
-      <w:startOverride w:val="1"/>
-    </w:lvlOverride>
-    <w:lvlOverride w:ilvl="5">
-      <w:startOverride w:val="1"/>
-    </w:lvlOverride>
-    <w:lvlOverride w:ilvl="6">
-      <w:startOverride w:val="1"/>
-    </w:lvlOverride>
-    <w:lvlOverride w:ilvl="7">
-      <w:startOverride w:val="1"/>
-    </w:lvlOverride>
-    <w:lvlOverride w:ilvl="8">
-      <w:startOverride w:val="1"/>
-    </w:lvlOverride>
+    <w:abstractNumId w:val="991"/>
   </w:num>
   <w:num w:numId="1016">
     <w:abstractNumId w:val="99411"/>
@@ -12813,6 +13046,36 @@
     </w:lvlOverride>
   </w:num>
   <w:num w:numId="1017">
+    <w:abstractNumId w:val="99411"/>
+    <w:lvlOverride w:ilvl="0">
+      <w:startOverride w:val="1"/>
+    </w:lvlOverride>
+    <w:lvlOverride w:ilvl="1">
+      <w:startOverride w:val="1"/>
+    </w:lvlOverride>
+    <w:lvlOverride w:ilvl="2">
+      <w:startOverride w:val="1"/>
+    </w:lvlOverride>
+    <w:lvlOverride w:ilvl="3">
+      <w:startOverride w:val="1"/>
+    </w:lvlOverride>
+    <w:lvlOverride w:ilvl="4">
+      <w:startOverride w:val="1"/>
+    </w:lvlOverride>
+    <w:lvlOverride w:ilvl="5">
+      <w:startOverride w:val="1"/>
+    </w:lvlOverride>
+    <w:lvlOverride w:ilvl="6">
+      <w:startOverride w:val="1"/>
+    </w:lvlOverride>
+    <w:lvlOverride w:ilvl="7">
+      <w:startOverride w:val="1"/>
+    </w:lvlOverride>
+    <w:lvlOverride w:ilvl="8">
+      <w:startOverride w:val="1"/>
+    </w:lvlOverride>
+  </w:num>
+  <w:num w:numId="1018">
     <w:abstractNumId w:val="991"/>
   </w:num>
 </w:numbering>

</xml_diff>

<commit_message>
CSP hardening + body-image fix; credential rotation; docs refresh
- Fix: 151 article pages had broken inline images — CMS markdown embeds
  relative /uploads paths; the sanitization boundary now absolutizes
  src/href against the CMS origin (unit-tested; verified in output)
- CSP: object-src 'none', frame-src 'none', HSTS added
- Credential rotation: read-only token verified (200 read / 403 write),
  stored as masked Netlify secret (prod/preview contexts only; previous
  copy was API-readable plaintext); old-token deletion pending in Strapi
- Plan doc + README: first-draft status reflects executed walkthrough,
  fidelity passes, link sweep, hardening; docx rebuilt (0 fields)
</commit_message>
<xml_diff>
--- a/docs/ICJIA-Hub-20-rewrite-copperhead.docx
+++ b/docs/ICJIA-Hub-20-rewrite-copperhead.docx
@@ -3763,7 +3763,7 @@
         </w:numPr>
       </w:pPr>
       <w:r>
-        <w:t xml:space="preserve">Visual design has not been reviewed against the Figma mockups by its designer; polish passes will follow.</w:t>
+        <w:t xml:space="preserve">Two design-fidelity passes now track the Figma mockups across all built sections (hero bands, card treatments, filter/sort controls, header/footer chrome); the designer’s formal review remains, and a handful of designed elements await pages that don’t exist on the main site yet (Partners, Grant Status Request, Terms of Use, the language/translate bar — documented for coordination).</w:t>
       </w:r>
     </w:p>
     <w:p>
@@ -3815,7 +3815,23 @@
         </w:numPr>
       </w:pPr>
       <w:r>
-        <w:t xml:space="preserve">A human accessibility walkthrough, a content-freeze rehearsal, and the launch-day checklist remain — all scripted in the project runbook.</w:t>
+        <w:t xml:space="preserve">The manual accessibility walkthrough has been</w:t>
+      </w:r>
+      <w:r>
+        <w:t xml:space="preserve"> </w:t>
+      </w:r>
+      <w:r>
+        <w:rPr>
+          <w:b/>
+          <w:bCs/>
+        </w:rPr>
+        <w:t xml:space="preserve">executed and passed clean</w:t>
+      </w:r>
+      <w:r>
+        <w:t xml:space="preserve"> </w:t>
+      </w:r>
+      <w:r>
+        <w:t xml:space="preserve">(keyboard operability, small-screen reflow, motion preferences — findings fixed same-day and memoed); a live screen-reader listening session, a content-freeze rehearsal, and the launch-day checklist remain — all scripted in the project runbook.</w:t>
       </w:r>
     </w:p>
     <w:p>
@@ -4142,13 +4158,13 @@
                 <w:b/>
                 <w:bCs/>
               </w:rPr>
-              <w:t xml:space="preserve">First draft built.</w:t>
-            </w:r>
-            <w:r>
-              <w:t xml:space="preserve"> </w:t>
-            </w:r>
-            <w:r>
-              <w:t xml:space="preserve">Performance budgets enforced on all five key templates (0.91–0.96; the 42-card listing at 0.84 with a documented floor and follow-up); security headers including a strict content-security policy; keyboard-navigation tests joined the accessibility suite (30 automated checks); dependency audit clean at runtime (zero production exposure) with weekly automated update PRs; the</w:t>
+              <w:t xml:space="preserve">First draft built; walkthrough passed.</w:t>
+            </w:r>
+            <w:r>
+              <w:t xml:space="preserve"> </w:t>
+            </w:r>
+            <w:r>
+              <w:t xml:space="preserve">The manual accessibility walkthrough has been executed across every template in both color themes and passed clean (its findings — small-screen reflow, motion preferences — were fixed the same day); a strict content-security policy and security headers are live and verified; every header/footer link was audited against the main site’s real page inventory (ten dead links fixed); the build-time CMS credential was rotated to read-only and stored as a masked secret. Performance budgets enforced on all five key templates (0.91–0.96; the 42-card listing at 0.84 with a documented floor and follow-up); security headers including a strict content-security policy; keyboard-navigation tests joined the accessibility suite (30 automated checks); dependency audit clean at runtime (zero production exposure) with weekly automated update PRs; the</w:t>
             </w:r>
             <w:r>
               <w:t xml:space="preserve"> </w:t>

</xml_diff>

<commit_message>
docs: July 11 refinements in rewrite plan; toast retitled 'Reference N'
Progress section gains the reader-experience block (tables, in-place
Load More, smooth TOC, reference pop-up, site-wide footnote fix with
the 9-article CMS correction package, performance-gate catch); unit
count refreshed. Docx rebuilt: 0 fields, 19 anchors resolved.
</commit_message>
<xml_diff>
--- a/docs/ICJIA-Hub-20-rewrite-copperhead.docx
+++ b/docs/ICJIA-Hub-20-rewrite-copperhead.docx
@@ -4234,12 +4234,218 @@
         <w:t xml:space="preserve"> </w:t>
       </w:r>
       <w:r>
-        <w:t xml:space="preserve">— a draft for internal review only, blocked from search engines until launch. ~540 pages rebuild in about ten seconds; every change passes 41 unit tests, 30 accessibility checks, and performance budgets before it can deploy.</w:t>
+        <w:t xml:space="preserve">— a draft for internal review only, blocked from search engines until launch. ~540 pages rebuild in about ten seconds; every change passes 46 unit tests, 30 accessibility checks, and performance budgets before it can deploy.</w:t>
       </w:r>
     </w:p>
     <w:p>
       <w:pPr>
         <w:pStyle w:val="BodyText"/>
+      </w:pPr>
+      <w:r>
+        <w:rPr>
+          <w:b/>
+          <w:bCs/>
+        </w:rPr>
+        <w:t xml:space="preserve">Reader-experience refinements (added later on July 11):</w:t>
+      </w:r>
+      <w:r>
+        <w:t xml:space="preserve"> </w:t>
+      </w:r>
+      <w:r>
+        <w:t xml:space="preserve">a round of polish driven by hands-on review of the draft, all live on the preview:</w:t>
+      </w:r>
+    </w:p>
+    <w:p>
+      <w:pPr>
+        <w:pStyle w:val="Compact"/>
+        <w:numPr>
+          <w:ilvl w:val="0"/>
+          <w:numId w:val="1016"/>
+        </w:numPr>
+      </w:pPr>
+      <w:r>
+        <w:rPr>
+          <w:b/>
+          <w:bCs/>
+        </w:rPr>
+        <w:t xml:space="preserve">Data tables</w:t>
+      </w:r>
+      <w:r>
+        <w:t xml:space="preserve"> </w:t>
+      </w:r>
+      <w:r>
+        <w:t xml:space="preserve">in articles and datasets are restyled — alternating row shading for scanability and full-width layout at any column count, in both light and dark themes.</w:t>
+      </w:r>
+    </w:p>
+    <w:p>
+      <w:pPr>
+        <w:pStyle w:val="Compact"/>
+        <w:numPr>
+          <w:ilvl w:val="0"/>
+          <w:numId w:val="1016"/>
+        </w:numPr>
+      </w:pPr>
+      <w:r>
+        <w:rPr>
+          <w:b/>
+          <w:bCs/>
+        </w:rPr>
+        <w:t xml:space="preserve">“Load More Articles”</w:t>
+      </w:r>
+      <w:r>
+        <w:t xml:space="preserve"> </w:t>
+      </w:r>
+      <w:r>
+        <w:t xml:space="preserve">now works in place: a loading indicator appears, the new articles render below, and the page never moves. Article</w:t>
+      </w:r>
+      <w:r>
+        <w:t xml:space="preserve"> </w:t>
+      </w:r>
+      <w:r>
+        <w:rPr>
+          <w:b/>
+          <w:bCs/>
+        </w:rPr>
+        <w:t xml:space="preserve">table-of-contents links</w:t>
+      </w:r>
+      <w:r>
+        <w:t xml:space="preserve"> </w:t>
+      </w:r>
+      <w:r>
+        <w:t xml:space="preserve">glide smoothly to their section instead of jumping.</w:t>
+      </w:r>
+    </w:p>
+    <w:p>
+      <w:pPr>
+        <w:pStyle w:val="Compact"/>
+        <w:numPr>
+          <w:ilvl w:val="0"/>
+          <w:numId w:val="1016"/>
+        </w:numPr>
+      </w:pPr>
+      <w:r>
+        <w:rPr>
+          <w:b/>
+          <w:bCs/>
+        </w:rPr>
+        <w:t xml:space="preserve">Footnote references open in a small pop-up card</w:t>
+      </w:r>
+      <w:r>
+        <w:t xml:space="preserve"> </w:t>
+      </w:r>
+      <w:r>
+        <w:t xml:space="preserve">(with the citation and a link to its source) so readers keep their place in the article instead of being thrown to the bottom of the page; the full reference list still prints at the article’s end. The pop-up meets WCAG 2.1 AA contrast in both themes.</w:t>
+      </w:r>
+    </w:p>
+    <w:p>
+      <w:pPr>
+        <w:pStyle w:val="Compact"/>
+        <w:numPr>
+          <w:ilvl w:val="0"/>
+          <w:numId w:val="1016"/>
+        </w:numPr>
+      </w:pPr>
+      <w:r>
+        <w:rPr>
+          <w:b/>
+          <w:bCs/>
+        </w:rPr>
+        <w:t xml:space="preserve">A site-wide footnote defect was found and fixed the same day:</w:t>
+      </w:r>
+      <w:r>
+        <w:t xml:space="preserve"> </w:t>
+      </w:r>
+      <w:r>
+        <w:t xml:space="preserve">52 articles were displaying raw footnote codes (like</w:t>
+      </w:r>
+      <w:r>
+        <w:t xml:space="preserve"> </w:t>
+      </w:r>
+      <w:r>
+        <w:rPr>
+          <w:rStyle w:val="VerbatimChar"/>
+        </w:rPr>
+        <w:t xml:space="preserve">[^6]</w:t>
+      </w:r>
+      <w:r>
+        <w:t xml:space="preserve">) instead of numbered references — a long-standing content-formatting quirk the old Hub tolerated silently. The new rendering pipeline now corrects 43 of them automatically; the remaining 9 have defects in the stored article text itself, and a</w:t>
+      </w:r>
+      <w:r>
+        <w:t xml:space="preserve"> </w:t>
+      </w:r>
+      <w:r>
+        <w:rPr>
+          <w:b/>
+          <w:bCs/>
+        </w:rPr>
+        <w:t xml:space="preserve">paste-ready correction package</w:t>
+      </w:r>
+      <w:r>
+        <w:t xml:space="preserve"> </w:t>
+      </w:r>
+      <w:r>
+        <w:t xml:space="preserve">for the CMS sits in the repository (</w:t>
+      </w:r>
+      <w:r>
+        <w:rPr>
+          <w:rStyle w:val="VerbatimChar"/>
+        </w:rPr>
+        <w:t xml:space="preserve">docs/footnote-fixes/</w:t>
+      </w:r>
+      <w:r>
+        <w:t xml:space="preserve">), including two lost citations recovered from the original PDF report and one article whose references 3–14 were silently pointing at the</w:t>
+      </w:r>
+      <w:r>
+        <w:t xml:space="preserve"> </w:t>
+      </w:r>
+      <w:r>
+        <w:rPr>
+          <w:i/>
+          <w:iCs/>
+        </w:rPr>
+        <w:t xml:space="preserve">wrong</w:t>
+      </w:r>
+      <w:r>
+        <w:t xml:space="preserve"> </w:t>
+      </w:r>
+      <w:r>
+        <w:t xml:space="preserve">sources.</w:t>
+      </w:r>
+    </w:p>
+    <w:p>
+      <w:pPr>
+        <w:pStyle w:val="Compact"/>
+        <w:numPr>
+          <w:ilvl w:val="0"/>
+          <w:numId w:val="1016"/>
+        </w:numPr>
+      </w:pPr>
+      <w:r>
+        <w:rPr>
+          <w:b/>
+          <w:bCs/>
+        </w:rPr>
+        <w:t xml:space="preserve">The automated guardrails earned their keep:</w:t>
+      </w:r>
+      <w:r>
+        <w:t xml:space="preserve"> </w:t>
+      </w:r>
+      <w:r>
+        <w:t xml:space="preserve">the performance gate caught a small page-speed regression introduced by one of these fixes and blocked it; it was corrected and re-shipped within the hour. A related image bug (thumbnails failing to load on articles revealed by</w:t>
+      </w:r>
+      <w:r>
+        <w:t xml:space="preserve"> </w:t>
+      </w:r>
+      <w:r>
+        <w:t xml:space="preserve">“Load More”</w:t>
+      </w:r>
+      <w:r>
+        <w:t xml:space="preserve">) was also found and fixed.</w:t>
+      </w:r>
+    </w:p>
+    <w:p>
+      <w:pPr>
+        <w:pStyle w:val="FirstParagraph"/>
       </w:pPr>
       <w:r>
         <w:rPr>
@@ -5964,7 +6170,7 @@
         <w:pStyle w:val="Compact"/>
         <w:numPr>
           <w:ilvl w:val="0"/>
-          <w:numId w:val="1016"/>
+          <w:numId w:val="1017"/>
         </w:numPr>
       </w:pPr>
       <w:r>
@@ -5986,7 +6192,7 @@
         <w:pStyle w:val="Compact"/>
         <w:numPr>
           <w:ilvl w:val="0"/>
-          <w:numId w:val="1016"/>
+          <w:numId w:val="1017"/>
         </w:numPr>
       </w:pPr>
       <w:r>
@@ -6008,7 +6214,7 @@
         <w:pStyle w:val="Compact"/>
         <w:numPr>
           <w:ilvl w:val="0"/>
-          <w:numId w:val="1016"/>
+          <w:numId w:val="1017"/>
         </w:numPr>
       </w:pPr>
       <w:r>
@@ -6030,7 +6236,7 @@
         <w:pStyle w:val="Compact"/>
         <w:numPr>
           <w:ilvl w:val="0"/>
-          <w:numId w:val="1016"/>
+          <w:numId w:val="1017"/>
         </w:numPr>
       </w:pPr>
       <w:r>
@@ -6052,7 +6258,7 @@
         <w:pStyle w:val="Compact"/>
         <w:numPr>
           <w:ilvl w:val="0"/>
-          <w:numId w:val="1016"/>
+          <w:numId w:val="1017"/>
         </w:numPr>
       </w:pPr>
       <w:r>
@@ -6102,7 +6308,7 @@
         <w:pStyle w:val="Compact"/>
         <w:numPr>
           <w:ilvl w:val="0"/>
-          <w:numId w:val="1016"/>
+          <w:numId w:val="1017"/>
         </w:numPr>
       </w:pPr>
       <w:r>
@@ -6124,7 +6330,7 @@
         <w:pStyle w:val="Compact"/>
         <w:numPr>
           <w:ilvl w:val="0"/>
-          <w:numId w:val="1016"/>
+          <w:numId w:val="1017"/>
         </w:numPr>
       </w:pPr>
       <w:r>
@@ -6146,7 +6352,7 @@
         <w:pStyle w:val="Compact"/>
         <w:numPr>
           <w:ilvl w:val="0"/>
-          <w:numId w:val="1016"/>
+          <w:numId w:val="1017"/>
         </w:numPr>
       </w:pPr>
       <w:r>
@@ -9335,7 +9541,7 @@
         <w:pStyle w:val="Compact"/>
         <w:numPr>
           <w:ilvl w:val="0"/>
-          <w:numId w:val="1017"/>
+          <w:numId w:val="1018"/>
         </w:numPr>
       </w:pPr>
       <w:r>
@@ -9371,7 +9577,7 @@
         <w:pStyle w:val="Compact"/>
         <w:numPr>
           <w:ilvl w:val="0"/>
-          <w:numId w:val="1017"/>
+          <w:numId w:val="1018"/>
         </w:numPr>
       </w:pPr>
       <w:r>
@@ -9413,7 +9619,7 @@
         <w:pStyle w:val="Compact"/>
         <w:numPr>
           <w:ilvl w:val="0"/>
-          <w:numId w:val="1017"/>
+          <w:numId w:val="1018"/>
         </w:numPr>
       </w:pPr>
       <w:r>
@@ -9455,7 +9661,7 @@
         <w:pStyle w:val="Compact"/>
         <w:numPr>
           <w:ilvl w:val="0"/>
-          <w:numId w:val="1017"/>
+          <w:numId w:val="1018"/>
         </w:numPr>
       </w:pPr>
       <w:r>
@@ -9467,7 +9673,7 @@
         <w:pStyle w:val="Compact"/>
         <w:numPr>
           <w:ilvl w:val="0"/>
-          <w:numId w:val="1017"/>
+          <w:numId w:val="1018"/>
         </w:numPr>
       </w:pPr>
       <w:r>
@@ -9479,7 +9685,7 @@
         <w:pStyle w:val="Compact"/>
         <w:numPr>
           <w:ilvl w:val="0"/>
-          <w:numId w:val="1017"/>
+          <w:numId w:val="1018"/>
         </w:numPr>
       </w:pPr>
       <w:r>
@@ -9542,7 +9748,7 @@
         <w:pStyle w:val="Compact"/>
         <w:numPr>
           <w:ilvl w:val="0"/>
-          <w:numId w:val="1017"/>
+          <w:numId w:val="1018"/>
         </w:numPr>
       </w:pPr>
       <w:r>
@@ -9587,7 +9793,7 @@
         <w:pStyle w:val="Compact"/>
         <w:numPr>
           <w:ilvl w:val="0"/>
-          <w:numId w:val="1017"/>
+          <w:numId w:val="1018"/>
         </w:numPr>
       </w:pPr>
       <w:r>
@@ -9599,7 +9805,7 @@
         <w:pStyle w:val="Compact"/>
         <w:numPr>
           <w:ilvl w:val="0"/>
-          <w:numId w:val="1017"/>
+          <w:numId w:val="1018"/>
         </w:numPr>
       </w:pPr>
       <w:r>
@@ -9641,7 +9847,7 @@
         <w:pStyle w:val="Compact"/>
         <w:numPr>
           <w:ilvl w:val="0"/>
-          <w:numId w:val="1017"/>
+          <w:numId w:val="1018"/>
         </w:numPr>
       </w:pPr>
       <w:r>
@@ -9680,7 +9886,7 @@
         <w:pStyle w:val="Compact"/>
         <w:numPr>
           <w:ilvl w:val="0"/>
-          <w:numId w:val="1017"/>
+          <w:numId w:val="1018"/>
         </w:numPr>
       </w:pPr>
       <w:r>
@@ -9692,7 +9898,7 @@
         <w:pStyle w:val="Compact"/>
         <w:numPr>
           <w:ilvl w:val="0"/>
-          <w:numId w:val="1017"/>
+          <w:numId w:val="1018"/>
         </w:numPr>
       </w:pPr>
       <w:r>
@@ -9710,7 +9916,7 @@
         <w:pStyle w:val="Compact"/>
         <w:numPr>
           <w:ilvl w:val="0"/>
-          <w:numId w:val="1017"/>
+          <w:numId w:val="1018"/>
         </w:numPr>
       </w:pPr>
       <w:r>
@@ -9722,7 +9928,7 @@
         <w:pStyle w:val="Compact"/>
         <w:numPr>
           <w:ilvl w:val="0"/>
-          <w:numId w:val="1017"/>
+          <w:numId w:val="1018"/>
         </w:numPr>
       </w:pPr>
       <w:r>
@@ -9752,7 +9958,7 @@
         <w:pStyle w:val="Compact"/>
         <w:numPr>
           <w:ilvl w:val="0"/>
-          <w:numId w:val="1017"/>
+          <w:numId w:val="1018"/>
         </w:numPr>
       </w:pPr>
       <w:r>
@@ -9779,7 +9985,7 @@
         <w:pStyle w:val="Compact"/>
         <w:numPr>
           <w:ilvl w:val="0"/>
-          <w:numId w:val="1017"/>
+          <w:numId w:val="1018"/>
         </w:numPr>
       </w:pPr>
       <w:r>
@@ -9791,7 +9997,7 @@
         <w:pStyle w:val="Compact"/>
         <w:numPr>
           <w:ilvl w:val="0"/>
-          <w:numId w:val="1017"/>
+          <w:numId w:val="1018"/>
         </w:numPr>
       </w:pPr>
       <w:r>
@@ -9815,7 +10021,7 @@
         <w:pStyle w:val="Compact"/>
         <w:numPr>
           <w:ilvl w:val="0"/>
-          <w:numId w:val="1017"/>
+          <w:numId w:val="1018"/>
         </w:numPr>
       </w:pPr>
       <w:r>
@@ -9836,7 +10042,7 @@
         <w:pStyle w:val="Compact"/>
         <w:numPr>
           <w:ilvl w:val="0"/>
-          <w:numId w:val="1017"/>
+          <w:numId w:val="1018"/>
         </w:numPr>
       </w:pPr>
       <w:r>
@@ -9848,7 +10054,7 @@
         <w:pStyle w:val="Compact"/>
         <w:numPr>
           <w:ilvl w:val="0"/>
-          <w:numId w:val="1017"/>
+          <w:numId w:val="1018"/>
         </w:numPr>
       </w:pPr>
       <w:r>
@@ -9884,7 +10090,7 @@
         <w:pStyle w:val="Compact"/>
         <w:numPr>
           <w:ilvl w:val="0"/>
-          <w:numId w:val="1017"/>
+          <w:numId w:val="1018"/>
         </w:numPr>
       </w:pPr>
       <w:r>
@@ -9917,7 +10123,7 @@
         <w:pStyle w:val="Compact"/>
         <w:numPr>
           <w:ilvl w:val="0"/>
-          <w:numId w:val="1017"/>
+          <w:numId w:val="1018"/>
         </w:numPr>
       </w:pPr>
       <w:r>
@@ -9956,7 +10162,7 @@
         <w:pStyle w:val="Compact"/>
         <w:numPr>
           <w:ilvl w:val="0"/>
-          <w:numId w:val="1017"/>
+          <w:numId w:val="1018"/>
         </w:numPr>
       </w:pPr>
       <w:r>
@@ -9977,7 +10183,7 @@
         <w:pStyle w:val="Compact"/>
         <w:numPr>
           <w:ilvl w:val="0"/>
-          <w:numId w:val="1017"/>
+          <w:numId w:val="1018"/>
         </w:numPr>
       </w:pPr>
       <w:r>
@@ -10013,7 +10219,7 @@
         <w:pStyle w:val="Compact"/>
         <w:numPr>
           <w:ilvl w:val="0"/>
-          <w:numId w:val="1017"/>
+          <w:numId w:val="1018"/>
         </w:numPr>
       </w:pPr>
       <w:r>
@@ -10052,7 +10258,7 @@
         <w:pStyle w:val="Compact"/>
         <w:numPr>
           <w:ilvl w:val="0"/>
-          <w:numId w:val="1017"/>
+          <w:numId w:val="1018"/>
         </w:numPr>
       </w:pPr>
       <w:r>
@@ -10088,7 +10294,7 @@
         <w:pStyle w:val="Compact"/>
         <w:numPr>
           <w:ilvl w:val="0"/>
-          <w:numId w:val="1017"/>
+          <w:numId w:val="1018"/>
         </w:numPr>
       </w:pPr>
       <w:r>
@@ -10109,7 +10315,7 @@
         <w:pStyle w:val="Compact"/>
         <w:numPr>
           <w:ilvl w:val="0"/>
-          <w:numId w:val="1017"/>
+          <w:numId w:val="1018"/>
         </w:numPr>
       </w:pPr>
       <w:r>
@@ -10181,7 +10387,7 @@
         <w:pStyle w:val="Compact"/>
         <w:numPr>
           <w:ilvl w:val="0"/>
-          <w:numId w:val="1017"/>
+          <w:numId w:val="1018"/>
         </w:numPr>
       </w:pPr>
       <w:r>
@@ -10208,7 +10414,7 @@
         <w:pStyle w:val="Compact"/>
         <w:numPr>
           <w:ilvl w:val="0"/>
-          <w:numId w:val="1017"/>
+          <w:numId w:val="1018"/>
         </w:numPr>
       </w:pPr>
       <w:r>
@@ -11459,7 +11665,7 @@
         <w:pStyle w:val="Compact"/>
         <w:numPr>
           <w:ilvl w:val="0"/>
-          <w:numId w:val="1018"/>
+          <w:numId w:val="1019"/>
         </w:numPr>
       </w:pPr>
       <w:r>
@@ -11497,7 +11703,7 @@
         <w:pStyle w:val="Compact"/>
         <w:numPr>
           <w:ilvl w:val="0"/>
-          <w:numId w:val="1018"/>
+          <w:numId w:val="1019"/>
         </w:numPr>
       </w:pPr>
       <w:r>
@@ -11519,7 +11725,7 @@
         <w:pStyle w:val="Compact"/>
         <w:numPr>
           <w:ilvl w:val="0"/>
-          <w:numId w:val="1018"/>
+          <w:numId w:val="1019"/>
         </w:numPr>
       </w:pPr>
       <w:r>
@@ -11541,7 +11747,7 @@
         <w:pStyle w:val="Compact"/>
         <w:numPr>
           <w:ilvl w:val="0"/>
-          <w:numId w:val="1018"/>
+          <w:numId w:val="1019"/>
         </w:numPr>
       </w:pPr>
       <w:r>
@@ -11563,7 +11769,7 @@
         <w:pStyle w:val="Compact"/>
         <w:numPr>
           <w:ilvl w:val="0"/>
-          <w:numId w:val="1018"/>
+          <w:numId w:val="1019"/>
         </w:numPr>
       </w:pPr>
       <w:r>
@@ -11585,7 +11791,7 @@
         <w:pStyle w:val="Compact"/>
         <w:numPr>
           <w:ilvl w:val="0"/>
-          <w:numId w:val="1018"/>
+          <w:numId w:val="1019"/>
         </w:numPr>
       </w:pPr>
       <w:r>
@@ -11623,7 +11829,7 @@
         <w:pStyle w:val="Compact"/>
         <w:numPr>
           <w:ilvl w:val="0"/>
-          <w:numId w:val="1018"/>
+          <w:numId w:val="1019"/>
         </w:numPr>
       </w:pPr>
       <w:r>
@@ -11661,7 +11867,7 @@
         <w:pStyle w:val="Compact"/>
         <w:numPr>
           <w:ilvl w:val="0"/>
-          <w:numId w:val="1018"/>
+          <w:numId w:val="1019"/>
         </w:numPr>
       </w:pPr>
       <w:r>
@@ -11683,7 +11889,7 @@
         <w:pStyle w:val="Compact"/>
         <w:numPr>
           <w:ilvl w:val="0"/>
-          <w:numId w:val="1018"/>
+          <w:numId w:val="1019"/>
         </w:numPr>
       </w:pPr>
       <w:r>
@@ -11705,7 +11911,7 @@
         <w:pStyle w:val="Compact"/>
         <w:numPr>
           <w:ilvl w:val="0"/>
-          <w:numId w:val="1018"/>
+          <w:numId w:val="1019"/>
         </w:numPr>
       </w:pPr>
       <w:r>
@@ -11727,7 +11933,7 @@
         <w:pStyle w:val="Compact"/>
         <w:numPr>
           <w:ilvl w:val="0"/>
-          <w:numId w:val="1018"/>
+          <w:numId w:val="1019"/>
         </w:numPr>
       </w:pPr>
       <w:r>
@@ -11749,7 +11955,7 @@
         <w:pStyle w:val="Compact"/>
         <w:numPr>
           <w:ilvl w:val="0"/>
-          <w:numId w:val="1018"/>
+          <w:numId w:val="1019"/>
         </w:numPr>
       </w:pPr>
       <w:r>
@@ -11783,7 +11989,7 @@
         <w:pStyle w:val="Compact"/>
         <w:numPr>
           <w:ilvl w:val="0"/>
-          <w:numId w:val="1018"/>
+          <w:numId w:val="1019"/>
         </w:numPr>
       </w:pPr>
       <w:r>
@@ -11805,7 +12011,7 @@
         <w:pStyle w:val="Compact"/>
         <w:numPr>
           <w:ilvl w:val="0"/>
-          <w:numId w:val="1018"/>
+          <w:numId w:val="1019"/>
         </w:numPr>
       </w:pPr>
       <w:r>
@@ -11839,7 +12045,7 @@
         <w:pStyle w:val="Compact"/>
         <w:numPr>
           <w:ilvl w:val="0"/>
-          <w:numId w:val="1018"/>
+          <w:numId w:val="1019"/>
         </w:numPr>
       </w:pPr>
       <w:r>
@@ -13032,34 +13238,7 @@
     <w:abstractNumId w:val="991"/>
   </w:num>
   <w:num w:numId="1016">
-    <w:abstractNumId w:val="99411"/>
-    <w:lvlOverride w:ilvl="0">
-      <w:startOverride w:val="1"/>
-    </w:lvlOverride>
-    <w:lvlOverride w:ilvl="1">
-      <w:startOverride w:val="1"/>
-    </w:lvlOverride>
-    <w:lvlOverride w:ilvl="2">
-      <w:startOverride w:val="1"/>
-    </w:lvlOverride>
-    <w:lvlOverride w:ilvl="3">
-      <w:startOverride w:val="1"/>
-    </w:lvlOverride>
-    <w:lvlOverride w:ilvl="4">
-      <w:startOverride w:val="1"/>
-    </w:lvlOverride>
-    <w:lvlOverride w:ilvl="5">
-      <w:startOverride w:val="1"/>
-    </w:lvlOverride>
-    <w:lvlOverride w:ilvl="6">
-      <w:startOverride w:val="1"/>
-    </w:lvlOverride>
-    <w:lvlOverride w:ilvl="7">
-      <w:startOverride w:val="1"/>
-    </w:lvlOverride>
-    <w:lvlOverride w:ilvl="8">
-      <w:startOverride w:val="1"/>
-    </w:lvlOverride>
+    <w:abstractNumId w:val="991"/>
   </w:num>
   <w:num w:numId="1017">
     <w:abstractNumId w:val="99411"/>
@@ -13092,6 +13271,36 @@
     </w:lvlOverride>
   </w:num>
   <w:num w:numId="1018">
+    <w:abstractNumId w:val="99411"/>
+    <w:lvlOverride w:ilvl="0">
+      <w:startOverride w:val="1"/>
+    </w:lvlOverride>
+    <w:lvlOverride w:ilvl="1">
+      <w:startOverride w:val="1"/>
+    </w:lvlOverride>
+    <w:lvlOverride w:ilvl="2">
+      <w:startOverride w:val="1"/>
+    </w:lvlOverride>
+    <w:lvlOverride w:ilvl="3">
+      <w:startOverride w:val="1"/>
+    </w:lvlOverride>
+    <w:lvlOverride w:ilvl="4">
+      <w:startOverride w:val="1"/>
+    </w:lvlOverride>
+    <w:lvlOverride w:ilvl="5">
+      <w:startOverride w:val="1"/>
+    </w:lvlOverride>
+    <w:lvlOverride w:ilvl="6">
+      <w:startOverride w:val="1"/>
+    </w:lvlOverride>
+    <w:lvlOverride w:ilvl="7">
+      <w:startOverride w:val="1"/>
+    </w:lvlOverride>
+    <w:lvlOverride w:ilvl="8">
+      <w:startOverride w:val="1"/>
+    </w:lvlOverride>
+  </w:num>
+  <w:num w:numId="1019">
     <w:abstractNumId w:val="991"/>
   </w:num>
 </w:numbering>

</xml_diff>

<commit_message>
docs: refresh spec doc to current state (July 16 progress section)
The rewrite/spec doc carried the version-keyed changelog and updated date,
but its narrative 'Progress update' section still read as of July 11. Adds
a 'Progress update — July 16, 2026' section covering the work shipped this
session — design-parity pass (v0.20-0.21), in-PDF search-term reader
(v0.22.0), gentle transitions + centers reveal fix (v0.23.0), and the
manager status/docs layer (v0.24.0) — plus the current 46 tests / 32 a11y
checks and the unchanged launch dependencies. Rebuilt the .docx
(field-code-free); the in-app /spec view and its downloads pick this up on
the next deploy.
</commit_message>
<xml_diff>
--- a/docs/ICJIA-Hub-20-rewrite-copperhead.docx
+++ b/docs/ICJIA-Hub-20-rewrite-copperhead.docx
@@ -813,6 +813,23 @@
       <w:pPr>
         <w:pStyle w:val="Compact"/>
         <w:numPr>
+          <w:ilvl w:val="1"/>
+          <w:numId w:val="1002"/>
+        </w:numPr>
+      </w:pPr>
+      <w:hyperlink w:anchor="progress-update--july-16-2026">
+        <w:r>
+          <w:rPr>
+            <w:rStyle w:val="Hyperlink"/>
+          </w:rPr>
+          <w:t xml:space="preserve">Progress update — July 16, 2026</w:t>
+        </w:r>
+      </w:hyperlink>
+    </w:p>
+    <w:p>
+      <w:pPr>
+        <w:pStyle w:val="Compact"/>
+        <w:numPr>
           <w:ilvl w:val="0"/>
           <w:numId w:val="1001"/>
         </w:numPr>
@@ -987,7 +1004,7 @@
       </w:r>
     </w:p>
     <w:bookmarkEnd w:id="9"/>
-    <w:bookmarkStart w:id="26" w:name="part-i--for-decision-makers"/>
+    <w:bookmarkStart w:id="27" w:name="part-i--for-decision-makers"/>
     <w:p>
       <w:pPr>
         <w:pStyle w:val="Heading1"/>
@@ -5112,6 +5129,364 @@
         <w:t xml:space="preserve">page entries; corrected copy on the seeded project entries; and decisions on the publications/staff page sources and the newsletter signup integration (both flagged as Phase 4 items).</w:t>
       </w:r>
     </w:p>
+    <w:bookmarkEnd w:id="25"/>
+    <w:bookmarkStart w:id="26" w:name="progress-update--july-16-2026"/>
+    <w:p>
+      <w:pPr>
+        <w:pStyle w:val="Heading2"/>
+      </w:pPr>
+      <w:r>
+        <w:t xml:space="preserve">Progress update — July 16, 2026</w:t>
+      </w:r>
+    </w:p>
+    <w:p>
+      <w:pPr>
+        <w:pStyle w:val="FirstParagraph"/>
+      </w:pPr>
+      <w:r>
+        <w:rPr>
+          <w:b/>
+          <w:bCs/>
+        </w:rPr>
+        <w:t xml:space="preserve">The one-sentence status: the first draft has moved from</w:t>
+      </w:r>
+      <w:r>
+        <w:rPr>
+          <w:b/>
+          <w:bCs/>
+        </w:rPr>
+        <w:t xml:space="preserve"> </w:t>
+      </w:r>
+      <w:r>
+        <w:rPr>
+          <w:b/>
+          <w:bCs/>
+        </w:rPr>
+        <w:t xml:space="preserve">“renders end-to-end”</w:t>
+      </w:r>
+      <w:r>
+        <w:rPr>
+          <w:b/>
+          <w:bCs/>
+        </w:rPr>
+        <w:t xml:space="preserve"> </w:t>
+      </w:r>
+      <w:r>
+        <w:rPr>
+          <w:b/>
+          <w:bCs/>
+        </w:rPr>
+        <w:t xml:space="preserve">to</w:t>
+      </w:r>
+      <w:r>
+        <w:rPr>
+          <w:b/>
+          <w:bCs/>
+        </w:rPr>
+        <w:t xml:space="preserve"> </w:t>
+      </w:r>
+      <w:r>
+        <w:rPr>
+          <w:b/>
+          <w:bCs/>
+        </w:rPr>
+        <w:t xml:space="preserve">“reads and behaves like the finished product”</w:t>
+      </w:r>
+      <w:r>
+        <w:rPr>
+          <w:b/>
+          <w:bCs/>
+        </w:rPr>
+        <w:t xml:space="preserve"> </w:t>
+      </w:r>
+      <w:r>
+        <w:rPr>
+          <w:b/>
+          <w:bCs/>
+        </w:rPr>
+        <w:t xml:space="preserve">— a full design-parity pass, an in-document PDF reader, gentle motion, and a manager-facing status/docs layer, all live on the preview.</w:t>
+      </w:r>
+      <w:r>
+        <w:t xml:space="preserve"> </w:t>
+      </w:r>
+      <w:r>
+        <w:t xml:space="preserve">The version numbers below are the app’s own (see the Build changelog at the top of this document); every one passed the full six-gate check before deploying.</w:t>
+      </w:r>
+    </w:p>
+    <w:p>
+      <w:pPr>
+        <w:numPr>
+          <w:ilvl w:val="0"/>
+          <w:numId w:val="1017"/>
+        </w:numPr>
+      </w:pPr>
+      <w:r>
+        <w:rPr>
+          <w:b/>
+          <w:bCs/>
+        </w:rPr>
+        <w:t xml:space="preserve">Design-parity pass against the Figma mockups (v0.20.0–v0.21.0).</w:t>
+      </w:r>
+      <w:r>
+        <w:t xml:space="preserve"> </w:t>
+      </w:r>
+      <w:r>
+        <w:t xml:space="preserve">A frame-by-frame audit (recorded in</w:t>
+      </w:r>
+      <w:r>
+        <w:t xml:space="preserve"> </w:t>
+      </w:r>
+      <w:r>
+        <w:rPr>
+          <w:rStyle w:val="VerbatimChar"/>
+        </w:rPr>
+        <w:t xml:space="preserve">docs/figma-design-audit.md</w:t>
+      </w:r>
+      <w:r>
+        <w:t xml:space="preserve">) drove a batch of fixes: homepage project cards are now real links with the mock’s</w:t>
+      </w:r>
+      <w:r>
+        <w:t xml:space="preserve"> </w:t>
+      </w:r>
+      <w:r>
+        <w:t xml:space="preserve">“Learn More”</w:t>
+      </w:r>
+      <w:r>
+        <w:t xml:space="preserve"> </w:t>
+      </w:r>
+      <w:r>
+        <w:t xml:space="preserve">affordance, project pages gained a project-to-project mini-navigator, articles gained a</w:t>
+      </w:r>
+      <w:r>
+        <w:t xml:space="preserve"> </w:t>
+      </w:r>
+      <w:r>
+        <w:t xml:space="preserve">“Next Article”</w:t>
+      </w:r>
+      <w:r>
+        <w:t xml:space="preserve"> </w:t>
+      </w:r>
+      <w:r>
+        <w:t xml:space="preserve">control and a</w:t>
+      </w:r>
+      <w:r>
+        <w:t xml:space="preserve"> </w:t>
+      </w:r>
+      <w:r>
+        <w:t xml:space="preserve">“More Articles from Author(s)”</w:t>
+      </w:r>
+      <w:r>
+        <w:t xml:space="preserve"> </w:t>
+      </w:r>
+      <w:r>
+        <w:t xml:space="preserve">panel, the homepage resources section matches the design, and the centers list opens its first entry by default. The audit also records, with reasons, what was deliberately</w:t>
+      </w:r>
+      <w:r>
+        <w:t xml:space="preserve"> </w:t>
+      </w:r>
+      <w:r>
+        <w:rPr>
+          <w:i/>
+          <w:iCs/>
+        </w:rPr>
+        <w:t xml:space="preserve">not</w:t>
+      </w:r>
+      <w:r>
+        <w:t xml:space="preserve"> </w:t>
+      </w:r>
+      <w:r>
+        <w:t xml:space="preserve">built (e.g., data-page dropdown filters, premature at today’s small catalog) and what is blocked on CMS content (center photos, dataset thumbnails, related-publication links).</w:t>
+      </w:r>
+    </w:p>
+    <w:p>
+      <w:pPr>
+        <w:numPr>
+          <w:ilvl w:val="0"/>
+          <w:numId w:val="1017"/>
+        </w:numPr>
+      </w:pPr>
+      <w:r>
+        <w:rPr>
+          <w:b/>
+          <w:bCs/>
+        </w:rPr>
+        <w:t xml:space="preserve">In-document PDF reader with search-term highlighting (v0.22.0).</w:t>
+      </w:r>
+      <w:r>
+        <w:t xml:space="preserve"> </w:t>
+      </w:r>
+      <w:r>
+        <w:t xml:space="preserve">This restores a capability from the current Hub. Site search already looks</w:t>
+      </w:r>
+      <w:r>
+        <w:t xml:space="preserve"> </w:t>
+      </w:r>
+      <w:r>
+        <w:rPr>
+          <w:i/>
+          <w:iCs/>
+        </w:rPr>
+        <w:t xml:space="preserve">inside</w:t>
+      </w:r>
+      <w:r>
+        <w:t xml:space="preserve"> </w:t>
+      </w:r>
+      <w:r>
+        <w:t xml:space="preserve">published PDFs; now, when a search match lands in a report, the reader opens that PDF inside the site with the searched term highlighted, a match counter, and previous/next navigation. It works across every browser (the native browser viewer can only do this in Firefox), keeps the document’s text selectable and screen-reader-readable, and only ever opens documents served by the agency’s own content system.</w:t>
+      </w:r>
+    </w:p>
+    <w:p>
+      <w:pPr>
+        <w:numPr>
+          <w:ilvl w:val="0"/>
+          <w:numId w:val="1017"/>
+        </w:numPr>
+      </w:pPr>
+      <w:r>
+        <w:rPr>
+          <w:b/>
+          <w:bCs/>
+        </w:rPr>
+        <w:t xml:space="preserve">Gentle motion (v0.23.0).</w:t>
+      </w:r>
+      <w:r>
+        <w:t xml:space="preserve"> </w:t>
+      </w:r>
+      <w:r>
+        <w:t xml:space="preserve">Soft fades now smooth the transitions between pages, when filtering lists, and when expanding a card — and all of it switches off automatically for readers who prefer reduced motion. Wiring this up surfaced and fixed a real bug: the centers</w:t>
+      </w:r>
+      <w:r>
+        <w:t xml:space="preserve"> </w:t>
+      </w:r>
+      <w:r>
+        <w:t xml:space="preserve">“Read More”</w:t>
+      </w:r>
+      <w:r>
+        <w:t xml:space="preserve"> </w:t>
+      </w:r>
+      <w:r>
+        <w:t xml:space="preserve">control had never actually revealed the hidden text (the equal-height card layout was clipping it).</w:t>
+      </w:r>
+    </w:p>
+    <w:p>
+      <w:pPr>
+        <w:numPr>
+          <w:ilvl w:val="0"/>
+          <w:numId w:val="1017"/>
+        </w:numPr>
+      </w:pPr>
+      <w:r>
+        <w:rPr>
+          <w:b/>
+          <w:bCs/>
+        </w:rPr>
+        <w:t xml:space="preserve">Manager status &amp; docs layer (v0.24.0).</w:t>
+      </w:r>
+      <w:r>
+        <w:t xml:space="preserve"> </w:t>
+      </w:r>
+      <w:r>
+        <w:t xml:space="preserve">Every page now carries a slim bottom status bar showing the current build version and linking to the code repository, the changelog, this specification (rendered inside the app), and the roadmap. A new</w:t>
+      </w:r>
+      <w:r>
+        <w:t xml:space="preserve"> </w:t>
+      </w:r>
+      <w:r>
+        <w:rPr>
+          <w:rStyle w:val="VerbatimChar"/>
+        </w:rPr>
+        <w:t xml:space="preserve">ROADMAP.md</w:t>
+      </w:r>
+      <w:r>
+        <w:t xml:space="preserve"> </w:t>
+      </w:r>
+      <w:r>
+        <w:t xml:space="preserve">tracks what’s next, deferred, and done; this document carries the running Build changelog at the top; and the footer now shows the real ICJIA logo. These documents are treated as living — kept current with every change so leadership can see, at any time, exactly what has shipped.</w:t>
+      </w:r>
+    </w:p>
+    <w:p>
+      <w:pPr>
+        <w:pStyle w:val="FirstParagraph"/>
+      </w:pPr>
+      <w:r>
+        <w:rPr>
+          <w:b/>
+          <w:bCs/>
+        </w:rPr>
+        <w:t xml:space="preserve">What this did not change:</w:t>
+      </w:r>
+      <w:r>
+        <w:t xml:space="preserve"> </w:t>
+      </w:r>
+      <w:r>
+        <w:t xml:space="preserve">the launch dependencies are the same as on July 11. The nine articles with footnote defects in the stored source still need their</w:t>
+      </w:r>
+      <w:r>
+        <w:t xml:space="preserve"> </w:t>
+      </w:r>
+      <w:r>
+        <w:rPr>
+          <w:b/>
+          <w:bCs/>
+        </w:rPr>
+        <w:t xml:space="preserve">paste-ready corrections applied in the CMS</w:t>
+      </w:r>
+      <w:r>
+        <w:t xml:space="preserve"> </w:t>
+      </w:r>
+      <w:r>
+        <w:t xml:space="preserve">(a guarded one-command script and a manual-paste package are both ready — this is the top item on the roadmap); the</w:t>
+      </w:r>
+      <w:r>
+        <w:t xml:space="preserve"> </w:t>
+      </w:r>
+      <w:r>
+        <w:rPr>
+          <w:rStyle w:val="VerbatimChar"/>
+        </w:rPr>
+        <w:t xml:space="preserve">hub-home</w:t>
+      </w:r>
+      <w:r>
+        <w:t xml:space="preserve">/</w:t>
+      </w:r>
+      <w:r>
+        <w:rPr>
+          <w:rStyle w:val="VerbatimChar"/>
+        </w:rPr>
+        <w:t xml:space="preserve">hub-overview</w:t>
+      </w:r>
+      <w:r>
+        <w:t xml:space="preserve">/</w:t>
+      </w:r>
+      <w:r>
+        <w:rPr>
+          <w:rStyle w:val="VerbatimChar"/>
+        </w:rPr>
+        <w:t xml:space="preserve">dicra</w:t>
+      </w:r>
+      <w:r>
+        <w:t xml:space="preserve"> </w:t>
+      </w:r>
+      <w:r>
+        <w:t xml:space="preserve">entries and real project copy still await authoring; and the design sign-off, screen-reader session, and cutover remain the Phase 6 checklist. Automated coverage is now</w:t>
+      </w:r>
+      <w:r>
+        <w:t xml:space="preserve"> </w:t>
+      </w:r>
+      <w:r>
+        <w:rPr>
+          <w:b/>
+          <w:bCs/>
+        </w:rPr>
+        <w:t xml:space="preserve">46 unit tests and 32 accessibility checks</w:t>
+      </w:r>
+      <w:r>
+        <w:t xml:space="preserve"> </w:t>
+      </w:r>
+      <w:r>
+        <w:t xml:space="preserve">(light and dark) plus performance budgets, still enforced on every change.</w:t>
+      </w:r>
+    </w:p>
     <w:p>
       <w:r>
         <w:pict>
@@ -5119,9 +5494,9 @@
         </w:pict>
       </w:r>
     </w:p>
-    <w:bookmarkEnd w:id="25"/>
     <w:bookmarkEnd w:id="26"/>
-    <w:bookmarkStart w:id="31" w:name="part-ii--for-developers"/>
+    <w:bookmarkEnd w:id="27"/>
+    <w:bookmarkStart w:id="32" w:name="part-ii--for-developers"/>
     <w:p>
       <w:pPr>
         <w:pStyle w:val="Heading1"/>
@@ -5130,7 +5505,7 @@
         <w:t xml:space="preserve">Part II — For Developers</w:t>
       </w:r>
     </w:p>
-    <w:bookmarkStart w:id="27" w:name="X4b376c53ac9bb35d3714f3533f5dac60661a280"/>
+    <w:bookmarkStart w:id="28" w:name="X4b376c53ac9bb35d3714f3533f5dac60661a280"/>
     <w:p>
       <w:pPr>
         <w:pStyle w:val="Heading2"/>
@@ -5794,8 +6169,8 @@
         <w:t xml:space="preserve">actually committed.</w:t>
       </w:r>
     </w:p>
-    <w:bookmarkEnd w:id="27"/>
-    <w:bookmarkStart w:id="28" w:name="X065bc66d7a523af6e74bfea16eff29096c841b1"/>
+    <w:bookmarkEnd w:id="28"/>
+    <w:bookmarkStart w:id="29" w:name="X065bc66d7a523af6e74bfea16eff29096c841b1"/>
     <w:p>
       <w:pPr>
         <w:pStyle w:val="Heading2"/>
@@ -6362,8 +6737,8 @@
         <w:t xml:space="preserve">Centers/Projects pages (Hub 2.0 additions already modeled in Strapi 5 and present in the unfinished app) are a scope decision to confirm before Phase 2; they fit inside the same template system at roughly +1 week if included at launch.</w:t>
       </w:r>
     </w:p>
-    <w:bookmarkEnd w:id="28"/>
-    <w:bookmarkStart w:id="29" w:name="Xd23567b368629d7d6e369ba0946f4da9ea6a469"/>
+    <w:bookmarkEnd w:id="29"/>
+    <w:bookmarkStart w:id="30" w:name="Xd23567b368629d7d6e369ba0946f4da9ea6a469"/>
     <w:p>
       <w:pPr>
         <w:pStyle w:val="Heading2"/>
@@ -6694,8 +7069,8 @@
         </w:tc>
       </w:tr>
     </w:tbl>
-    <w:bookmarkEnd w:id="29"/>
-    <w:bookmarkStart w:id="30" w:name="success-criteria-definition-of-done"/>
+    <w:bookmarkEnd w:id="30"/>
+    <w:bookmarkStart w:id="31" w:name="success-criteria-definition-of-done"/>
     <w:p>
       <w:pPr>
         <w:pStyle w:val="Heading2"/>
@@ -6709,7 +7084,7 @@
         <w:pStyle w:val="Compact"/>
         <w:numPr>
           <w:ilvl w:val="0"/>
-          <w:numId w:val="1017"/>
+          <w:numId w:val="1018"/>
         </w:numPr>
       </w:pPr>
       <w:r>
@@ -6731,7 +7106,7 @@
         <w:pStyle w:val="Compact"/>
         <w:numPr>
           <w:ilvl w:val="0"/>
-          <w:numId w:val="1017"/>
+          <w:numId w:val="1018"/>
         </w:numPr>
       </w:pPr>
       <w:r>
@@ -6753,7 +7128,7 @@
         <w:pStyle w:val="Compact"/>
         <w:numPr>
           <w:ilvl w:val="0"/>
-          <w:numId w:val="1017"/>
+          <w:numId w:val="1018"/>
         </w:numPr>
       </w:pPr>
       <w:r>
@@ -6775,7 +7150,7 @@
         <w:pStyle w:val="Compact"/>
         <w:numPr>
           <w:ilvl w:val="0"/>
-          <w:numId w:val="1017"/>
+          <w:numId w:val="1018"/>
         </w:numPr>
       </w:pPr>
       <w:r>
@@ -6797,7 +7172,7 @@
         <w:pStyle w:val="Compact"/>
         <w:numPr>
           <w:ilvl w:val="0"/>
-          <w:numId w:val="1017"/>
+          <w:numId w:val="1018"/>
         </w:numPr>
       </w:pPr>
       <w:r>
@@ -6847,7 +7222,7 @@
         <w:pStyle w:val="Compact"/>
         <w:numPr>
           <w:ilvl w:val="0"/>
-          <w:numId w:val="1017"/>
+          <w:numId w:val="1018"/>
         </w:numPr>
       </w:pPr>
       <w:r>
@@ -6869,7 +7244,7 @@
         <w:pStyle w:val="Compact"/>
         <w:numPr>
           <w:ilvl w:val="0"/>
-          <w:numId w:val="1017"/>
+          <w:numId w:val="1018"/>
         </w:numPr>
       </w:pPr>
       <w:r>
@@ -6891,7 +7266,7 @@
         <w:pStyle w:val="Compact"/>
         <w:numPr>
           <w:ilvl w:val="0"/>
-          <w:numId w:val="1017"/>
+          <w:numId w:val="1018"/>
         </w:numPr>
       </w:pPr>
       <w:r>
@@ -6915,9 +7290,9 @@
         </w:pict>
       </w:r>
     </w:p>
-    <w:bookmarkEnd w:id="30"/>
     <w:bookmarkEnd w:id="31"/>
-    <w:bookmarkStart w:id="37" w:name="X33da7a9887db7dca18403af2801a6c421349e58"/>
+    <w:bookmarkEnd w:id="32"/>
+    <w:bookmarkStart w:id="38" w:name="X33da7a9887db7dca18403af2801a6c421349e58"/>
     <w:p>
       <w:pPr>
         <w:pStyle w:val="Heading1"/>
@@ -6975,7 +7350,7 @@
         <w:t xml:space="preserve">(of ~55 catalogued) follow, grouped by theme. File references are to repository paths.</w:t>
       </w:r>
     </w:p>
-    <w:bookmarkStart w:id="32" w:name="a1-security--major"/>
+    <w:bookmarkStart w:id="33" w:name="a1-security--major"/>
     <w:p>
       <w:pPr>
         <w:pStyle w:val="Heading2"/>
@@ -7908,8 +8283,8 @@
         </w:tc>
       </w:tr>
     </w:tbl>
-    <w:bookmarkEnd w:id="32"/>
-    <w:bookmarkStart w:id="33" w:name="a2-architecture--major"/>
+    <w:bookmarkEnd w:id="33"/>
+    <w:bookmarkStart w:id="34" w:name="a2-architecture--major"/>
     <w:p>
       <w:pPr>
         <w:pStyle w:val="Heading2"/>
@@ -8790,8 +9165,8 @@
         </w:tc>
       </w:tr>
     </w:tbl>
-    <w:bookmarkEnd w:id="33"/>
-    <w:bookmarkStart w:id="34" w:name="a3-correctness--parity--major"/>
+    <w:bookmarkEnd w:id="34"/>
+    <w:bookmarkStart w:id="35" w:name="a3-correctness--parity--major"/>
     <w:p>
       <w:pPr>
         <w:pStyle w:val="Heading2"/>
@@ -9479,8 +9854,8 @@
         </w:tc>
       </w:tr>
     </w:tbl>
-    <w:bookmarkEnd w:id="34"/>
-    <w:bookmarkStart w:id="35" w:name="a4-quality-accessibility-process--major"/>
+    <w:bookmarkEnd w:id="35"/>
+    <w:bookmarkStart w:id="36" w:name="a4-quality-accessibility-process--major"/>
     <w:p>
       <w:pPr>
         <w:pStyle w:val="Heading2"/>
@@ -10065,8 +10440,8 @@
         </w:tc>
       </w:tr>
     </w:tbl>
-    <w:bookmarkEnd w:id="35"/>
-    <w:bookmarkStart w:id="36" w:name="a5-minor-defects-curated-30"/>
+    <w:bookmarkEnd w:id="36"/>
+    <w:bookmarkStart w:id="37" w:name="a5-minor-defects-curated-30"/>
     <w:p>
       <w:pPr>
         <w:pStyle w:val="Heading2"/>
@@ -10080,7 +10455,7 @@
         <w:pStyle w:val="Compact"/>
         <w:numPr>
           <w:ilvl w:val="0"/>
-          <w:numId w:val="1018"/>
+          <w:numId w:val="1019"/>
         </w:numPr>
       </w:pPr>
       <w:r>
@@ -10116,7 +10491,7 @@
         <w:pStyle w:val="Compact"/>
         <w:numPr>
           <w:ilvl w:val="0"/>
-          <w:numId w:val="1018"/>
+          <w:numId w:val="1019"/>
         </w:numPr>
       </w:pPr>
       <w:r>
@@ -10158,7 +10533,7 @@
         <w:pStyle w:val="Compact"/>
         <w:numPr>
           <w:ilvl w:val="0"/>
-          <w:numId w:val="1018"/>
+          <w:numId w:val="1019"/>
         </w:numPr>
       </w:pPr>
       <w:r>
@@ -10200,7 +10575,7 @@
         <w:pStyle w:val="Compact"/>
         <w:numPr>
           <w:ilvl w:val="0"/>
-          <w:numId w:val="1018"/>
+          <w:numId w:val="1019"/>
         </w:numPr>
       </w:pPr>
       <w:r>
@@ -10212,7 +10587,7 @@
         <w:pStyle w:val="Compact"/>
         <w:numPr>
           <w:ilvl w:val="0"/>
-          <w:numId w:val="1018"/>
+          <w:numId w:val="1019"/>
         </w:numPr>
       </w:pPr>
       <w:r>
@@ -10224,7 +10599,7 @@
         <w:pStyle w:val="Compact"/>
         <w:numPr>
           <w:ilvl w:val="0"/>
-          <w:numId w:val="1018"/>
+          <w:numId w:val="1019"/>
         </w:numPr>
       </w:pPr>
       <w:r>
@@ -10287,7 +10662,7 @@
         <w:pStyle w:val="Compact"/>
         <w:numPr>
           <w:ilvl w:val="0"/>
-          <w:numId w:val="1018"/>
+          <w:numId w:val="1019"/>
         </w:numPr>
       </w:pPr>
       <w:r>
@@ -10332,7 +10707,7 @@
         <w:pStyle w:val="Compact"/>
         <w:numPr>
           <w:ilvl w:val="0"/>
-          <w:numId w:val="1018"/>
+          <w:numId w:val="1019"/>
         </w:numPr>
       </w:pPr>
       <w:r>
@@ -10344,7 +10719,7 @@
         <w:pStyle w:val="Compact"/>
         <w:numPr>
           <w:ilvl w:val="0"/>
-          <w:numId w:val="1018"/>
+          <w:numId w:val="1019"/>
         </w:numPr>
       </w:pPr>
       <w:r>
@@ -10386,7 +10761,7 @@
         <w:pStyle w:val="Compact"/>
         <w:numPr>
           <w:ilvl w:val="0"/>
-          <w:numId w:val="1018"/>
+          <w:numId w:val="1019"/>
         </w:numPr>
       </w:pPr>
       <w:r>
@@ -10425,7 +10800,7 @@
         <w:pStyle w:val="Compact"/>
         <w:numPr>
           <w:ilvl w:val="0"/>
-          <w:numId w:val="1018"/>
+          <w:numId w:val="1019"/>
         </w:numPr>
       </w:pPr>
       <w:r>
@@ -10437,7 +10812,7 @@
         <w:pStyle w:val="Compact"/>
         <w:numPr>
           <w:ilvl w:val="0"/>
-          <w:numId w:val="1018"/>
+          <w:numId w:val="1019"/>
         </w:numPr>
       </w:pPr>
       <w:r>
@@ -10455,7 +10830,7 @@
         <w:pStyle w:val="Compact"/>
         <w:numPr>
           <w:ilvl w:val="0"/>
-          <w:numId w:val="1018"/>
+          <w:numId w:val="1019"/>
         </w:numPr>
       </w:pPr>
       <w:r>
@@ -10467,7 +10842,7 @@
         <w:pStyle w:val="Compact"/>
         <w:numPr>
           <w:ilvl w:val="0"/>
-          <w:numId w:val="1018"/>
+          <w:numId w:val="1019"/>
         </w:numPr>
       </w:pPr>
       <w:r>
@@ -10497,7 +10872,7 @@
         <w:pStyle w:val="Compact"/>
         <w:numPr>
           <w:ilvl w:val="0"/>
-          <w:numId w:val="1018"/>
+          <w:numId w:val="1019"/>
         </w:numPr>
       </w:pPr>
       <w:r>
@@ -10524,7 +10899,7 @@
         <w:pStyle w:val="Compact"/>
         <w:numPr>
           <w:ilvl w:val="0"/>
-          <w:numId w:val="1018"/>
+          <w:numId w:val="1019"/>
         </w:numPr>
       </w:pPr>
       <w:r>
@@ -10536,7 +10911,7 @@
         <w:pStyle w:val="Compact"/>
         <w:numPr>
           <w:ilvl w:val="0"/>
-          <w:numId w:val="1018"/>
+          <w:numId w:val="1019"/>
         </w:numPr>
       </w:pPr>
       <w:r>
@@ -10560,7 +10935,7 @@
         <w:pStyle w:val="Compact"/>
         <w:numPr>
           <w:ilvl w:val="0"/>
-          <w:numId w:val="1018"/>
+          <w:numId w:val="1019"/>
         </w:numPr>
       </w:pPr>
       <w:r>
@@ -10581,7 +10956,7 @@
         <w:pStyle w:val="Compact"/>
         <w:numPr>
           <w:ilvl w:val="0"/>
-          <w:numId w:val="1018"/>
+          <w:numId w:val="1019"/>
         </w:numPr>
       </w:pPr>
       <w:r>
@@ -10593,7 +10968,7 @@
         <w:pStyle w:val="Compact"/>
         <w:numPr>
           <w:ilvl w:val="0"/>
-          <w:numId w:val="1018"/>
+          <w:numId w:val="1019"/>
         </w:numPr>
       </w:pPr>
       <w:r>
@@ -10629,7 +11004,7 @@
         <w:pStyle w:val="Compact"/>
         <w:numPr>
           <w:ilvl w:val="0"/>
-          <w:numId w:val="1018"/>
+          <w:numId w:val="1019"/>
         </w:numPr>
       </w:pPr>
       <w:r>
@@ -10662,7 +11037,7 @@
         <w:pStyle w:val="Compact"/>
         <w:numPr>
           <w:ilvl w:val="0"/>
-          <w:numId w:val="1018"/>
+          <w:numId w:val="1019"/>
         </w:numPr>
       </w:pPr>
       <w:r>
@@ -10701,7 +11076,7 @@
         <w:pStyle w:val="Compact"/>
         <w:numPr>
           <w:ilvl w:val="0"/>
-          <w:numId w:val="1018"/>
+          <w:numId w:val="1019"/>
         </w:numPr>
       </w:pPr>
       <w:r>
@@ -10722,7 +11097,7 @@
         <w:pStyle w:val="Compact"/>
         <w:numPr>
           <w:ilvl w:val="0"/>
-          <w:numId w:val="1018"/>
+          <w:numId w:val="1019"/>
         </w:numPr>
       </w:pPr>
       <w:r>
@@ -10758,7 +11133,7 @@
         <w:pStyle w:val="Compact"/>
         <w:numPr>
           <w:ilvl w:val="0"/>
-          <w:numId w:val="1018"/>
+          <w:numId w:val="1019"/>
         </w:numPr>
       </w:pPr>
       <w:r>
@@ -10797,7 +11172,7 @@
         <w:pStyle w:val="Compact"/>
         <w:numPr>
           <w:ilvl w:val="0"/>
-          <w:numId w:val="1018"/>
+          <w:numId w:val="1019"/>
         </w:numPr>
       </w:pPr>
       <w:r>
@@ -10833,7 +11208,7 @@
         <w:pStyle w:val="Compact"/>
         <w:numPr>
           <w:ilvl w:val="0"/>
-          <w:numId w:val="1018"/>
+          <w:numId w:val="1019"/>
         </w:numPr>
       </w:pPr>
       <w:r>
@@ -10854,7 +11229,7 @@
         <w:pStyle w:val="Compact"/>
         <w:numPr>
           <w:ilvl w:val="0"/>
-          <w:numId w:val="1018"/>
+          <w:numId w:val="1019"/>
         </w:numPr>
       </w:pPr>
       <w:r>
@@ -10926,7 +11301,7 @@
         <w:pStyle w:val="Compact"/>
         <w:numPr>
           <w:ilvl w:val="0"/>
-          <w:numId w:val="1018"/>
+          <w:numId w:val="1019"/>
         </w:numPr>
       </w:pPr>
       <w:r>
@@ -10953,7 +11328,7 @@
         <w:pStyle w:val="Compact"/>
         <w:numPr>
           <w:ilvl w:val="0"/>
-          <w:numId w:val="1018"/>
+          <w:numId w:val="1019"/>
         </w:numPr>
       </w:pPr>
       <w:r>
@@ -11030,9 +11405,9 @@
         <w:t xml:space="preserve">exist.</w:t>
       </w:r>
     </w:p>
-    <w:bookmarkEnd w:id="36"/>
     <w:bookmarkEnd w:id="37"/>
-    <w:bookmarkStart w:id="38" w:name="appendix-b--hub-10-url--feature-contract"/>
+    <w:bookmarkEnd w:id="38"/>
+    <w:bookmarkStart w:id="39" w:name="appendix-b--hub-10-url--feature-contract"/>
     <w:p>
       <w:pPr>
         <w:pStyle w:val="Heading1"/>
@@ -11602,8 +11977,8 @@
         <w:t xml:space="preserve">. Media/upload URL continuity for externally cited files: inventory + decision in Phase 4 (Section 10).</w:t>
       </w:r>
     </w:p>
-    <w:bookmarkEnd w:id="38"/>
-    <w:bookmarkStart w:id="39" w:name="appendix-c--reuse-checklist"/>
+    <w:bookmarkEnd w:id="39"/>
+    <w:bookmarkStart w:id="40" w:name="appendix-c--reuse-checklist"/>
     <w:p>
       <w:pPr>
         <w:pStyle w:val="Heading1"/>
@@ -12189,8 +12564,8 @@
         </w:tc>
       </w:tr>
     </w:tbl>
-    <w:bookmarkEnd w:id="39"/>
-    <w:bookmarkStart w:id="40" w:name="X8e127df9c12176fb20b75c96653728f7de60746"/>
+    <w:bookmarkEnd w:id="40"/>
+    <w:bookmarkStart w:id="41" w:name="X8e127df9c12176fb20b75c96653728f7de60746"/>
     <w:p>
       <w:pPr>
         <w:pStyle w:val="Heading1"/>
@@ -12204,7 +12579,7 @@
         <w:pStyle w:val="Compact"/>
         <w:numPr>
           <w:ilvl w:val="0"/>
-          <w:numId w:val="1019"/>
+          <w:numId w:val="1020"/>
         </w:numPr>
       </w:pPr>
       <w:r>
@@ -12242,7 +12617,7 @@
         <w:pStyle w:val="Compact"/>
         <w:numPr>
           <w:ilvl w:val="0"/>
-          <w:numId w:val="1019"/>
+          <w:numId w:val="1020"/>
         </w:numPr>
       </w:pPr>
       <w:r>
@@ -12264,7 +12639,7 @@
         <w:pStyle w:val="Compact"/>
         <w:numPr>
           <w:ilvl w:val="0"/>
-          <w:numId w:val="1019"/>
+          <w:numId w:val="1020"/>
         </w:numPr>
       </w:pPr>
       <w:r>
@@ -12286,7 +12661,7 @@
         <w:pStyle w:val="Compact"/>
         <w:numPr>
           <w:ilvl w:val="0"/>
-          <w:numId w:val="1019"/>
+          <w:numId w:val="1020"/>
         </w:numPr>
       </w:pPr>
       <w:r>
@@ -12308,7 +12683,7 @@
         <w:pStyle w:val="Compact"/>
         <w:numPr>
           <w:ilvl w:val="0"/>
-          <w:numId w:val="1019"/>
+          <w:numId w:val="1020"/>
         </w:numPr>
       </w:pPr>
       <w:r>
@@ -12330,7 +12705,7 @@
         <w:pStyle w:val="Compact"/>
         <w:numPr>
           <w:ilvl w:val="0"/>
-          <w:numId w:val="1019"/>
+          <w:numId w:val="1020"/>
         </w:numPr>
       </w:pPr>
       <w:r>
@@ -12368,7 +12743,7 @@
         <w:pStyle w:val="Compact"/>
         <w:numPr>
           <w:ilvl w:val="0"/>
-          <w:numId w:val="1019"/>
+          <w:numId w:val="1020"/>
         </w:numPr>
       </w:pPr>
       <w:r>
@@ -12406,7 +12781,7 @@
         <w:pStyle w:val="Compact"/>
         <w:numPr>
           <w:ilvl w:val="0"/>
-          <w:numId w:val="1019"/>
+          <w:numId w:val="1020"/>
         </w:numPr>
       </w:pPr>
       <w:r>
@@ -12428,7 +12803,7 @@
         <w:pStyle w:val="Compact"/>
         <w:numPr>
           <w:ilvl w:val="0"/>
-          <w:numId w:val="1019"/>
+          <w:numId w:val="1020"/>
         </w:numPr>
       </w:pPr>
       <w:r>
@@ -12450,7 +12825,7 @@
         <w:pStyle w:val="Compact"/>
         <w:numPr>
           <w:ilvl w:val="0"/>
-          <w:numId w:val="1019"/>
+          <w:numId w:val="1020"/>
         </w:numPr>
       </w:pPr>
       <w:r>
@@ -12472,7 +12847,7 @@
         <w:pStyle w:val="Compact"/>
         <w:numPr>
           <w:ilvl w:val="0"/>
-          <w:numId w:val="1019"/>
+          <w:numId w:val="1020"/>
         </w:numPr>
       </w:pPr>
       <w:r>
@@ -12494,7 +12869,7 @@
         <w:pStyle w:val="Compact"/>
         <w:numPr>
           <w:ilvl w:val="0"/>
-          <w:numId w:val="1019"/>
+          <w:numId w:val="1020"/>
         </w:numPr>
       </w:pPr>
       <w:r>
@@ -12528,7 +12903,7 @@
         <w:pStyle w:val="Compact"/>
         <w:numPr>
           <w:ilvl w:val="0"/>
-          <w:numId w:val="1019"/>
+          <w:numId w:val="1020"/>
         </w:numPr>
       </w:pPr>
       <w:r>
@@ -12550,7 +12925,7 @@
         <w:pStyle w:val="Compact"/>
         <w:numPr>
           <w:ilvl w:val="0"/>
-          <w:numId w:val="1019"/>
+          <w:numId w:val="1020"/>
         </w:numPr>
       </w:pPr>
       <w:r>
@@ -12584,7 +12959,7 @@
         <w:pStyle w:val="Compact"/>
         <w:numPr>
           <w:ilvl w:val="0"/>
-          <w:numId w:val="1019"/>
+          <w:numId w:val="1020"/>
         </w:numPr>
       </w:pPr>
       <w:r>
@@ -12601,8 +12976,8 @@
         <w:t xml:space="preserve">a one-page written record of a significant technical decision and why it was made.</w:t>
       </w:r>
     </w:p>
-    <w:bookmarkEnd w:id="40"/>
-    <w:bookmarkStart w:id="50" w:name="appendix-e--referenced-resources"/>
+    <w:bookmarkEnd w:id="41"/>
+    <w:bookmarkStart w:id="51" w:name="appendix-e--referenced-resources"/>
     <w:p>
       <w:pPr>
         <w:pStyle w:val="Heading1"/>
@@ -12732,7 +13107,7 @@
             <w:pPr>
               <w:pStyle w:val="Compact"/>
             </w:pPr>
-            <w:hyperlink r:id="rId41">
+            <w:hyperlink r:id="rId42">
               <w:r>
                 <w:rPr>
                   <w:rStyle w:val="VerbatimChar"/>
@@ -12761,7 +13136,7 @@
             <w:pPr>
               <w:pStyle w:val="Compact"/>
             </w:pPr>
-            <w:hyperlink r:id="rId42">
+            <w:hyperlink r:id="rId43">
               <w:r>
                 <w:rPr>
                   <w:rStyle w:val="VerbatimChar"/>
@@ -12841,7 +13216,7 @@
             <w:pPr>
               <w:pStyle w:val="Compact"/>
             </w:pPr>
-            <w:hyperlink r:id="rId43">
+            <w:hyperlink r:id="rId44">
               <w:r>
                 <w:rPr>
                   <w:rStyle w:val="VerbatimChar"/>
@@ -12870,7 +13245,7 @@
             <w:pPr>
               <w:pStyle w:val="Compact"/>
             </w:pPr>
-            <w:hyperlink r:id="rId44">
+            <w:hyperlink r:id="rId45">
               <w:r>
                 <w:rPr>
                   <w:rStyle w:val="VerbatimChar"/>
@@ -12961,7 +13336,7 @@
             <w:pPr>
               <w:pStyle w:val="Compact"/>
             </w:pPr>
-            <w:hyperlink r:id="rId45">
+            <w:hyperlink r:id="rId46">
               <w:r>
                 <w:rPr>
                   <w:rStyle w:val="VerbatimChar"/>
@@ -13154,7 +13529,7 @@
             <w:pPr>
               <w:pStyle w:val="Compact"/>
             </w:pPr>
-            <w:hyperlink r:id="rId46">
+            <w:hyperlink r:id="rId47">
               <w:r>
                 <w:rPr>
                   <w:rStyle w:val="VerbatimChar"/>
@@ -13245,7 +13620,7 @@
             <w:pPr>
               <w:pStyle w:val="Compact"/>
             </w:pPr>
-            <w:hyperlink r:id="rId47">
+            <w:hyperlink r:id="rId48">
               <w:r>
                 <w:rPr>
                   <w:rStyle w:val="VerbatimChar"/>
@@ -13274,7 +13649,7 @@
             <w:pPr>
               <w:pStyle w:val="Compact"/>
             </w:pPr>
-            <w:hyperlink r:id="rId48">
+            <w:hyperlink r:id="rId49">
               <w:r>
                 <w:rPr>
                   <w:rStyle w:val="VerbatimChar"/>
@@ -13303,7 +13678,7 @@
             <w:pPr>
               <w:pStyle w:val="Compact"/>
             </w:pPr>
-            <w:hyperlink r:id="rId49">
+            <w:hyperlink r:id="rId50">
               <w:r>
                 <w:rPr>
                   <w:rStyle w:val="VerbatimChar"/>
@@ -13321,7 +13696,7 @@
         </w:tc>
       </w:tr>
     </w:tbl>
-    <w:bookmarkEnd w:id="50"/>
+    <w:bookmarkEnd w:id="51"/>
     <w:sectPr>
       <w:footnotePr>
         <w:numRestart w:val="eachSect"/>
@@ -13780,34 +14155,7 @@
     <w:abstractNumId w:val="991"/>
   </w:num>
   <w:num w:numId="1017">
-    <w:abstractNumId w:val="99411"/>
-    <w:lvlOverride w:ilvl="0">
-      <w:startOverride w:val="1"/>
-    </w:lvlOverride>
-    <w:lvlOverride w:ilvl="1">
-      <w:startOverride w:val="1"/>
-    </w:lvlOverride>
-    <w:lvlOverride w:ilvl="2">
-      <w:startOverride w:val="1"/>
-    </w:lvlOverride>
-    <w:lvlOverride w:ilvl="3">
-      <w:startOverride w:val="1"/>
-    </w:lvlOverride>
-    <w:lvlOverride w:ilvl="4">
-      <w:startOverride w:val="1"/>
-    </w:lvlOverride>
-    <w:lvlOverride w:ilvl="5">
-      <w:startOverride w:val="1"/>
-    </w:lvlOverride>
-    <w:lvlOverride w:ilvl="6">
-      <w:startOverride w:val="1"/>
-    </w:lvlOverride>
-    <w:lvlOverride w:ilvl="7">
-      <w:startOverride w:val="1"/>
-    </w:lvlOverride>
-    <w:lvlOverride w:ilvl="8">
-      <w:startOverride w:val="1"/>
-    </w:lvlOverride>
+    <w:abstractNumId w:val="991"/>
   </w:num>
   <w:num w:numId="1018">
     <w:abstractNumId w:val="99411"/>
@@ -13840,6 +14188,36 @@
     </w:lvlOverride>
   </w:num>
   <w:num w:numId="1019">
+    <w:abstractNumId w:val="99411"/>
+    <w:lvlOverride w:ilvl="0">
+      <w:startOverride w:val="1"/>
+    </w:lvlOverride>
+    <w:lvlOverride w:ilvl="1">
+      <w:startOverride w:val="1"/>
+    </w:lvlOverride>
+    <w:lvlOverride w:ilvl="2">
+      <w:startOverride w:val="1"/>
+    </w:lvlOverride>
+    <w:lvlOverride w:ilvl="3">
+      <w:startOverride w:val="1"/>
+    </w:lvlOverride>
+    <w:lvlOverride w:ilvl="4">
+      <w:startOverride w:val="1"/>
+    </w:lvlOverride>
+    <w:lvlOverride w:ilvl="5">
+      <w:startOverride w:val="1"/>
+    </w:lvlOverride>
+    <w:lvlOverride w:ilvl="6">
+      <w:startOverride w:val="1"/>
+    </w:lvlOverride>
+    <w:lvlOverride w:ilvl="7">
+      <w:startOverride w:val="1"/>
+    </w:lvlOverride>
+    <w:lvlOverride w:ilvl="8">
+      <w:startOverride w:val="1"/>
+    </w:lvlOverride>
+  </w:num>
+  <w:num w:numId="1020">
     <w:abstractNumId w:val="991"/>
   </w:num>
 </w:numbering>

</xml_diff>

<commit_message>
fix(a11y): header build-version chip label-in-name (WCAG 2.5.3)
The header build-version chip's visible text (Copperhead build · vX.Y.Z)
was not contained in its aria-label (…build version X.Y.Z…), a WCAG 2.5.3
(Label in Name, Level A) violation that can stop voice-control users from
activating it by its visible name. Align the aria-label to lead with the
visible text. The chip is in the global header, so this is a site-wide fix.

Found while auditing the rendered in-app PDF reader (Lighthouse/axe); the
axe-playwright CI gate did not flag it. Verified after the fix: home
100/100, 0 accessibility issues.

Bump to v0.25.1 and sync the living docs (README, CHANGELOG, ROADMAP, and
the spec .md/.docx, rebuilt field-code-free).
</commit_message>
<xml_diff>
--- a/docs/ICJIA-Hub-20-rewrite-copperhead.docx
+++ b/docs/ICJIA-Hub-20-rewrite-copperhead.docx
@@ -23,7 +23,7 @@
         <w:pStyle w:val="Date"/>
       </w:pPr>
       <w:r>
-        <w:t xml:space="preserve">July 11, 2026 · continuously updated — last revised 2026-07-16 (tracks app v0.25.0)</w:t>
+        <w:t xml:space="preserve">July 11, 2026 · continuously updated — last revised 2026-07-16 (tracks app v0.25.1)</w:t>
       </w:r>
     </w:p>
     <w:p>
@@ -274,6 +274,45 @@
             </w:pPr>
             <w:r>
               <w:t xml:space="preserve">What shipped</w:t>
+            </w:r>
+          </w:p>
+        </w:tc>
+      </w:tr>
+      <w:tr>
+        <w:tc>
+          <w:tcPr/>
+          <w:p>
+            <w:pPr>
+              <w:pStyle w:val="Compact"/>
+            </w:pPr>
+            <w:r>
+              <w:rPr>
+                <w:b/>
+                <w:bCs/>
+              </w:rPr>
+              <w:t xml:space="preserve">v0.25.1</w:t>
+            </w:r>
+          </w:p>
+        </w:tc>
+        <w:tc>
+          <w:tcPr/>
+          <w:p>
+            <w:pPr>
+              <w:pStyle w:val="Compact"/>
+            </w:pPr>
+            <w:r>
+              <w:t xml:space="preserve">2026-07-16</w:t>
+            </w:r>
+          </w:p>
+        </w:tc>
+        <w:tc>
+          <w:tcPr/>
+          <w:p>
+            <w:pPr>
+              <w:pStyle w:val="Compact"/>
+            </w:pPr>
+            <w:r>
+              <w:t xml:space="preserve">Accessibility fix — the header’s build-version chip now exposes a screen-reader label that matches its visible text (WCAG 2.5.3 Label in Name, Level A); the chip appears on every page.</w:t>
             </w:r>
           </w:p>
         </w:tc>

</xml_diff>